<commit_message>
feat(so): replace system templates
</commit_message>
<xml_diff>
--- a/document-merge-service/kt_so/templatefiles/inserat-amtsblatt.docx
+++ b/document-merge-service/kt_so/templatefiles/inserat-amtsblatt.docx
@@ -1,6 +1,6 @@
 
 <file path=word/document.xml><?xml version="1.0" encoding="utf-8"?>
-<w:document xmlns:wpc="http://schemas.microsoft.com/office/word/2010/wordprocessingCanvas" xmlns:cx="http://schemas.microsoft.com/office/drawing/2014/chartex" xmlns:cx1="http://schemas.microsoft.com/office/drawing/2015/9/8/chartex" xmlns:cx2="http://schemas.microsoft.com/office/drawing/2015/10/21/chartex" xmlns:cx3="http://schemas.microsoft.com/office/drawing/2016/5/9/chartex" xmlns:cx4="http://schemas.microsoft.com/office/drawing/2016/5/10/chartex" xmlns:cx5="http://schemas.microsoft.com/office/drawing/2016/5/11/chartex" xmlns:cx6="http://schemas.microsoft.com/office/drawing/2016/5/12/chartex" xmlns:cx7="http://schemas.microsoft.com/office/drawing/2016/5/13/chartex" xmlns:cx8="http://schemas.microsoft.com/office/drawing/2016/5/14/chartex" xmlns:mc="http://schemas.openxmlformats.org/markup-compatibility/2006" xmlns:aink="http://schemas.microsoft.com/office/drawing/2016/ink" xmlns:am3d="http://schemas.microsoft.com/office/drawing/2017/model3d" xmlns:o="urn:schemas-microsoft-com:office:office" xmlns:oel="http://schemas.microsoft.com/office/2019/extlst" xmlns:r="http://schemas.openxmlformats.org/officeDocument/2006/relationships" xmlns:m="http://schemas.openxmlformats.org/officeDocument/2006/math" xmlns:v="urn:schemas-microsoft-com:vml" xmlns:wp14="http://schemas.microsoft.com/office/word/2010/wordprocessingDrawing" xmlns:wp="http://schemas.openxmlformats.org/drawingml/2006/wordprocessingDrawing" xmlns:w10="urn:schemas-microsoft-com:office:word" xmlns:w="http://schemas.openxmlformats.org/wordprocessingml/2006/main" xmlns:w14="http://schemas.microsoft.com/office/word/2010/wordml" xmlns:w15="http://schemas.microsoft.com/office/word/2012/wordml" xmlns:w16cex="http://schemas.microsoft.com/office/word/2018/wordml/cex" xmlns:w16cid="http://schemas.microsoft.com/office/word/2016/wordml/cid" xmlns:w16="http://schemas.microsoft.com/office/word/2018/wordml" xmlns:w16du="http://schemas.microsoft.com/office/word/2023/wordml/word16du" xmlns:w16sdtdh="http://schemas.microsoft.com/office/word/2020/wordml/sdtdatahash" xmlns:w16se="http://schemas.microsoft.com/office/word/2015/wordml/symex" xmlns:wpg="http://schemas.microsoft.com/office/word/2010/wordprocessingGroup" xmlns:wpi="http://schemas.microsoft.com/office/word/2010/wordprocessingInk" xmlns:wne="http://schemas.microsoft.com/office/word/2006/wordml" xmlns:wps="http://schemas.microsoft.com/office/word/2010/wordprocessingShape" mc:Ignorable="w14 w15 w16se w16cid w16 w16cex w16sdtdh w16du wp14">
+<w:document xmlns:wpc="http://schemas.microsoft.com/office/word/2010/wordprocessingCanvas" xmlns:cx="http://schemas.microsoft.com/office/drawing/2014/chartex" xmlns:cx1="http://schemas.microsoft.com/office/drawing/2015/9/8/chartex" xmlns:cx2="http://schemas.microsoft.com/office/drawing/2015/10/21/chartex" xmlns:cx3="http://schemas.microsoft.com/office/drawing/2016/5/9/chartex" xmlns:cx4="http://schemas.microsoft.com/office/drawing/2016/5/10/chartex" xmlns:cx5="http://schemas.microsoft.com/office/drawing/2016/5/11/chartex" xmlns:cx6="http://schemas.microsoft.com/office/drawing/2016/5/12/chartex" xmlns:cx7="http://schemas.microsoft.com/office/drawing/2016/5/13/chartex" xmlns:cx8="http://schemas.microsoft.com/office/drawing/2016/5/14/chartex" xmlns:mc="http://schemas.openxmlformats.org/markup-compatibility/2006" xmlns:aink="http://schemas.microsoft.com/office/drawing/2016/ink" xmlns:am3d="http://schemas.microsoft.com/office/drawing/2017/model3d" xmlns:o="urn:schemas-microsoft-com:office:office" xmlns:oel="http://schemas.microsoft.com/office/2019/extlst" xmlns:r="http://schemas.openxmlformats.org/officeDocument/2006/relationships" xmlns:m="http://schemas.openxmlformats.org/officeDocument/2006/math" xmlns:v="urn:schemas-microsoft-com:vml" xmlns:wp14="http://schemas.microsoft.com/office/word/2010/wordprocessingDrawing" xmlns:wp="http://schemas.openxmlformats.org/drawingml/2006/wordprocessingDrawing" xmlns:w10="urn:schemas-microsoft-com:office:word" xmlns:w="http://schemas.openxmlformats.org/wordprocessingml/2006/main" xmlns:w14="http://schemas.microsoft.com/office/word/2010/wordml" xmlns:w15="http://schemas.microsoft.com/office/word/2012/wordml" xmlns:w16cex="http://schemas.microsoft.com/office/word/2018/wordml/cex" xmlns:w16cid="http://schemas.microsoft.com/office/word/2016/wordml/cid" xmlns:w16="http://schemas.microsoft.com/office/word/2018/wordml" xmlns:w16du="http://schemas.microsoft.com/office/word/2023/wordml/word16du" xmlns:w16sdtdh="http://schemas.microsoft.com/office/word/2020/wordml/sdtdatahash" xmlns:w16sdtfl="http://schemas.microsoft.com/office/word/2024/wordml/sdtformatlock" xmlns:w16se="http://schemas.microsoft.com/office/word/2015/wordml/symex" xmlns:wpg="http://schemas.microsoft.com/office/word/2010/wordprocessingGroup" xmlns:wpi="http://schemas.microsoft.com/office/word/2010/wordprocessingInk" xmlns:wne="http://schemas.microsoft.com/office/word/2006/wordml" xmlns:wps="http://schemas.microsoft.com/office/word/2010/wordprocessingShape" mc:Ignorable="w14 w15 w16se w16cid w16 w16cex w16sdtdh w16sdtfl w16du wp14">
   <w:body>
     <w:tbl>
       <w:tblPr>
@@ -40,12 +40,21 @@
                 <w:bCs/>
               </w:rPr>
             </w:pPr>
+            <w:proofErr w:type="gramStart"/>
             <w:r>
               <w:rPr>
                 <w:b/>
                 <w:bCs/>
               </w:rPr>
-              <w:t>{{ LEITBEHOERDE_NAME }}</w:t>
+              <w:t>{{ LEITBEHOERDE</w:t>
+            </w:r>
+            <w:proofErr w:type="gramEnd"/>
+            <w:r>
+              <w:rPr>
+                <w:b/>
+                <w:bCs/>
+              </w:rPr>
+              <w:t>_NAME }}</w:t>
             </w:r>
           </w:p>
           <w:p>
@@ -56,12 +65,21 @@
                 <w:szCs w:val="18"/>
               </w:rPr>
             </w:pPr>
-            <w:r>
-              <w:rPr>
-                <w:sz w:val="18"/>
-                <w:szCs w:val="18"/>
-              </w:rPr>
-              <w:t>{{ LEITBEHOERDE_ADRESSE_1 }}</w:t>
+            <w:proofErr w:type="gramStart"/>
+            <w:r>
+              <w:rPr>
+                <w:sz w:val="18"/>
+                <w:szCs w:val="18"/>
+              </w:rPr>
+              <w:t>{{ LEITBEHOERDE</w:t>
+            </w:r>
+            <w:proofErr w:type="gramEnd"/>
+            <w:r>
+              <w:rPr>
+                <w:sz w:val="18"/>
+                <w:szCs w:val="18"/>
+              </w:rPr>
+              <w:t>_ADRESSE_1 }}</w:t>
             </w:r>
           </w:p>
           <w:p>
@@ -72,12 +90,21 @@
                 <w:szCs w:val="18"/>
               </w:rPr>
             </w:pPr>
-            <w:r>
-              <w:rPr>
-                <w:sz w:val="18"/>
-                <w:szCs w:val="18"/>
-              </w:rPr>
-              <w:t>{{ LEITBEHOERDE_ADRESSE_2 }}</w:t>
+            <w:proofErr w:type="gramStart"/>
+            <w:r>
+              <w:rPr>
+                <w:sz w:val="18"/>
+                <w:szCs w:val="18"/>
+              </w:rPr>
+              <w:t>{{ LEITBEHOERDE</w:t>
+            </w:r>
+            <w:proofErr w:type="gramEnd"/>
+            <w:r>
+              <w:rPr>
+                <w:sz w:val="18"/>
+                <w:szCs w:val="18"/>
+              </w:rPr>
+              <w:t>_ADRESSE_2 }}</w:t>
             </w:r>
           </w:p>
         </w:tc>
@@ -241,13 +268,23 @@
               </w:rPr>
               <w:tab/>
             </w:r>
+            <w:proofErr w:type="gramStart"/>
             <w:r>
               <w:rPr>
                 <w:rStyle w:val="PlatzhalterZchn"/>
                 <w:sz w:val="18"/>
                 <w:szCs w:val="18"/>
               </w:rPr>
-              <w:t>{{ ZUSTAENDIG_NAME }}</w:t>
+              <w:t>{{ ZUSTAENDIG</w:t>
+            </w:r>
+            <w:proofErr w:type="gramEnd"/>
+            <w:r>
+              <w:rPr>
+                <w:rStyle w:val="PlatzhalterZchn"/>
+                <w:sz w:val="18"/>
+                <w:szCs w:val="18"/>
+              </w:rPr>
+              <w:t>_NAME }}</w:t>
             </w:r>
           </w:p>
           <w:p>
@@ -277,13 +314,23 @@
               </w:rPr>
               <w:tab/>
             </w:r>
+            <w:proofErr w:type="gramStart"/>
             <w:r>
               <w:rPr>
                 <w:rStyle w:val="PlatzhalterZchn"/>
                 <w:sz w:val="18"/>
                 <w:szCs w:val="18"/>
               </w:rPr>
-              <w:t>{{ LEITBEHOERDE_EMAIL }}</w:t>
+              <w:t>{{ LEITBEHOERDE</w:t>
+            </w:r>
+            <w:proofErr w:type="gramEnd"/>
+            <w:r>
+              <w:rPr>
+                <w:rStyle w:val="PlatzhalterZchn"/>
+                <w:sz w:val="18"/>
+                <w:szCs w:val="18"/>
+              </w:rPr>
+              <w:t>_EMAIL }}</w:t>
             </w:r>
           </w:p>
           <w:p>
@@ -310,13 +357,23 @@
               </w:rPr>
               <w:tab/>
             </w:r>
+            <w:proofErr w:type="gramStart"/>
             <w:r>
               <w:rPr>
                 <w:rStyle w:val="PlatzhalterZchn"/>
                 <w:sz w:val="18"/>
                 <w:szCs w:val="18"/>
               </w:rPr>
-              <w:t>{{ LEITBEHOERDE_TELEFON }}</w:t>
+              <w:t>{{ LEITBEHOERDE</w:t>
+            </w:r>
+            <w:proofErr w:type="gramEnd"/>
+            <w:r>
+              <w:rPr>
+                <w:rStyle w:val="PlatzhalterZchn"/>
+                <w:sz w:val="18"/>
+                <w:szCs w:val="18"/>
+              </w:rPr>
+              <w:t>_TELEFON }}</w:t>
             </w:r>
           </w:p>
           <w:p>
@@ -343,13 +400,23 @@
               </w:rPr>
               <w:tab/>
             </w:r>
+            <w:proofErr w:type="gramStart"/>
             <w:r>
               <w:rPr>
                 <w:rStyle w:val="PlatzhalterZchn"/>
                 <w:sz w:val="18"/>
                 <w:szCs w:val="18"/>
               </w:rPr>
-              <w:t>{{ LEITBEHOERDE_WEBSEITE }}</w:t>
+              <w:t>{{ LEITBEHOERDE</w:t>
+            </w:r>
+            <w:proofErr w:type="gramEnd"/>
+            <w:r>
+              <w:rPr>
+                <w:rStyle w:val="PlatzhalterZchn"/>
+                <w:sz w:val="18"/>
+                <w:szCs w:val="18"/>
+              </w:rPr>
+              <w:t>_WEBSEITE }}</w:t>
             </w:r>
           </w:p>
         </w:tc>
@@ -399,6 +466,7 @@
                 <w:szCs w:val="22"/>
               </w:rPr>
             </w:pPr>
+            <w:proofErr w:type="gramStart"/>
             <w:r>
               <w:rPr>
                 <w:rStyle w:val="PlatzhalterZchn"/>
@@ -411,6 +479,7 @@
               </w:rPr>
               <w:t>GEMEINDE</w:t>
             </w:r>
+            <w:proofErr w:type="gramEnd"/>
             <w:r>
               <w:rPr>
                 <w:rStyle w:val="PlatzhalterZchn"/>
@@ -484,6 +553,7 @@
           <w:tcPr>
             <w:tcW w:w="3119" w:type="dxa"/>
             <w:tcBorders>
+              <w:bottom w:val="single" w:sz="4" w:space="0" w:color="D9D9D9" w:themeColor="background1" w:themeShade="D9"/>
               <w:right w:val="single" w:sz="4" w:space="0" w:color="FFFFFF" w:themeColor="background1"/>
             </w:tcBorders>
             <w:shd w:val="clear" w:color="auto" w:fill="D9D9D9" w:themeFill="background1" w:themeFillShade="D9"/>
@@ -515,16 +585,26 @@
             <w:pPr>
               <w:pStyle w:val="Platzhalter"/>
             </w:pPr>
-            <w:r>
-              <w:t>{{ LEITBEHOERDE_NAME_ADRESSE }}</w:t>
+            <w:proofErr w:type="gramStart"/>
+            <w:r>
+              <w:t>{{ LEITBEHOERDE</w:t>
+            </w:r>
+            <w:proofErr w:type="gramEnd"/>
+            <w:r>
+              <w:t>_NAME_ADRESSE }}</w:t>
             </w:r>
           </w:p>
           <w:p>
             <w:pPr>
               <w:pStyle w:val="Platzhalter"/>
             </w:pPr>
-            <w:r>
-              <w:t>{{ LEITBEHOERDE_TELEFON }}</w:t>
+            <w:proofErr w:type="gramStart"/>
+            <w:r>
+              <w:t>{{ LEITBEHOERDE</w:t>
+            </w:r>
+            <w:proofErr w:type="gramEnd"/>
+            <w:r>
+              <w:t>_TELEFON }}</w:t>
             </w:r>
           </w:p>
         </w:tc>
@@ -534,10 +614,62 @@
           <w:tcPr>
             <w:tcW w:w="3119" w:type="dxa"/>
             <w:tcBorders>
+              <w:top w:val="single" w:sz="4" w:space="0" w:color="D9D9D9" w:themeColor="background1" w:themeShade="D9"/>
+              <w:bottom w:val="single" w:sz="4" w:space="0" w:color="D9D9D9" w:themeColor="background1" w:themeShade="D9"/>
+              <w:right w:val="single" w:sz="4" w:space="0" w:color="D9D9D9" w:themeColor="background1" w:themeShade="D9"/>
+            </w:tcBorders>
+            <w:shd w:val="clear" w:color="auto" w:fill="auto"/>
+          </w:tcPr>
+          <w:p>
+            <w:pPr>
+              <w:ind w:right="-3"/>
+              <w:rPr>
+                <w:rStyle w:val="Fett"/>
+              </w:rPr>
+            </w:pPr>
+            <w:r>
+              <w:rPr>
+                <w:rStyle w:val="Fett"/>
+              </w:rPr>
+              <w:t>Erscheinungsdatum</w:t>
+            </w:r>
+          </w:p>
+        </w:tc>
+        <w:tc>
+          <w:tcPr>
+            <w:tcW w:w="6226" w:type="dxa"/>
+            <w:tcBorders>
+              <w:left w:val="single" w:sz="4" w:space="0" w:color="D9D9D9" w:themeColor="background1" w:themeShade="D9"/>
+              <w:bottom w:val="single" w:sz="4" w:space="0" w:color="D9D9D9" w:themeColor="background1" w:themeShade="D9"/>
+            </w:tcBorders>
+            <w:shd w:val="clear" w:color="auto" w:fill="auto"/>
+          </w:tcPr>
+          <w:p>
+            <w:pPr>
+              <w:pStyle w:val="Platzhalter"/>
+            </w:pPr>
+            <w:proofErr w:type="gramStart"/>
+            <w:r>
+              <w:t>{{ PUBLIKATION</w:t>
+            </w:r>
+            <w:proofErr w:type="gramEnd"/>
+            <w:r>
+              <w:t>_AMTSBLATT }}</w:t>
+            </w:r>
+          </w:p>
+        </w:tc>
+      </w:tr>
+      <w:tr>
+        <w:tc>
+          <w:tcPr>
+            <w:tcW w:w="3119" w:type="dxa"/>
+            <w:tcBorders>
+              <w:top w:val="single" w:sz="4" w:space="0" w:color="D9D9D9" w:themeColor="background1" w:themeShade="D9"/>
+              <w:left w:val="single" w:sz="4" w:space="0" w:color="D9D9D9" w:themeColor="background1" w:themeShade="D9"/>
               <w:bottom w:val="single" w:sz="4" w:space="0" w:color="D9D9D9" w:themeColor="background1" w:themeShade="D9"/>
               <w:right w:val="single" w:sz="4" w:space="0" w:color="FFFFFF" w:themeColor="background1"/>
             </w:tcBorders>
-            <w:shd w:val="clear" w:color="auto" w:fill="auto"/>
+            <w:shd w:val="clear" w:color="auto" w:fill="D9D9D9" w:themeFill="background1" w:themeFillShade="D9"/>
           </w:tcPr>
           <w:p>
             <w:pPr>
@@ -550,7 +682,13 @@
               <w:rPr>
                 <w:rStyle w:val="Fett"/>
               </w:rPr>
-              <w:t>Erscheinungsdatum</w:t>
+              <w:t>G</w:t>
+            </w:r>
+            <w:r>
+              <w:rPr>
+                <w:rStyle w:val="Fett"/>
+              </w:rPr>
+              <w:t>emeinde</w:t>
             </w:r>
           </w:p>
         </w:tc>
@@ -561,14 +699,22 @@
               <w:left w:val="single" w:sz="4" w:space="0" w:color="FFFFFF" w:themeColor="background1"/>
               <w:bottom w:val="single" w:sz="4" w:space="0" w:color="D9D9D9" w:themeColor="background1" w:themeShade="D9"/>
             </w:tcBorders>
-            <w:shd w:val="clear" w:color="auto" w:fill="auto"/>
+            <w:shd w:val="clear" w:color="auto" w:fill="D9D9D9" w:themeFill="background1" w:themeFillShade="D9"/>
           </w:tcPr>
           <w:p>
             <w:pPr>
               <w:pStyle w:val="Platzhalter"/>
             </w:pPr>
-            <w:r>
-              <w:t>{{ PUBLIKATION_AMTSBLATT }}</w:t>
+            <w:proofErr w:type="gramStart"/>
+            <w:r>
+              <w:t xml:space="preserve">{{ </w:t>
+            </w:r>
+            <w:r>
+              <w:t>GEMEINDE</w:t>
+            </w:r>
+            <w:proofErr w:type="gramEnd"/>
+            <w:r>
+              <w:t xml:space="preserve"> }}</w:t>
             </w:r>
           </w:p>
         </w:tc>
@@ -578,9 +724,11 @@
           <w:tcPr>
             <w:tcW w:w="3119" w:type="dxa"/>
             <w:tcBorders>
+              <w:top w:val="single" w:sz="4" w:space="0" w:color="D9D9D9" w:themeColor="background1" w:themeShade="D9"/>
               <w:bottom w:val="single" w:sz="4" w:space="0" w:color="D9D9D9" w:themeColor="background1" w:themeShade="D9"/>
+              <w:right w:val="single" w:sz="4" w:space="0" w:color="D9D9D9" w:themeColor="background1" w:themeShade="D9"/>
             </w:tcBorders>
-            <w:shd w:val="clear" w:color="auto" w:fill="D9D9D9" w:themeFill="background1" w:themeFillShade="D9"/>
+            <w:shd w:val="clear" w:color="auto" w:fill="auto"/>
           </w:tcPr>
           <w:p>
             <w:pPr>
@@ -593,13 +741,7 @@
               <w:rPr>
                 <w:rStyle w:val="Fett"/>
               </w:rPr>
-              <w:t>G</w:t>
-            </w:r>
-            <w:r>
-              <w:rPr>
-                <w:rStyle w:val="Fett"/>
-              </w:rPr>
-              <w:t>emeinde</w:t>
+              <w:t>Titel des Bauprojekts</w:t>
             </w:r>
           </w:p>
         </w:tc>
@@ -607,22 +749,22 @@
           <w:tcPr>
             <w:tcW w:w="6226" w:type="dxa"/>
             <w:tcBorders>
+              <w:left w:val="single" w:sz="4" w:space="0" w:color="D9D9D9" w:themeColor="background1" w:themeShade="D9"/>
               <w:bottom w:val="single" w:sz="4" w:space="0" w:color="D9D9D9" w:themeColor="background1" w:themeShade="D9"/>
             </w:tcBorders>
-            <w:shd w:val="clear" w:color="auto" w:fill="D9D9D9" w:themeFill="background1" w:themeFillShade="D9"/>
+            <w:shd w:val="clear" w:color="auto" w:fill="auto"/>
           </w:tcPr>
           <w:p>
             <w:pPr>
               <w:pStyle w:val="Platzhalter"/>
             </w:pPr>
-            <w:r>
-              <w:t xml:space="preserve">{{ </w:t>
-            </w:r>
-            <w:r>
-              <w:t>GEMEINDE</w:t>
-            </w:r>
-            <w:r>
-              <w:t xml:space="preserve"> }}</w:t>
+            <w:proofErr w:type="gramStart"/>
+            <w:r>
+              <w:t>{{ BESCHREIBUNG</w:t>
+            </w:r>
+            <w:proofErr w:type="gramEnd"/>
+            <w:r>
+              <w:t>_BAUVORHABEN }}</w:t>
             </w:r>
           </w:p>
         </w:tc>
@@ -632,10 +774,12 @@
           <w:tcPr>
             <w:tcW w:w="3119" w:type="dxa"/>
             <w:tcBorders>
+              <w:top w:val="single" w:sz="4" w:space="0" w:color="D9D9D9" w:themeColor="background1" w:themeShade="D9"/>
+              <w:left w:val="single" w:sz="4" w:space="0" w:color="D9D9D9" w:themeColor="background1" w:themeShade="D9"/>
               <w:bottom w:val="single" w:sz="4" w:space="0" w:color="D9D9D9" w:themeColor="background1" w:themeShade="D9"/>
               <w:right w:val="single" w:sz="4" w:space="0" w:color="FFFFFF" w:themeColor="background1"/>
             </w:tcBorders>
-            <w:shd w:val="clear" w:color="auto" w:fill="auto"/>
+            <w:shd w:val="clear" w:color="auto" w:fill="D9D9D9" w:themeFill="background1" w:themeFillShade="D9"/>
           </w:tcPr>
           <w:p>
             <w:pPr>
@@ -648,7 +792,7 @@
               <w:rPr>
                 <w:rStyle w:val="Fett"/>
               </w:rPr>
-              <w:t>Titel des Bauprojekts</w:t>
+              <w:t>Gesuchsteller/in</w:t>
             </w:r>
           </w:p>
         </w:tc>
@@ -659,14 +803,561 @@
               <w:left w:val="single" w:sz="4" w:space="0" w:color="FFFFFF" w:themeColor="background1"/>
               <w:bottom w:val="single" w:sz="4" w:space="0" w:color="D9D9D9" w:themeColor="background1" w:themeShade="D9"/>
             </w:tcBorders>
-            <w:shd w:val="clear" w:color="auto" w:fill="auto"/>
+            <w:shd w:val="clear" w:color="auto" w:fill="D9D9D9" w:themeFill="background1" w:themeFillShade="D9"/>
           </w:tcPr>
           <w:p>
             <w:pPr>
-              <w:pStyle w:val="Platzhalter"/>
-            </w:pPr>
-            <w:r>
-              <w:t>{{ BESCHREIBUNG_BAUVORHABEN }}</w:t>
+              <w:rPr>
+                <w:rFonts w:ascii="Consolas" w:hAnsi="Consolas" w:cs="Arial"/>
+                <w:color w:val="00B050"/>
+                <w:sz w:val="18"/>
+                <w:szCs w:val="18"/>
+              </w:rPr>
+            </w:pPr>
+            <w:r>
+              <w:rPr>
+                <w:rFonts w:ascii="Consolas" w:hAnsi="Consolas" w:cs="Arial"/>
+                <w:color w:val="00B050"/>
+                <w:sz w:val="18"/>
+                <w:szCs w:val="18"/>
+              </w:rPr>
+              <w:t xml:space="preserve">{%p </w:t>
+            </w:r>
+            <w:proofErr w:type="spellStart"/>
+            <w:r>
+              <w:rPr>
+                <w:rFonts w:ascii="Consolas" w:hAnsi="Consolas" w:cs="Arial"/>
+                <w:color w:val="00B050"/>
+                <w:sz w:val="18"/>
+                <w:szCs w:val="18"/>
+              </w:rPr>
+              <w:t>for</w:t>
+            </w:r>
+            <w:proofErr w:type="spellEnd"/>
+            <w:r>
+              <w:rPr>
+                <w:rFonts w:ascii="Consolas" w:hAnsi="Consolas" w:cs="Arial"/>
+                <w:color w:val="00B050"/>
+                <w:sz w:val="18"/>
+                <w:szCs w:val="18"/>
+              </w:rPr>
+              <w:t xml:space="preserve"> G in ALLE_GESUCHSTELLER_LISTE %}</w:t>
+            </w:r>
+          </w:p>
+          <w:p>
+            <w:pPr>
+              <w:ind w:left="357" w:hanging="357"/>
+              <w:rPr>
+                <w:rFonts w:ascii="Consolas" w:hAnsi="Consolas" w:cs="Arial"/>
+                <w:color w:val="00B050"/>
+                <w:sz w:val="18"/>
+                <w:szCs w:val="18"/>
+              </w:rPr>
+            </w:pPr>
+            <w:r>
+              <w:rPr>
+                <w:rFonts w:ascii="Consolas" w:hAnsi="Consolas" w:cs="Arial"/>
+                <w:color w:val="00B050"/>
+                <w:sz w:val="18"/>
+                <w:szCs w:val="18"/>
+              </w:rPr>
+              <w:t>{%</w:t>
+            </w:r>
+            <w:r>
+              <w:rPr>
+                <w:rFonts w:ascii="Consolas" w:hAnsi="Consolas" w:cs="Arial"/>
+                <w:color w:val="00B050"/>
+                <w:sz w:val="18"/>
+                <w:szCs w:val="18"/>
+              </w:rPr>
+              <w:t>p</w:t>
+            </w:r>
+            <w:r>
+              <w:rPr>
+                <w:rFonts w:ascii="Consolas" w:hAnsi="Consolas" w:cs="Arial"/>
+                <w:color w:val="00B050"/>
+                <w:sz w:val="18"/>
+                <w:szCs w:val="18"/>
+              </w:rPr>
+              <w:t xml:space="preserve"> </w:t>
+            </w:r>
+            <w:proofErr w:type="spellStart"/>
+            <w:r>
+              <w:rPr>
+                <w:rFonts w:ascii="Consolas" w:hAnsi="Consolas" w:cs="Arial"/>
+                <w:color w:val="00B050"/>
+                <w:sz w:val="18"/>
+                <w:szCs w:val="18"/>
+              </w:rPr>
+              <w:t>if</w:t>
+            </w:r>
+            <w:proofErr w:type="spellEnd"/>
+            <w:r>
+              <w:rPr>
+                <w:rFonts w:ascii="Consolas" w:hAnsi="Consolas" w:cs="Arial"/>
+                <w:color w:val="00B050"/>
+                <w:sz w:val="18"/>
+                <w:szCs w:val="18"/>
+              </w:rPr>
+              <w:t xml:space="preserve"> </w:t>
+            </w:r>
+            <w:proofErr w:type="spellStart"/>
+            <w:r>
+              <w:rPr>
+                <w:rFonts w:ascii="Consolas" w:hAnsi="Consolas" w:cs="Arial"/>
+                <w:color w:val="00B050"/>
+                <w:sz w:val="18"/>
+                <w:szCs w:val="18"/>
+              </w:rPr>
+              <w:t>ALLE_GESUCHSTELLER_LISTE|length</w:t>
+            </w:r>
+            <w:proofErr w:type="spellEnd"/>
+            <w:r>
+              <w:rPr>
+                <w:rFonts w:ascii="Consolas" w:hAnsi="Consolas" w:cs="Arial"/>
+                <w:color w:val="00B050"/>
+                <w:sz w:val="18"/>
+                <w:szCs w:val="18"/>
+              </w:rPr>
+              <w:t xml:space="preserve"> &gt; 1 %}</w:t>
+            </w:r>
+          </w:p>
+          <w:p>
+            <w:pPr>
+              <w:ind w:left="357" w:hanging="357"/>
+            </w:pPr>
+            <w:r>
+              <w:rPr>
+                <w:rFonts w:cs="Arial"/>
+                <w:sz w:val="18"/>
+                <w:szCs w:val="18"/>
+              </w:rPr>
+              <w:t>●</w:t>
+            </w:r>
+            <w:r>
+              <w:rPr>
+                <w:rFonts w:cs="Arial"/>
+                <w:sz w:val="18"/>
+                <w:szCs w:val="18"/>
+              </w:rPr>
+              <w:tab/>
+            </w:r>
+            <w:proofErr w:type="gramStart"/>
+            <w:r>
+              <w:rPr>
+                <w:rStyle w:val="PlatzhalterZchn"/>
+              </w:rPr>
+              <w:t>{{ G.NAME</w:t>
+            </w:r>
+            <w:proofErr w:type="gramEnd"/>
+            <w:r>
+              <w:rPr>
+                <w:rStyle w:val="PlatzhalterZchn"/>
+              </w:rPr>
+              <w:t xml:space="preserve"> }}</w:t>
+            </w:r>
+            <w:r>
+              <w:t xml:space="preserve">, </w:t>
+            </w:r>
+            <w:r>
+              <w:rPr>
+                <w:rStyle w:val="PlatzhalterZchn"/>
+              </w:rPr>
+              <w:t>{{ G.ADRESSE }}</w:t>
+            </w:r>
+          </w:p>
+          <w:p>
+            <w:pPr>
+              <w:ind w:left="357"/>
+              <w:rPr>
+                <w:rFonts w:ascii="Consolas" w:hAnsi="Consolas" w:cs="Arial"/>
+                <w:color w:val="00B050"/>
+                <w:sz w:val="18"/>
+                <w:szCs w:val="18"/>
+              </w:rPr>
+            </w:pPr>
+            <w:r>
+              <w:rPr>
+                <w:rFonts w:ascii="Consolas" w:hAnsi="Consolas" w:cs="Arial"/>
+                <w:color w:val="00B050"/>
+                <w:sz w:val="18"/>
+                <w:szCs w:val="18"/>
+              </w:rPr>
+              <w:t xml:space="preserve">{%p </w:t>
+            </w:r>
+            <w:proofErr w:type="spellStart"/>
+            <w:r>
+              <w:rPr>
+                <w:rFonts w:ascii="Consolas" w:hAnsi="Consolas" w:cs="Arial"/>
+                <w:color w:val="00B050"/>
+                <w:sz w:val="18"/>
+                <w:szCs w:val="18"/>
+              </w:rPr>
+              <w:t>if</w:t>
+            </w:r>
+            <w:proofErr w:type="spellEnd"/>
+            <w:r>
+              <w:rPr>
+                <w:rFonts w:ascii="Consolas" w:hAnsi="Consolas" w:cs="Arial"/>
+                <w:color w:val="00B050"/>
+                <w:sz w:val="18"/>
+                <w:szCs w:val="18"/>
+              </w:rPr>
+              <w:t xml:space="preserve"> G.VERTRETER_NAME %}</w:t>
+            </w:r>
+          </w:p>
+          <w:p>
+            <w:pPr>
+              <w:ind w:left="357"/>
+            </w:pPr>
+            <w:r>
+              <w:t>vertreten durch</w:t>
+            </w:r>
+          </w:p>
+          <w:p>
+            <w:pPr>
+              <w:ind w:left="357"/>
+            </w:pPr>
+            <w:proofErr w:type="gramStart"/>
+            <w:r>
+              <w:rPr>
+                <w:rStyle w:val="PlatzhalterZchn"/>
+              </w:rPr>
+              <w:t>{{ G.VERTRETER</w:t>
+            </w:r>
+            <w:proofErr w:type="gramEnd"/>
+            <w:r>
+              <w:rPr>
+                <w:rStyle w:val="PlatzhalterZchn"/>
+              </w:rPr>
+              <w:t>_NAME }}</w:t>
+            </w:r>
+            <w:r>
+              <w:t xml:space="preserve">, </w:t>
+            </w:r>
+            <w:r>
+              <w:rPr>
+                <w:rStyle w:val="PlatzhalterZchn"/>
+              </w:rPr>
+              <w:t>{{ G.VERTRETER_ADRESSE }}</w:t>
+            </w:r>
+          </w:p>
+          <w:p>
+            <w:pPr>
+              <w:ind w:left="357"/>
+              <w:rPr>
+                <w:rFonts w:ascii="Consolas" w:hAnsi="Consolas" w:cs="Arial"/>
+                <w:color w:val="00B050"/>
+                <w:sz w:val="18"/>
+                <w:szCs w:val="18"/>
+              </w:rPr>
+            </w:pPr>
+            <w:r>
+              <w:rPr>
+                <w:rFonts w:ascii="Consolas" w:hAnsi="Consolas" w:cs="Arial"/>
+                <w:color w:val="00B050"/>
+                <w:sz w:val="18"/>
+                <w:szCs w:val="18"/>
+              </w:rPr>
+              <w:t xml:space="preserve">{%p </w:t>
+            </w:r>
+            <w:proofErr w:type="spellStart"/>
+            <w:r>
+              <w:rPr>
+                <w:rFonts w:ascii="Consolas" w:hAnsi="Consolas" w:cs="Arial"/>
+                <w:color w:val="00B050"/>
+                <w:sz w:val="18"/>
+                <w:szCs w:val="18"/>
+              </w:rPr>
+              <w:t>endif</w:t>
+            </w:r>
+            <w:proofErr w:type="spellEnd"/>
+            <w:r>
+              <w:rPr>
+                <w:rFonts w:ascii="Consolas" w:hAnsi="Consolas" w:cs="Arial"/>
+                <w:color w:val="00B050"/>
+                <w:sz w:val="18"/>
+                <w:szCs w:val="18"/>
+              </w:rPr>
+              <w:t xml:space="preserve"> %}</w:t>
+            </w:r>
+          </w:p>
+          <w:p>
+            <w:pPr>
+              <w:rPr>
+                <w:rFonts w:ascii="Consolas" w:hAnsi="Consolas" w:cs="Arial"/>
+                <w:color w:val="00B050"/>
+                <w:sz w:val="18"/>
+                <w:szCs w:val="18"/>
+              </w:rPr>
+            </w:pPr>
+            <w:r>
+              <w:rPr>
+                <w:rFonts w:ascii="Consolas" w:hAnsi="Consolas" w:cs="Arial"/>
+                <w:color w:val="00B050"/>
+                <w:sz w:val="18"/>
+                <w:szCs w:val="18"/>
+              </w:rPr>
+              <w:t>{%</w:t>
+            </w:r>
+            <w:r>
+              <w:rPr>
+                <w:rFonts w:ascii="Consolas" w:hAnsi="Consolas" w:cs="Arial"/>
+                <w:color w:val="00B050"/>
+                <w:sz w:val="18"/>
+                <w:szCs w:val="18"/>
+              </w:rPr>
+              <w:t>p</w:t>
+            </w:r>
+            <w:r>
+              <w:rPr>
+                <w:rFonts w:ascii="Consolas" w:hAnsi="Consolas" w:cs="Arial"/>
+                <w:color w:val="00B050"/>
+                <w:sz w:val="18"/>
+                <w:szCs w:val="18"/>
+              </w:rPr>
+              <w:t xml:space="preserve"> </w:t>
+            </w:r>
+            <w:proofErr w:type="spellStart"/>
+            <w:r>
+              <w:rPr>
+                <w:rFonts w:ascii="Consolas" w:hAnsi="Consolas" w:cs="Arial"/>
+                <w:color w:val="00B050"/>
+                <w:sz w:val="18"/>
+                <w:szCs w:val="18"/>
+              </w:rPr>
+              <w:t>else</w:t>
+            </w:r>
+            <w:proofErr w:type="spellEnd"/>
+            <w:r>
+              <w:rPr>
+                <w:rFonts w:ascii="Consolas" w:hAnsi="Consolas" w:cs="Arial"/>
+                <w:color w:val="00B050"/>
+                <w:sz w:val="18"/>
+                <w:szCs w:val="18"/>
+              </w:rPr>
+              <w:t xml:space="preserve"> %}</w:t>
+            </w:r>
+          </w:p>
+          <w:p>
+            <w:proofErr w:type="gramStart"/>
+            <w:r>
+              <w:rPr>
+                <w:rStyle w:val="PlatzhalterZchn"/>
+              </w:rPr>
+              <w:t>{{ G.NAME</w:t>
+            </w:r>
+            <w:proofErr w:type="gramEnd"/>
+            <w:r>
+              <w:rPr>
+                <w:rStyle w:val="PlatzhalterZchn"/>
+              </w:rPr>
+              <w:t xml:space="preserve"> }}</w:t>
+            </w:r>
+            <w:r>
+              <w:t xml:space="preserve">, </w:t>
+            </w:r>
+            <w:r>
+              <w:rPr>
+                <w:rStyle w:val="PlatzhalterZchn"/>
+              </w:rPr>
+              <w:t>{{ G.ADRESSE }}</w:t>
+            </w:r>
+          </w:p>
+          <w:p>
+            <w:pPr>
+              <w:rPr>
+                <w:rFonts w:ascii="Consolas" w:hAnsi="Consolas" w:cs="Arial"/>
+                <w:color w:val="00B050"/>
+                <w:sz w:val="18"/>
+                <w:szCs w:val="18"/>
+              </w:rPr>
+            </w:pPr>
+            <w:r>
+              <w:rPr>
+                <w:rFonts w:ascii="Consolas" w:hAnsi="Consolas" w:cs="Arial"/>
+                <w:color w:val="00B050"/>
+                <w:sz w:val="18"/>
+                <w:szCs w:val="18"/>
+              </w:rPr>
+              <w:t xml:space="preserve">{%p </w:t>
+            </w:r>
+            <w:proofErr w:type="spellStart"/>
+            <w:r>
+              <w:rPr>
+                <w:rFonts w:ascii="Consolas" w:hAnsi="Consolas" w:cs="Arial"/>
+                <w:color w:val="00B050"/>
+                <w:sz w:val="18"/>
+                <w:szCs w:val="18"/>
+              </w:rPr>
+              <w:t>if</w:t>
+            </w:r>
+            <w:proofErr w:type="spellEnd"/>
+            <w:r>
+              <w:rPr>
+                <w:rFonts w:ascii="Consolas" w:hAnsi="Consolas" w:cs="Arial"/>
+                <w:color w:val="00B050"/>
+                <w:sz w:val="18"/>
+                <w:szCs w:val="18"/>
+              </w:rPr>
+              <w:t xml:space="preserve"> G.VERTRETER_NAME %}</w:t>
+            </w:r>
+          </w:p>
+          <w:p>
+            <w:r>
+              <w:t>vertreten durch</w:t>
+            </w:r>
+          </w:p>
+          <w:p>
+            <w:proofErr w:type="gramStart"/>
+            <w:r>
+              <w:rPr>
+                <w:rStyle w:val="PlatzhalterZchn"/>
+              </w:rPr>
+              <w:t>{{ G.VERTRETER</w:t>
+            </w:r>
+            <w:proofErr w:type="gramEnd"/>
+            <w:r>
+              <w:rPr>
+                <w:rStyle w:val="PlatzhalterZchn"/>
+              </w:rPr>
+              <w:t>_NAME }}</w:t>
+            </w:r>
+            <w:r>
+              <w:t xml:space="preserve">, </w:t>
+            </w:r>
+            <w:r>
+              <w:rPr>
+                <w:rStyle w:val="PlatzhalterZchn"/>
+              </w:rPr>
+              <w:t>{{ G.VERTRETER_ADRESSE }}</w:t>
+            </w:r>
+          </w:p>
+          <w:p>
+            <w:pPr>
+              <w:rPr>
+                <w:rFonts w:ascii="Consolas" w:hAnsi="Consolas"/>
+                <w:color w:val="00B050"/>
+                <w:sz w:val="18"/>
+                <w:szCs w:val="18"/>
+              </w:rPr>
+            </w:pPr>
+            <w:r>
+              <w:rPr>
+                <w:rFonts w:ascii="Consolas" w:hAnsi="Consolas"/>
+                <w:color w:val="00B050"/>
+                <w:sz w:val="18"/>
+                <w:szCs w:val="18"/>
+              </w:rPr>
+              <w:t xml:space="preserve">{%p </w:t>
+            </w:r>
+            <w:proofErr w:type="spellStart"/>
+            <w:r>
+              <w:rPr>
+                <w:rFonts w:ascii="Consolas" w:hAnsi="Consolas"/>
+                <w:color w:val="00B050"/>
+                <w:sz w:val="18"/>
+                <w:szCs w:val="18"/>
+              </w:rPr>
+              <w:t>endif</w:t>
+            </w:r>
+            <w:proofErr w:type="spellEnd"/>
+            <w:r>
+              <w:rPr>
+                <w:rFonts w:ascii="Consolas" w:hAnsi="Consolas"/>
+                <w:color w:val="00B050"/>
+                <w:sz w:val="18"/>
+                <w:szCs w:val="18"/>
+              </w:rPr>
+              <w:t xml:space="preserve"> %}</w:t>
+            </w:r>
+          </w:p>
+          <w:p>
+            <w:pPr>
+              <w:rPr>
+                <w:rFonts w:ascii="Consolas" w:hAnsi="Consolas" w:cs="Arial"/>
+                <w:color w:val="00B050"/>
+                <w:sz w:val="18"/>
+                <w:szCs w:val="18"/>
+              </w:rPr>
+            </w:pPr>
+            <w:r>
+              <w:rPr>
+                <w:rFonts w:ascii="Consolas" w:hAnsi="Consolas"/>
+                <w:color w:val="00B050"/>
+                <w:sz w:val="18"/>
+                <w:szCs w:val="18"/>
+              </w:rPr>
+              <w:t>{%</w:t>
+            </w:r>
+            <w:r>
+              <w:rPr>
+                <w:rFonts w:ascii="Consolas" w:hAnsi="Consolas"/>
+                <w:color w:val="00B050"/>
+                <w:sz w:val="18"/>
+                <w:szCs w:val="18"/>
+              </w:rPr>
+              <w:t>p</w:t>
+            </w:r>
+            <w:r>
+              <w:rPr>
+                <w:rFonts w:ascii="Consolas" w:hAnsi="Consolas"/>
+                <w:color w:val="00B050"/>
+                <w:sz w:val="18"/>
+                <w:szCs w:val="18"/>
+              </w:rPr>
+              <w:t xml:space="preserve"> </w:t>
+            </w:r>
+            <w:proofErr w:type="spellStart"/>
+            <w:r>
+              <w:rPr>
+                <w:rFonts w:ascii="Consolas" w:hAnsi="Consolas"/>
+                <w:color w:val="00B050"/>
+                <w:sz w:val="18"/>
+                <w:szCs w:val="18"/>
+              </w:rPr>
+              <w:t>endif</w:t>
+            </w:r>
+            <w:proofErr w:type="spellEnd"/>
+            <w:r>
+              <w:rPr>
+                <w:rFonts w:ascii="Consolas" w:hAnsi="Consolas"/>
+                <w:color w:val="00B050"/>
+                <w:sz w:val="18"/>
+                <w:szCs w:val="18"/>
+              </w:rPr>
+              <w:t xml:space="preserve"> %}</w:t>
+            </w:r>
+          </w:p>
+          <w:p>
+            <w:r>
+              <w:rPr>
+                <w:rFonts w:ascii="Consolas" w:hAnsi="Consolas" w:cs="Arial"/>
+                <w:color w:val="00B050"/>
+                <w:sz w:val="18"/>
+                <w:szCs w:val="18"/>
+              </w:rPr>
+              <w:t xml:space="preserve">{%p </w:t>
+            </w:r>
+            <w:proofErr w:type="spellStart"/>
+            <w:r>
+              <w:rPr>
+                <w:rFonts w:ascii="Consolas" w:hAnsi="Consolas" w:cs="Arial"/>
+                <w:color w:val="00B050"/>
+                <w:sz w:val="18"/>
+                <w:szCs w:val="18"/>
+              </w:rPr>
+              <w:t>endfor</w:t>
+            </w:r>
+            <w:proofErr w:type="spellEnd"/>
+            <w:r>
+              <w:rPr>
+                <w:rFonts w:ascii="Consolas" w:hAnsi="Consolas" w:cs="Arial"/>
+                <w:color w:val="00B050"/>
+                <w:sz w:val="18"/>
+                <w:szCs w:val="18"/>
+              </w:rPr>
+              <w:t xml:space="preserve"> %}</w:t>
             </w:r>
           </w:p>
         </w:tc>
@@ -676,9 +1367,11 @@
           <w:tcPr>
             <w:tcW w:w="3119" w:type="dxa"/>
             <w:tcBorders>
+              <w:top w:val="single" w:sz="4" w:space="0" w:color="D9D9D9" w:themeColor="background1" w:themeShade="D9"/>
               <w:bottom w:val="single" w:sz="4" w:space="0" w:color="D9D9D9" w:themeColor="background1" w:themeShade="D9"/>
+              <w:right w:val="single" w:sz="4" w:space="0" w:color="D9D9D9" w:themeColor="background1" w:themeShade="D9"/>
             </w:tcBorders>
-            <w:shd w:val="clear" w:color="auto" w:fill="D9D9D9" w:themeFill="background1" w:themeFillShade="D9"/>
+            <w:shd w:val="clear" w:color="auto" w:fill="auto"/>
           </w:tcPr>
           <w:p>
             <w:pPr>
@@ -691,7 +1384,7 @@
               <w:rPr>
                 <w:rStyle w:val="Fett"/>
               </w:rPr>
-              <w:t>Gesuchsteller/in</w:t>
+              <w:t>Grundeigentümer/in</w:t>
             </w:r>
           </w:p>
         </w:tc>
@@ -699,9 +1392,10 @@
           <w:tcPr>
             <w:tcW w:w="6226" w:type="dxa"/>
             <w:tcBorders>
+              <w:left w:val="single" w:sz="4" w:space="0" w:color="D9D9D9" w:themeColor="background1" w:themeShade="D9"/>
               <w:bottom w:val="single" w:sz="4" w:space="0" w:color="D9D9D9" w:themeColor="background1" w:themeShade="D9"/>
             </w:tcBorders>
-            <w:shd w:val="clear" w:color="auto" w:fill="D9D9D9" w:themeFill="background1" w:themeFillShade="D9"/>
+            <w:shd w:val="clear" w:color="auto" w:fill="auto"/>
           </w:tcPr>
           <w:p>
             <w:pPr>
@@ -719,7 +1413,102 @@
                 <w:sz w:val="18"/>
                 <w:szCs w:val="18"/>
               </w:rPr>
-              <w:t>{%p for G in ALLE_GESUCHSTELLER_LISTE %}</w:t>
+              <w:t xml:space="preserve">{%p </w:t>
+            </w:r>
+            <w:proofErr w:type="spellStart"/>
+            <w:r>
+              <w:rPr>
+                <w:rFonts w:ascii="Consolas" w:hAnsi="Consolas" w:cs="Arial"/>
+                <w:color w:val="00B050"/>
+                <w:sz w:val="18"/>
+                <w:szCs w:val="18"/>
+              </w:rPr>
+              <w:t>if</w:t>
+            </w:r>
+            <w:proofErr w:type="spellEnd"/>
+            <w:r>
+              <w:rPr>
+                <w:rFonts w:ascii="Consolas" w:hAnsi="Consolas" w:cs="Arial"/>
+                <w:color w:val="00B050"/>
+                <w:sz w:val="18"/>
+                <w:szCs w:val="18"/>
+              </w:rPr>
+              <w:t xml:space="preserve"> </w:t>
+            </w:r>
+            <w:r>
+              <w:rPr>
+                <w:rFonts w:ascii="Consolas" w:hAnsi="Consolas" w:cs="Arial"/>
+                <w:color w:val="00B050"/>
+                <w:sz w:val="18"/>
+                <w:szCs w:val="18"/>
+              </w:rPr>
+              <w:t>ALLE_GRUNDEIGENTUEMER_LISTE</w:t>
+            </w:r>
+            <w:r>
+              <w:rPr>
+                <w:rFonts w:ascii="Consolas" w:hAnsi="Consolas" w:cs="Arial"/>
+                <w:color w:val="00B050"/>
+                <w:sz w:val="18"/>
+                <w:szCs w:val="18"/>
+              </w:rPr>
+              <w:t xml:space="preserve"> %}</w:t>
+            </w:r>
+          </w:p>
+          <w:p>
+            <w:pPr>
+              <w:rPr>
+                <w:rFonts w:ascii="Consolas" w:hAnsi="Consolas" w:cs="Arial"/>
+                <w:color w:val="00B050"/>
+                <w:sz w:val="18"/>
+                <w:szCs w:val="18"/>
+              </w:rPr>
+            </w:pPr>
+            <w:r>
+              <w:rPr>
+                <w:rFonts w:ascii="Consolas" w:hAnsi="Consolas" w:cs="Arial"/>
+                <w:color w:val="00B050"/>
+                <w:sz w:val="18"/>
+                <w:szCs w:val="18"/>
+              </w:rPr>
+              <w:t xml:space="preserve">{%p </w:t>
+            </w:r>
+            <w:proofErr w:type="spellStart"/>
+            <w:r>
+              <w:rPr>
+                <w:rFonts w:ascii="Consolas" w:hAnsi="Consolas" w:cs="Arial"/>
+                <w:color w:val="00B050"/>
+                <w:sz w:val="18"/>
+                <w:szCs w:val="18"/>
+              </w:rPr>
+              <w:t>for</w:t>
+            </w:r>
+            <w:proofErr w:type="spellEnd"/>
+            <w:r>
+              <w:rPr>
+                <w:rFonts w:ascii="Consolas" w:hAnsi="Consolas" w:cs="Arial"/>
+                <w:color w:val="00B050"/>
+                <w:sz w:val="18"/>
+                <w:szCs w:val="18"/>
+              </w:rPr>
+              <w:t xml:space="preserve"> G in ALLE_</w:t>
+            </w:r>
+            <w:r>
+              <w:rPr>
+                <w:rFonts w:ascii="Consolas" w:hAnsi="Consolas" w:cs="Arial"/>
+                <w:color w:val="00B050"/>
+                <w:sz w:val="18"/>
+                <w:szCs w:val="18"/>
+              </w:rPr>
+              <w:t>GRUNDEIGENTUEMER</w:t>
+            </w:r>
+            <w:r>
+              <w:rPr>
+                <w:rFonts w:ascii="Consolas" w:hAnsi="Consolas" w:cs="Arial"/>
+                <w:color w:val="00B050"/>
+                <w:sz w:val="18"/>
+                <w:szCs w:val="18"/>
+              </w:rPr>
+              <w:t>_LISTE %}</w:t>
             </w:r>
           </w:p>
           <w:p>
@@ -757,34 +1546,94 @@
                 <w:sz w:val="18"/>
                 <w:szCs w:val="18"/>
               </w:rPr>
-              <w:t xml:space="preserve"> if ALLE_GESUCHSTELLER_LISTE|length &gt; 1 %}</w:t>
-            </w:r>
-          </w:p>
-          <w:p>
-            <w:pPr>
+              <w:t xml:space="preserve"> </w:t>
+            </w:r>
+            <w:proofErr w:type="spellStart"/>
+            <w:r>
+              <w:rPr>
+                <w:rFonts w:ascii="Consolas" w:hAnsi="Consolas" w:cs="Arial"/>
+                <w:color w:val="00B050"/>
+                <w:sz w:val="18"/>
+                <w:szCs w:val="18"/>
+              </w:rPr>
+              <w:t>if</w:t>
+            </w:r>
+            <w:proofErr w:type="spellEnd"/>
+            <w:r>
+              <w:rPr>
+                <w:rFonts w:ascii="Consolas" w:hAnsi="Consolas" w:cs="Arial"/>
+                <w:color w:val="00B050"/>
+                <w:sz w:val="18"/>
+                <w:szCs w:val="18"/>
+              </w:rPr>
+              <w:t xml:space="preserve"> </w:t>
+            </w:r>
+            <w:proofErr w:type="spellStart"/>
+            <w:r>
+              <w:rPr>
+                <w:rFonts w:ascii="Consolas" w:hAnsi="Consolas" w:cs="Arial"/>
+                <w:color w:val="00B050"/>
+                <w:sz w:val="18"/>
+                <w:szCs w:val="18"/>
+              </w:rPr>
+              <w:t>ALLE_</w:t>
+            </w:r>
+            <w:r>
+              <w:rPr>
+                <w:rFonts w:ascii="Consolas" w:hAnsi="Consolas" w:cs="Arial"/>
+                <w:color w:val="00B050"/>
+                <w:sz w:val="18"/>
+                <w:szCs w:val="18"/>
+              </w:rPr>
+              <w:t>GRUNDEIGENTUEMER</w:t>
+            </w:r>
+            <w:r>
+              <w:rPr>
+                <w:rFonts w:ascii="Consolas" w:hAnsi="Consolas" w:cs="Arial"/>
+                <w:color w:val="00B050"/>
+                <w:sz w:val="18"/>
+                <w:szCs w:val="18"/>
+              </w:rPr>
+              <w:t>_LISTE|length</w:t>
+            </w:r>
+            <w:proofErr w:type="spellEnd"/>
+            <w:r>
+              <w:rPr>
+                <w:rFonts w:ascii="Consolas" w:hAnsi="Consolas" w:cs="Arial"/>
+                <w:color w:val="00B050"/>
+                <w:sz w:val="18"/>
+                <w:szCs w:val="18"/>
+              </w:rPr>
+              <w:t xml:space="preserve"> &gt; 1 %}</w:t>
+            </w:r>
+          </w:p>
+          <w:p>
+            <w:pPr>
+              <w:pStyle w:val="Listenabsatz"/>
+              <w:numPr>
+                <w:ilvl w:val="0"/>
+                <w:numId w:val="25"/>
+              </w:numPr>
+              <w:spacing w:before="0"/>
               <w:ind w:left="357" w:hanging="357"/>
-            </w:pPr>
-            <w:r>
               <w:rPr>
                 <w:rFonts w:cs="Arial"/>
-                <w:sz w:val="18"/>
-                <w:szCs w:val="18"/>
-              </w:rPr>
-              <w:t>●</w:t>
-            </w:r>
-            <w:r>
-              <w:rPr>
-                <w:rFonts w:cs="Arial"/>
-                <w:sz w:val="18"/>
-                <w:szCs w:val="18"/>
-              </w:rPr>
-              <w:tab/>
-            </w:r>
+                <w:szCs w:val="22"/>
+              </w:rPr>
+            </w:pPr>
+            <w:proofErr w:type="gramStart"/>
             <w:r>
               <w:rPr>
                 <w:rStyle w:val="PlatzhalterZchn"/>
               </w:rPr>
-              <w:t>{{ G.NAME }}</w:t>
+              <w:t>{{ G.NAME</w:t>
+            </w:r>
+            <w:proofErr w:type="gramEnd"/>
+            <w:r>
+              <w:rPr>
+                <w:rStyle w:val="PlatzhalterZchn"/>
+              </w:rPr>
+              <w:t xml:space="preserve"> }}</w:t>
             </w:r>
             <w:r>
               <w:t xml:space="preserve">, </w:t>
@@ -813,7 +1662,27 @@
                 <w:sz w:val="18"/>
                 <w:szCs w:val="18"/>
               </w:rPr>
-              <w:t>{%p if G.VERTRETER_NAME %}</w:t>
+              <w:t xml:space="preserve">{%p </w:t>
+            </w:r>
+            <w:proofErr w:type="spellStart"/>
+            <w:r>
+              <w:rPr>
+                <w:rFonts w:ascii="Consolas" w:hAnsi="Consolas" w:cs="Arial"/>
+                <w:color w:val="00B050"/>
+                <w:sz w:val="18"/>
+                <w:szCs w:val="18"/>
+              </w:rPr>
+              <w:t>if</w:t>
+            </w:r>
+            <w:proofErr w:type="spellEnd"/>
+            <w:r>
+              <w:rPr>
+                <w:rFonts w:ascii="Consolas" w:hAnsi="Consolas" w:cs="Arial"/>
+                <w:color w:val="00B050"/>
+                <w:sz w:val="18"/>
+                <w:szCs w:val="18"/>
+              </w:rPr>
+              <w:t xml:space="preserve"> G.VERTRETER_NAME %}</w:t>
             </w:r>
           </w:p>
           <w:p>
@@ -827,12 +1696,24 @@
           <w:p>
             <w:pPr>
               <w:ind w:left="357"/>
-            </w:pPr>
+              <w:rPr>
+                <w:color w:val="00B050"/>
+              </w:rPr>
+            </w:pPr>
+            <w:proofErr w:type="gramStart"/>
             <w:r>
               <w:rPr>
                 <w:rStyle w:val="PlatzhalterZchn"/>
               </w:rPr>
-              <w:t>{{ G.VERTRETER_NAME }}</w:t>
+              <w:lastRenderedPageBreak/>
+              <w:t>{{ G.VERTRETER</w:t>
+            </w:r>
+            <w:proofErr w:type="gramEnd"/>
+            <w:r>
+              <w:rPr>
+                <w:rStyle w:val="PlatzhalterZchn"/>
+              </w:rPr>
+              <w:t>_NAME }}</w:t>
             </w:r>
             <w:r>
               <w:t xml:space="preserve">, </w:t>
@@ -861,7 +1742,27 @@
                 <w:sz w:val="18"/>
                 <w:szCs w:val="18"/>
               </w:rPr>
-              <w:t>{%p endif %}</w:t>
+              <w:t xml:space="preserve">{%p </w:t>
+            </w:r>
+            <w:proofErr w:type="spellStart"/>
+            <w:r>
+              <w:rPr>
+                <w:rFonts w:ascii="Consolas" w:hAnsi="Consolas" w:cs="Arial"/>
+                <w:color w:val="00B050"/>
+                <w:sz w:val="18"/>
+                <w:szCs w:val="18"/>
+              </w:rPr>
+              <w:t>endif</w:t>
+            </w:r>
+            <w:proofErr w:type="spellEnd"/>
+            <w:r>
+              <w:rPr>
+                <w:rFonts w:ascii="Consolas" w:hAnsi="Consolas" w:cs="Arial"/>
+                <w:color w:val="00B050"/>
+                <w:sz w:val="18"/>
+                <w:szCs w:val="18"/>
+              </w:rPr>
+              <w:t xml:space="preserve"> %}</w:t>
             </w:r>
           </w:p>
           <w:p>
@@ -900,6 +1801,7 @@
               </w:rPr>
               <w:t xml:space="preserve"> </w:t>
             </w:r>
+            <w:proofErr w:type="spellStart"/>
             <w:r>
               <w:rPr>
                 <w:rFonts w:ascii="Consolas" w:hAnsi="Consolas" w:cs="Arial"/>
@@ -909,6 +1811,7 @@
               </w:rPr>
               <w:t>else</w:t>
             </w:r>
+            <w:proofErr w:type="spellEnd"/>
             <w:r>
               <w:rPr>
                 <w:rFonts w:ascii="Consolas" w:hAnsi="Consolas" w:cs="Arial"/>
@@ -920,11 +1823,19 @@
             </w:r>
           </w:p>
           <w:p>
+            <w:proofErr w:type="gramStart"/>
             <w:r>
               <w:rPr>
                 <w:rStyle w:val="PlatzhalterZchn"/>
               </w:rPr>
-              <w:t>{{ G.NAME }}</w:t>
+              <w:t>{{ G.NAME</w:t>
+            </w:r>
+            <w:proofErr w:type="gramEnd"/>
+            <w:r>
+              <w:rPr>
+                <w:rStyle w:val="PlatzhalterZchn"/>
+              </w:rPr>
+              <w:t xml:space="preserve"> }}</w:t>
             </w:r>
             <w:r>
               <w:t xml:space="preserve">, </w:t>
@@ -952,20 +1863,54 @@
                 <w:sz w:val="18"/>
                 <w:szCs w:val="18"/>
               </w:rPr>
-              <w:t>{%p if G.VERTRETER_NAME %}</w:t>
-            </w:r>
-          </w:p>
-          <w:p>
+              <w:t xml:space="preserve">{%p </w:t>
+            </w:r>
+            <w:proofErr w:type="spellStart"/>
+            <w:r>
+              <w:rPr>
+                <w:rFonts w:ascii="Consolas" w:hAnsi="Consolas" w:cs="Arial"/>
+                <w:color w:val="00B050"/>
+                <w:sz w:val="18"/>
+                <w:szCs w:val="18"/>
+              </w:rPr>
+              <w:t>if</w:t>
+            </w:r>
+            <w:proofErr w:type="spellEnd"/>
+            <w:r>
+              <w:rPr>
+                <w:rFonts w:ascii="Consolas" w:hAnsi="Consolas" w:cs="Arial"/>
+                <w:color w:val="00B050"/>
+                <w:sz w:val="18"/>
+                <w:szCs w:val="18"/>
+              </w:rPr>
+              <w:t xml:space="preserve"> G.VERTRETER_NAME %}</w:t>
+            </w:r>
+          </w:p>
+          <w:p>
+            <w:pPr>
+              <w:ind w:left="37"/>
+            </w:pPr>
             <w:r>
               <w:t>vertreten durch</w:t>
             </w:r>
           </w:p>
           <w:p>
+            <w:pPr>
+              <w:ind w:left="37"/>
+            </w:pPr>
+            <w:proofErr w:type="gramStart"/>
             <w:r>
               <w:rPr>
                 <w:rStyle w:val="PlatzhalterZchn"/>
               </w:rPr>
-              <w:t>{{ G.VERTRETER_NAME }}</w:t>
+              <w:t>{{ G.VERTRETER</w:t>
+            </w:r>
+            <w:proofErr w:type="gramEnd"/>
+            <w:r>
+              <w:rPr>
+                <w:rStyle w:val="PlatzhalterZchn"/>
+              </w:rPr>
+              <w:t>_NAME }}</w:t>
             </w:r>
             <w:r>
               <w:t xml:space="preserve">, </w:t>
@@ -980,6 +1925,123 @@
           <w:p>
             <w:pPr>
               <w:rPr>
+                <w:rFonts w:ascii="Consolas" w:hAnsi="Consolas" w:cs="Arial"/>
+                <w:color w:val="00B050"/>
+                <w:sz w:val="18"/>
+                <w:szCs w:val="18"/>
+              </w:rPr>
+            </w:pPr>
+            <w:r>
+              <w:rPr>
+                <w:rFonts w:ascii="Consolas" w:hAnsi="Consolas" w:cs="Arial"/>
+                <w:color w:val="00B050"/>
+                <w:sz w:val="18"/>
+                <w:szCs w:val="18"/>
+              </w:rPr>
+              <w:t xml:space="preserve">{%p </w:t>
+            </w:r>
+            <w:proofErr w:type="spellStart"/>
+            <w:r>
+              <w:rPr>
+                <w:rFonts w:ascii="Consolas" w:hAnsi="Consolas" w:cs="Arial"/>
+                <w:color w:val="00B050"/>
+                <w:sz w:val="18"/>
+                <w:szCs w:val="18"/>
+              </w:rPr>
+              <w:t>endif</w:t>
+            </w:r>
+            <w:proofErr w:type="spellEnd"/>
+            <w:r>
+              <w:rPr>
+                <w:rFonts w:ascii="Consolas" w:hAnsi="Consolas" w:cs="Arial"/>
+                <w:color w:val="00B050"/>
+                <w:sz w:val="18"/>
+                <w:szCs w:val="18"/>
+              </w:rPr>
+              <w:t xml:space="preserve"> %}</w:t>
+            </w:r>
+          </w:p>
+          <w:p>
+            <w:pPr>
+              <w:rPr>
+                <w:rFonts w:ascii="Consolas" w:hAnsi="Consolas" w:cs="Arial"/>
+                <w:color w:val="00B050"/>
+                <w:sz w:val="18"/>
+                <w:szCs w:val="18"/>
+              </w:rPr>
+            </w:pPr>
+            <w:r>
+              <w:rPr>
+                <w:rFonts w:ascii="Consolas" w:hAnsi="Consolas" w:cs="Arial"/>
+                <w:color w:val="00B050"/>
+                <w:sz w:val="18"/>
+                <w:szCs w:val="18"/>
+              </w:rPr>
+              <w:t xml:space="preserve">{%p </w:t>
+            </w:r>
+            <w:proofErr w:type="spellStart"/>
+            <w:r>
+              <w:rPr>
+                <w:rFonts w:ascii="Consolas" w:hAnsi="Consolas" w:cs="Arial"/>
+                <w:color w:val="00B050"/>
+                <w:sz w:val="18"/>
+                <w:szCs w:val="18"/>
+              </w:rPr>
+              <w:t>endif</w:t>
+            </w:r>
+            <w:proofErr w:type="spellEnd"/>
+            <w:r>
+              <w:rPr>
+                <w:rFonts w:ascii="Consolas" w:hAnsi="Consolas" w:cs="Arial"/>
+                <w:color w:val="00B050"/>
+                <w:sz w:val="18"/>
+                <w:szCs w:val="18"/>
+              </w:rPr>
+              <w:t xml:space="preserve"> %}</w:t>
+            </w:r>
+          </w:p>
+          <w:p>
+            <w:pPr>
+              <w:rPr>
+                <w:rFonts w:ascii="Consolas" w:hAnsi="Consolas" w:cs="Arial"/>
+                <w:color w:val="00B050"/>
+                <w:sz w:val="18"/>
+                <w:szCs w:val="18"/>
+              </w:rPr>
+            </w:pPr>
+            <w:r>
+              <w:rPr>
+                <w:rFonts w:ascii="Consolas" w:hAnsi="Consolas" w:cs="Arial"/>
+                <w:color w:val="00B050"/>
+                <w:sz w:val="18"/>
+                <w:szCs w:val="18"/>
+              </w:rPr>
+              <w:t xml:space="preserve">{%p </w:t>
+            </w:r>
+            <w:proofErr w:type="spellStart"/>
+            <w:r>
+              <w:rPr>
+                <w:rFonts w:ascii="Consolas" w:hAnsi="Consolas" w:cs="Arial"/>
+                <w:color w:val="00B050"/>
+                <w:sz w:val="18"/>
+                <w:szCs w:val="18"/>
+              </w:rPr>
+              <w:t>endfor</w:t>
+            </w:r>
+            <w:proofErr w:type="spellEnd"/>
+            <w:r>
+              <w:rPr>
+                <w:rFonts w:ascii="Consolas" w:hAnsi="Consolas" w:cs="Arial"/>
+                <w:color w:val="00B050"/>
+                <w:sz w:val="18"/>
+                <w:szCs w:val="18"/>
+              </w:rPr>
+              <w:t xml:space="preserve"> %}</w:t>
+            </w:r>
+          </w:p>
+          <w:p>
+            <w:pPr>
+              <w:rPr>
                 <w:rFonts w:ascii="Consolas" w:hAnsi="Consolas"/>
                 <w:color w:val="00B050"/>
                 <w:sz w:val="18"/>
@@ -988,23 +2050,33 @@
             </w:pPr>
             <w:r>
               <w:rPr>
+                <w:rFonts w:ascii="Consolas" w:hAnsi="Consolas" w:cs="Arial"/>
+                <w:color w:val="00B050"/>
+                <w:sz w:val="18"/>
+                <w:szCs w:val="18"/>
+              </w:rPr>
+              <w:t xml:space="preserve">{%p </w:t>
+            </w:r>
+            <w:proofErr w:type="spellStart"/>
+            <w:r>
+              <w:rPr>
+                <w:rFonts w:ascii="Consolas" w:hAnsi="Consolas" w:cs="Arial"/>
+                <w:color w:val="00B050"/>
+                <w:sz w:val="18"/>
+                <w:szCs w:val="18"/>
+              </w:rPr>
+              <w:t>el</w:t>
+            </w:r>
+            <w:r>
+              <w:rPr>
                 <w:rFonts w:ascii="Consolas" w:hAnsi="Consolas"/>
                 <w:color w:val="00B050"/>
                 <w:sz w:val="18"/>
                 <w:szCs w:val="18"/>
               </w:rPr>
-              <w:t>{%p endif %}</w:t>
-            </w:r>
-          </w:p>
-          <w:p>
-            <w:pPr>
-              <w:rPr>
-                <w:rFonts w:ascii="Consolas" w:hAnsi="Consolas" w:cs="Arial"/>
-                <w:color w:val="00B050"/>
-                <w:sz w:val="18"/>
-                <w:szCs w:val="18"/>
-              </w:rPr>
-            </w:pPr>
+              <w:t>if</w:t>
+            </w:r>
+            <w:proofErr w:type="spellEnd"/>
             <w:r>
               <w:rPr>
                 <w:rFonts w:ascii="Consolas" w:hAnsi="Consolas"/>
@@ -1012,6 +2084,48 @@
                 <w:sz w:val="18"/>
                 <w:szCs w:val="18"/>
               </w:rPr>
+              <w:t xml:space="preserve"> </w:t>
+            </w:r>
+            <w:r>
+              <w:rPr>
+                <w:rFonts w:ascii="Consolas" w:hAnsi="Consolas"/>
+                <w:color w:val="00B050"/>
+                <w:sz w:val="18"/>
+                <w:szCs w:val="18"/>
+              </w:rPr>
+              <w:t>GESUCHSTELLER</w:t>
+            </w:r>
+            <w:r>
+              <w:rPr>
+                <w:rFonts w:ascii="Consolas" w:hAnsi="Consolas"/>
+                <w:color w:val="00B050"/>
+                <w:sz w:val="18"/>
+                <w:szCs w:val="18"/>
+              </w:rPr>
+              <w:t>_ANREDE == "Herr" %}</w:t>
+            </w:r>
+          </w:p>
+          <w:p>
+            <w:r>
+              <w:t>Gesuchsteller</w:t>
+            </w:r>
+          </w:p>
+          <w:p>
+            <w:pPr>
+              <w:rPr>
+                <w:rFonts w:ascii="Consolas" w:hAnsi="Consolas"/>
+                <w:color w:val="00B050"/>
+                <w:sz w:val="18"/>
+                <w:szCs w:val="18"/>
+              </w:rPr>
+            </w:pPr>
+            <w:r>
+              <w:rPr>
+                <w:rFonts w:ascii="Consolas" w:hAnsi="Consolas"/>
+                <w:color w:val="00B050"/>
+                <w:sz w:val="18"/>
+                <w:szCs w:val="18"/>
+              </w:rPr>
               <w:t>{%</w:t>
             </w:r>
             <w:r>
@@ -1030,18 +2144,143 @@
                 <w:sz w:val="18"/>
                 <w:szCs w:val="18"/>
               </w:rPr>
-              <w:t xml:space="preserve"> endif %}</w:t>
-            </w:r>
-          </w:p>
-          <w:p>
-            <w:r>
-              <w:rPr>
-                <w:rFonts w:ascii="Consolas" w:hAnsi="Consolas" w:cs="Arial"/>
-                <w:color w:val="00B050"/>
-                <w:sz w:val="18"/>
-                <w:szCs w:val="18"/>
-              </w:rPr>
-              <w:t>{%p endfor %}</w:t>
+              <w:t xml:space="preserve"> </w:t>
+            </w:r>
+            <w:proofErr w:type="spellStart"/>
+            <w:r>
+              <w:rPr>
+                <w:rFonts w:ascii="Consolas" w:hAnsi="Consolas"/>
+                <w:color w:val="00B050"/>
+                <w:sz w:val="18"/>
+                <w:szCs w:val="18"/>
+              </w:rPr>
+              <w:t>elif</w:t>
+            </w:r>
+            <w:proofErr w:type="spellEnd"/>
+            <w:r>
+              <w:rPr>
+                <w:rFonts w:ascii="Consolas" w:hAnsi="Consolas"/>
+                <w:color w:val="00B050"/>
+                <w:sz w:val="18"/>
+                <w:szCs w:val="18"/>
+              </w:rPr>
+              <w:t xml:space="preserve"> </w:t>
+            </w:r>
+            <w:r>
+              <w:rPr>
+                <w:rFonts w:ascii="Consolas" w:hAnsi="Consolas"/>
+                <w:color w:val="00B050"/>
+                <w:sz w:val="18"/>
+                <w:szCs w:val="18"/>
+              </w:rPr>
+              <w:t>GESUCHSTELLER</w:t>
+            </w:r>
+            <w:r>
+              <w:rPr>
+                <w:rFonts w:ascii="Consolas" w:hAnsi="Consolas"/>
+                <w:color w:val="00B050"/>
+                <w:sz w:val="18"/>
+                <w:szCs w:val="18"/>
+              </w:rPr>
+              <w:t>_ANREDE == "Frau" %}</w:t>
+            </w:r>
+          </w:p>
+          <w:p>
+            <w:r>
+              <w:t>Gesuchstellerin</w:t>
+            </w:r>
+          </w:p>
+          <w:p>
+            <w:pPr>
+              <w:rPr>
+                <w:rFonts w:ascii="Consolas" w:hAnsi="Consolas"/>
+                <w:color w:val="00B050"/>
+                <w:sz w:val="18"/>
+                <w:szCs w:val="18"/>
+              </w:rPr>
+            </w:pPr>
+            <w:r>
+              <w:rPr>
+                <w:rFonts w:ascii="Consolas" w:hAnsi="Consolas"/>
+                <w:color w:val="00B050"/>
+                <w:sz w:val="18"/>
+                <w:szCs w:val="18"/>
+              </w:rPr>
+              <w:t>{%</w:t>
+            </w:r>
+            <w:r>
+              <w:rPr>
+                <w:rFonts w:ascii="Consolas" w:hAnsi="Consolas"/>
+                <w:color w:val="00B050"/>
+                <w:sz w:val="18"/>
+                <w:szCs w:val="18"/>
+              </w:rPr>
+              <w:t>p</w:t>
+            </w:r>
+            <w:r>
+              <w:rPr>
+                <w:rFonts w:ascii="Consolas" w:hAnsi="Consolas"/>
+                <w:color w:val="00B050"/>
+                <w:sz w:val="18"/>
+                <w:szCs w:val="18"/>
+              </w:rPr>
+              <w:t xml:space="preserve"> </w:t>
+            </w:r>
+            <w:proofErr w:type="spellStart"/>
+            <w:r>
+              <w:rPr>
+                <w:rFonts w:ascii="Consolas" w:hAnsi="Consolas"/>
+                <w:color w:val="00B050"/>
+                <w:sz w:val="18"/>
+                <w:szCs w:val="18"/>
+              </w:rPr>
+              <w:t>else</w:t>
+            </w:r>
+            <w:proofErr w:type="spellEnd"/>
+            <w:r>
+              <w:rPr>
+                <w:rFonts w:ascii="Consolas" w:hAnsi="Consolas"/>
+                <w:color w:val="00B050"/>
+                <w:sz w:val="18"/>
+                <w:szCs w:val="18"/>
+              </w:rPr>
+              <w:t xml:space="preserve"> %}</w:t>
+            </w:r>
+          </w:p>
+          <w:p>
+            <w:r>
+              <w:t>Gesuchsteller/in</w:t>
+            </w:r>
+          </w:p>
+          <w:p>
+            <w:r>
+              <w:rPr>
+                <w:rFonts w:ascii="Consolas" w:hAnsi="Consolas" w:cs="Arial"/>
+                <w:color w:val="00B050"/>
+                <w:sz w:val="18"/>
+                <w:szCs w:val="18"/>
+              </w:rPr>
+              <w:t xml:space="preserve">{%p </w:t>
+            </w:r>
+            <w:proofErr w:type="spellStart"/>
+            <w:r>
+              <w:rPr>
+                <w:rFonts w:ascii="Consolas" w:hAnsi="Consolas" w:cs="Arial"/>
+                <w:color w:val="00B050"/>
+                <w:sz w:val="18"/>
+                <w:szCs w:val="18"/>
+              </w:rPr>
+              <w:t>endif</w:t>
+            </w:r>
+            <w:proofErr w:type="spellEnd"/>
+            <w:r>
+              <w:rPr>
+                <w:rFonts w:ascii="Consolas" w:hAnsi="Consolas" w:cs="Arial"/>
+                <w:color w:val="00B050"/>
+                <w:sz w:val="18"/>
+                <w:szCs w:val="18"/>
+              </w:rPr>
+              <w:t xml:space="preserve"> %}</w:t>
             </w:r>
           </w:p>
         </w:tc>
@@ -1051,10 +2290,12 @@
           <w:tcPr>
             <w:tcW w:w="3119" w:type="dxa"/>
             <w:tcBorders>
+              <w:top w:val="single" w:sz="4" w:space="0" w:color="D9D9D9" w:themeColor="background1" w:themeShade="D9"/>
+              <w:left w:val="single" w:sz="4" w:space="0" w:color="D9D9D9" w:themeColor="background1" w:themeShade="D9"/>
               <w:bottom w:val="single" w:sz="4" w:space="0" w:color="D9D9D9" w:themeColor="background1" w:themeShade="D9"/>
               <w:right w:val="single" w:sz="4" w:space="0" w:color="FFFFFF" w:themeColor="background1"/>
             </w:tcBorders>
-            <w:shd w:val="clear" w:color="auto" w:fill="auto"/>
+            <w:shd w:val="clear" w:color="auto" w:fill="D9D9D9" w:themeFill="background1" w:themeFillShade="D9"/>
           </w:tcPr>
           <w:p>
             <w:pPr>
@@ -1067,7 +2308,8 @@
               <w:rPr>
                 <w:rStyle w:val="Fett"/>
               </w:rPr>
-              <w:t>Grundeigentümer/in</w:t>
+              <w:lastRenderedPageBreak/>
+              <w:t>Projektverfasser/in</w:t>
             </w:r>
           </w:p>
         </w:tc>
@@ -1078,7 +2320,7 @@
               <w:left w:val="single" w:sz="4" w:space="0" w:color="FFFFFF" w:themeColor="background1"/>
               <w:bottom w:val="single" w:sz="4" w:space="0" w:color="D9D9D9" w:themeColor="background1" w:themeShade="D9"/>
             </w:tcBorders>
-            <w:shd w:val="clear" w:color="auto" w:fill="auto"/>
+            <w:shd w:val="clear" w:color="auto" w:fill="D9D9D9" w:themeFill="background1" w:themeFillShade="D9"/>
           </w:tcPr>
           <w:p>
             <w:pPr>
@@ -1096,16 +2338,54 @@
                 <w:sz w:val="18"/>
                 <w:szCs w:val="18"/>
               </w:rPr>
-              <w:t xml:space="preserve">{%p if </w:t>
-            </w:r>
-            <w:r>
-              <w:rPr>
-                <w:rFonts w:ascii="Consolas" w:hAnsi="Consolas" w:cs="Arial"/>
-                <w:color w:val="00B050"/>
-                <w:sz w:val="18"/>
-                <w:szCs w:val="18"/>
-              </w:rPr>
-              <w:t>ALLE_GRUNDEIGENTUEMER_LISTE</w:t>
+              <w:t xml:space="preserve">{%p </w:t>
+            </w:r>
+            <w:proofErr w:type="spellStart"/>
+            <w:r>
+              <w:rPr>
+                <w:rFonts w:ascii="Consolas" w:hAnsi="Consolas" w:cs="Arial"/>
+                <w:color w:val="00B050"/>
+                <w:sz w:val="18"/>
+                <w:szCs w:val="18"/>
+              </w:rPr>
+              <w:t>if</w:t>
+            </w:r>
+            <w:proofErr w:type="spellEnd"/>
+            <w:r>
+              <w:rPr>
+                <w:rFonts w:ascii="Consolas" w:hAnsi="Consolas" w:cs="Arial"/>
+                <w:color w:val="00B050"/>
+                <w:sz w:val="18"/>
+                <w:szCs w:val="18"/>
+              </w:rPr>
+              <w:t xml:space="preserve"> </w:t>
+            </w:r>
+            <w:r>
+              <w:rPr>
+                <w:rFonts w:ascii="Consolas" w:hAnsi="Consolas" w:cs="Arial"/>
+                <w:color w:val="00B050"/>
+                <w:sz w:val="18"/>
+                <w:szCs w:val="18"/>
+              </w:rPr>
+              <w:t>ALLE_</w:t>
+            </w:r>
+            <w:r>
+              <w:rPr>
+                <w:rFonts w:ascii="Consolas" w:hAnsi="Consolas" w:cs="Arial"/>
+                <w:color w:val="00B050"/>
+                <w:sz w:val="18"/>
+                <w:szCs w:val="18"/>
+              </w:rPr>
+              <w:t>PROJEKTVERFASSER</w:t>
+            </w:r>
+            <w:r>
+              <w:rPr>
+                <w:rFonts w:ascii="Consolas" w:hAnsi="Consolas" w:cs="Arial"/>
+                <w:color w:val="00B050"/>
+                <w:sz w:val="18"/>
+                <w:szCs w:val="18"/>
+              </w:rPr>
+              <w:t>_LISTE</w:t>
             </w:r>
             <w:r>
               <w:rPr>
@@ -1133,16 +2413,36 @@
                 <w:sz w:val="18"/>
                 <w:szCs w:val="18"/>
               </w:rPr>
-              <w:t>{%p for G in ALLE_</w:t>
-            </w:r>
-            <w:r>
-              <w:rPr>
-                <w:rFonts w:ascii="Consolas" w:hAnsi="Consolas" w:cs="Arial"/>
-                <w:color w:val="00B050"/>
-                <w:sz w:val="18"/>
-                <w:szCs w:val="18"/>
-              </w:rPr>
-              <w:t>GRUNDEIGENTUEMER</w:t>
+              <w:t xml:space="preserve">{%p </w:t>
+            </w:r>
+            <w:proofErr w:type="spellStart"/>
+            <w:r>
+              <w:rPr>
+                <w:rFonts w:ascii="Consolas" w:hAnsi="Consolas" w:cs="Arial"/>
+                <w:color w:val="00B050"/>
+                <w:sz w:val="18"/>
+                <w:szCs w:val="18"/>
+              </w:rPr>
+              <w:t>for</w:t>
+            </w:r>
+            <w:proofErr w:type="spellEnd"/>
+            <w:r>
+              <w:rPr>
+                <w:rFonts w:ascii="Consolas" w:hAnsi="Consolas" w:cs="Arial"/>
+                <w:color w:val="00B050"/>
+                <w:sz w:val="18"/>
+                <w:szCs w:val="18"/>
+              </w:rPr>
+              <w:t xml:space="preserve"> G in ALLE_</w:t>
+            </w:r>
+            <w:r>
+              <w:rPr>
+                <w:rFonts w:ascii="Consolas" w:hAnsi="Consolas" w:cs="Arial"/>
+                <w:color w:val="00B050"/>
+                <w:sz w:val="18"/>
+                <w:szCs w:val="18"/>
+              </w:rPr>
+              <w:t>PROJEKTVERFASSER</w:t>
             </w:r>
             <w:r>
               <w:rPr>
@@ -1189,25 +2489,65 @@
                 <w:sz w:val="18"/>
                 <w:szCs w:val="18"/>
               </w:rPr>
-              <w:t xml:space="preserve"> if ALLE_</w:t>
-            </w:r>
-            <w:r>
-              <w:rPr>
-                <w:rFonts w:ascii="Consolas" w:hAnsi="Consolas" w:cs="Arial"/>
-                <w:color w:val="00B050"/>
-                <w:sz w:val="18"/>
-                <w:szCs w:val="18"/>
-              </w:rPr>
-              <w:t>GRUNDEIGENTUEMER</w:t>
-            </w:r>
-            <w:r>
-              <w:rPr>
-                <w:rFonts w:ascii="Consolas" w:hAnsi="Consolas" w:cs="Arial"/>
-                <w:color w:val="00B050"/>
-                <w:sz w:val="18"/>
-                <w:szCs w:val="18"/>
-              </w:rPr>
-              <w:t>_LISTE|length &gt; 1 %}</w:t>
+              <w:t xml:space="preserve"> </w:t>
+            </w:r>
+            <w:proofErr w:type="spellStart"/>
+            <w:r>
+              <w:rPr>
+                <w:rFonts w:ascii="Consolas" w:hAnsi="Consolas" w:cs="Arial"/>
+                <w:color w:val="00B050"/>
+                <w:sz w:val="18"/>
+                <w:szCs w:val="18"/>
+              </w:rPr>
+              <w:t>if</w:t>
+            </w:r>
+            <w:proofErr w:type="spellEnd"/>
+            <w:r>
+              <w:rPr>
+                <w:rFonts w:ascii="Consolas" w:hAnsi="Consolas" w:cs="Arial"/>
+                <w:color w:val="00B050"/>
+                <w:sz w:val="18"/>
+                <w:szCs w:val="18"/>
+              </w:rPr>
+              <w:t xml:space="preserve"> </w:t>
+            </w:r>
+            <w:proofErr w:type="spellStart"/>
+            <w:r>
+              <w:rPr>
+                <w:rFonts w:ascii="Consolas" w:hAnsi="Consolas" w:cs="Arial"/>
+                <w:color w:val="00B050"/>
+                <w:sz w:val="18"/>
+                <w:szCs w:val="18"/>
+              </w:rPr>
+              <w:t>ALLE_</w:t>
+            </w:r>
+            <w:r>
+              <w:rPr>
+                <w:rFonts w:ascii="Consolas" w:hAnsi="Consolas" w:cs="Arial"/>
+                <w:color w:val="00B050"/>
+                <w:sz w:val="18"/>
+                <w:szCs w:val="18"/>
+              </w:rPr>
+              <w:t>PROJEKTVERFASSER</w:t>
+            </w:r>
+            <w:r>
+              <w:rPr>
+                <w:rFonts w:ascii="Consolas" w:hAnsi="Consolas" w:cs="Arial"/>
+                <w:color w:val="00B050"/>
+                <w:sz w:val="18"/>
+                <w:szCs w:val="18"/>
+              </w:rPr>
+              <w:t>_LISTE|length</w:t>
+            </w:r>
+            <w:proofErr w:type="spellEnd"/>
+            <w:r>
+              <w:rPr>
+                <w:rFonts w:ascii="Consolas" w:hAnsi="Consolas" w:cs="Arial"/>
+                <w:color w:val="00B050"/>
+                <w:sz w:val="18"/>
+                <w:szCs w:val="18"/>
+              </w:rPr>
+              <w:t xml:space="preserve"> &gt; 1 %}</w:t>
             </w:r>
           </w:p>
           <w:p>
@@ -1224,11 +2564,19 @@
                 <w:szCs w:val="22"/>
               </w:rPr>
             </w:pPr>
+            <w:proofErr w:type="gramStart"/>
             <w:r>
               <w:rPr>
                 <w:rStyle w:val="PlatzhalterZchn"/>
               </w:rPr>
-              <w:t>{{ G.NAME }}</w:t>
+              <w:t>{{ G.NAME</w:t>
+            </w:r>
+            <w:proofErr w:type="gramEnd"/>
+            <w:r>
+              <w:rPr>
+                <w:rStyle w:val="PlatzhalterZchn"/>
+              </w:rPr>
+              <w:t xml:space="preserve"> }}</w:t>
             </w:r>
             <w:r>
               <w:t xml:space="preserve">, </w:t>
@@ -1257,7 +2605,27 @@
                 <w:sz w:val="18"/>
                 <w:szCs w:val="18"/>
               </w:rPr>
-              <w:t>{%p if G.VERTRETER_NAME %}</w:t>
+              <w:t xml:space="preserve">{%p </w:t>
+            </w:r>
+            <w:proofErr w:type="spellStart"/>
+            <w:r>
+              <w:rPr>
+                <w:rFonts w:ascii="Consolas" w:hAnsi="Consolas" w:cs="Arial"/>
+                <w:color w:val="00B050"/>
+                <w:sz w:val="18"/>
+                <w:szCs w:val="18"/>
+              </w:rPr>
+              <w:t>if</w:t>
+            </w:r>
+            <w:proofErr w:type="spellEnd"/>
+            <w:r>
+              <w:rPr>
+                <w:rFonts w:ascii="Consolas" w:hAnsi="Consolas" w:cs="Arial"/>
+                <w:color w:val="00B050"/>
+                <w:sz w:val="18"/>
+                <w:szCs w:val="18"/>
+              </w:rPr>
+              <w:t xml:space="preserve"> G.VERTRETER_NAME %}</w:t>
             </w:r>
           </w:p>
           <w:p>
@@ -1271,16 +2639,20 @@
           <w:p>
             <w:pPr>
               <w:ind w:left="357"/>
-              <w:rPr>
-                <w:color w:val="00B050"/>
-              </w:rPr>
-            </w:pPr>
+            </w:pPr>
+            <w:proofErr w:type="gramStart"/>
             <w:r>
               <w:rPr>
                 <w:rStyle w:val="PlatzhalterZchn"/>
               </w:rPr>
-              <w:lastRenderedPageBreak/>
-              <w:t>{{ G.VERTRETER_NAME }}</w:t>
+              <w:t>{{ G.VERTRETER</w:t>
+            </w:r>
+            <w:proofErr w:type="gramEnd"/>
+            <w:r>
+              <w:rPr>
+                <w:rStyle w:val="PlatzhalterZchn"/>
+              </w:rPr>
+              <w:t>_NAME }}</w:t>
             </w:r>
             <w:r>
               <w:t xml:space="preserve">, </w:t>
@@ -1309,7 +2681,27 @@
                 <w:sz w:val="18"/>
                 <w:szCs w:val="18"/>
               </w:rPr>
-              <w:t>{%p endif %}</w:t>
+              <w:t xml:space="preserve">{%p </w:t>
+            </w:r>
+            <w:proofErr w:type="spellStart"/>
+            <w:r>
+              <w:rPr>
+                <w:rFonts w:ascii="Consolas" w:hAnsi="Consolas" w:cs="Arial"/>
+                <w:color w:val="00B050"/>
+                <w:sz w:val="18"/>
+                <w:szCs w:val="18"/>
+              </w:rPr>
+              <w:t>endif</w:t>
+            </w:r>
+            <w:proofErr w:type="spellEnd"/>
+            <w:r>
+              <w:rPr>
+                <w:rFonts w:ascii="Consolas" w:hAnsi="Consolas" w:cs="Arial"/>
+                <w:color w:val="00B050"/>
+                <w:sz w:val="18"/>
+                <w:szCs w:val="18"/>
+              </w:rPr>
+              <w:t xml:space="preserve"> %}</w:t>
             </w:r>
           </w:p>
           <w:p>
@@ -1346,15 +2738,43 @@
                 <w:sz w:val="18"/>
                 <w:szCs w:val="18"/>
               </w:rPr>
-              <w:t xml:space="preserve"> else %}</w:t>
-            </w:r>
-          </w:p>
-          <w:p>
+              <w:t xml:space="preserve"> </w:t>
+            </w:r>
+            <w:proofErr w:type="spellStart"/>
+            <w:r>
+              <w:rPr>
+                <w:rFonts w:ascii="Consolas" w:hAnsi="Consolas" w:cs="Arial"/>
+                <w:color w:val="00B050"/>
+                <w:sz w:val="18"/>
+                <w:szCs w:val="18"/>
+              </w:rPr>
+              <w:t>else</w:t>
+            </w:r>
+            <w:proofErr w:type="spellEnd"/>
+            <w:r>
+              <w:rPr>
+                <w:rFonts w:ascii="Consolas" w:hAnsi="Consolas" w:cs="Arial"/>
+                <w:color w:val="00B050"/>
+                <w:sz w:val="18"/>
+                <w:szCs w:val="18"/>
+              </w:rPr>
+              <w:t xml:space="preserve"> %}</w:t>
+            </w:r>
+          </w:p>
+          <w:p>
+            <w:proofErr w:type="gramStart"/>
             <w:r>
               <w:rPr>
                 <w:rStyle w:val="PlatzhalterZchn"/>
               </w:rPr>
-              <w:t>{{ G.NAME }}</w:t>
+              <w:t>{{ G.NAME</w:t>
+            </w:r>
+            <w:proofErr w:type="gramEnd"/>
+            <w:r>
+              <w:rPr>
+                <w:rStyle w:val="PlatzhalterZchn"/>
+              </w:rPr>
+              <w:t xml:space="preserve"> }}</w:t>
             </w:r>
             <w:r>
               <w:t xml:space="preserve">, </w:t>
@@ -1382,7 +2802,27 @@
                 <w:sz w:val="18"/>
                 <w:szCs w:val="18"/>
               </w:rPr>
-              <w:t>{%p if G.VERTRETER_NAME %}</w:t>
+              <w:t xml:space="preserve">{%p </w:t>
+            </w:r>
+            <w:proofErr w:type="spellStart"/>
+            <w:r>
+              <w:rPr>
+                <w:rFonts w:ascii="Consolas" w:hAnsi="Consolas" w:cs="Arial"/>
+                <w:color w:val="00B050"/>
+                <w:sz w:val="18"/>
+                <w:szCs w:val="18"/>
+              </w:rPr>
+              <w:t>if</w:t>
+            </w:r>
+            <w:proofErr w:type="spellEnd"/>
+            <w:r>
+              <w:rPr>
+                <w:rFonts w:ascii="Consolas" w:hAnsi="Consolas" w:cs="Arial"/>
+                <w:color w:val="00B050"/>
+                <w:sz w:val="18"/>
+                <w:szCs w:val="18"/>
+              </w:rPr>
+              <w:t xml:space="preserve"> G.VERTRETER_NAME %}</w:t>
             </w:r>
           </w:p>
           <w:p>
@@ -1397,11 +2837,19 @@
             <w:pPr>
               <w:ind w:left="37"/>
             </w:pPr>
+            <w:proofErr w:type="gramStart"/>
             <w:r>
               <w:rPr>
                 <w:rStyle w:val="PlatzhalterZchn"/>
               </w:rPr>
-              <w:t>{{ G.VERTRETER_NAME }}</w:t>
+              <w:t>{{ G.VERTRETER</w:t>
+            </w:r>
+            <w:proofErr w:type="gramEnd"/>
+            <w:r>
+              <w:rPr>
+                <w:rStyle w:val="PlatzhalterZchn"/>
+              </w:rPr>
+              <w:t>_NAME }}</w:t>
             </w:r>
             <w:r>
               <w:t xml:space="preserve">, </w:t>
@@ -1429,45 +2877,105 @@
                 <w:sz w:val="18"/>
                 <w:szCs w:val="18"/>
               </w:rPr>
-              <w:t>{%p endif %}</w:t>
-            </w:r>
-          </w:p>
-          <w:p>
-            <w:pPr>
-              <w:rPr>
-                <w:rFonts w:ascii="Consolas" w:hAnsi="Consolas" w:cs="Arial"/>
-                <w:color w:val="00B050"/>
-                <w:sz w:val="18"/>
-                <w:szCs w:val="18"/>
-              </w:rPr>
-            </w:pPr>
-            <w:r>
-              <w:rPr>
-                <w:rFonts w:ascii="Consolas" w:hAnsi="Consolas" w:cs="Arial"/>
-                <w:color w:val="00B050"/>
-                <w:sz w:val="18"/>
-                <w:szCs w:val="18"/>
-              </w:rPr>
-              <w:t>{%p endif %}</w:t>
-            </w:r>
-          </w:p>
-          <w:p>
-            <w:pPr>
-              <w:rPr>
-                <w:rFonts w:ascii="Consolas" w:hAnsi="Consolas" w:cs="Arial"/>
-                <w:color w:val="00B050"/>
-                <w:sz w:val="18"/>
-                <w:szCs w:val="18"/>
-              </w:rPr>
-            </w:pPr>
-            <w:r>
-              <w:rPr>
-                <w:rFonts w:ascii="Consolas" w:hAnsi="Consolas" w:cs="Arial"/>
-                <w:color w:val="00B050"/>
-                <w:sz w:val="18"/>
-                <w:szCs w:val="18"/>
-              </w:rPr>
-              <w:t>{%p endfor %}</w:t>
+              <w:t xml:space="preserve">{%p </w:t>
+            </w:r>
+            <w:proofErr w:type="spellStart"/>
+            <w:r>
+              <w:rPr>
+                <w:rFonts w:ascii="Consolas" w:hAnsi="Consolas" w:cs="Arial"/>
+                <w:color w:val="00B050"/>
+                <w:sz w:val="18"/>
+                <w:szCs w:val="18"/>
+              </w:rPr>
+              <w:t>endif</w:t>
+            </w:r>
+            <w:proofErr w:type="spellEnd"/>
+            <w:r>
+              <w:rPr>
+                <w:rFonts w:ascii="Consolas" w:hAnsi="Consolas" w:cs="Arial"/>
+                <w:color w:val="00B050"/>
+                <w:sz w:val="18"/>
+                <w:szCs w:val="18"/>
+              </w:rPr>
+              <w:t xml:space="preserve"> %}</w:t>
+            </w:r>
+          </w:p>
+          <w:p>
+            <w:pPr>
+              <w:rPr>
+                <w:rFonts w:ascii="Consolas" w:hAnsi="Consolas" w:cs="Arial"/>
+                <w:color w:val="00B050"/>
+                <w:sz w:val="18"/>
+                <w:szCs w:val="18"/>
+              </w:rPr>
+            </w:pPr>
+            <w:r>
+              <w:rPr>
+                <w:rFonts w:ascii="Consolas" w:hAnsi="Consolas" w:cs="Arial"/>
+                <w:color w:val="00B050"/>
+                <w:sz w:val="18"/>
+                <w:szCs w:val="18"/>
+              </w:rPr>
+              <w:t xml:space="preserve">{%p </w:t>
+            </w:r>
+            <w:proofErr w:type="spellStart"/>
+            <w:r>
+              <w:rPr>
+                <w:rFonts w:ascii="Consolas" w:hAnsi="Consolas" w:cs="Arial"/>
+                <w:color w:val="00B050"/>
+                <w:sz w:val="18"/>
+                <w:szCs w:val="18"/>
+              </w:rPr>
+              <w:t>endif</w:t>
+            </w:r>
+            <w:proofErr w:type="spellEnd"/>
+            <w:r>
+              <w:rPr>
+                <w:rFonts w:ascii="Consolas" w:hAnsi="Consolas" w:cs="Arial"/>
+                <w:color w:val="00B050"/>
+                <w:sz w:val="18"/>
+                <w:szCs w:val="18"/>
+              </w:rPr>
+              <w:t xml:space="preserve"> %}</w:t>
+            </w:r>
+          </w:p>
+          <w:p>
+            <w:pPr>
+              <w:rPr>
+                <w:rFonts w:ascii="Consolas" w:hAnsi="Consolas" w:cs="Arial"/>
+                <w:color w:val="00B050"/>
+                <w:sz w:val="18"/>
+                <w:szCs w:val="18"/>
+              </w:rPr>
+            </w:pPr>
+            <w:r>
+              <w:rPr>
+                <w:rFonts w:ascii="Consolas" w:hAnsi="Consolas" w:cs="Arial"/>
+                <w:color w:val="00B050"/>
+                <w:sz w:val="18"/>
+                <w:szCs w:val="18"/>
+              </w:rPr>
+              <w:t xml:space="preserve">{%p </w:t>
+            </w:r>
+            <w:proofErr w:type="spellStart"/>
+            <w:r>
+              <w:rPr>
+                <w:rFonts w:ascii="Consolas" w:hAnsi="Consolas" w:cs="Arial"/>
+                <w:color w:val="00B050"/>
+                <w:sz w:val="18"/>
+                <w:szCs w:val="18"/>
+              </w:rPr>
+              <w:t>endfor</w:t>
+            </w:r>
+            <w:proofErr w:type="spellEnd"/>
+            <w:r>
+              <w:rPr>
+                <w:rFonts w:ascii="Consolas" w:hAnsi="Consolas" w:cs="Arial"/>
+                <w:color w:val="00B050"/>
+                <w:sz w:val="18"/>
+                <w:szCs w:val="18"/>
+              </w:rPr>
+              <w:t xml:space="preserve"> %}</w:t>
             </w:r>
           </w:p>
           <w:p>
@@ -1486,7 +2994,17 @@
                 <w:sz w:val="18"/>
                 <w:szCs w:val="18"/>
               </w:rPr>
-              <w:t>{%p el</w:t>
+              <w:t xml:space="preserve">{%p </w:t>
+            </w:r>
+            <w:proofErr w:type="spellStart"/>
+            <w:r>
+              <w:rPr>
+                <w:rFonts w:ascii="Consolas" w:hAnsi="Consolas" w:cs="Arial"/>
+                <w:color w:val="00B050"/>
+                <w:sz w:val="18"/>
+                <w:szCs w:val="18"/>
+              </w:rPr>
+              <w:t>el</w:t>
             </w:r>
             <w:r>
               <w:rPr>
@@ -1495,8 +3013,9 @@
                 <w:sz w:val="18"/>
                 <w:szCs w:val="18"/>
               </w:rPr>
-              <w:t xml:space="preserve">if </w:t>
-            </w:r>
+              <w:t>if</w:t>
+            </w:r>
+            <w:proofErr w:type="spellEnd"/>
             <w:r>
               <w:rPr>
                 <w:rFonts w:ascii="Consolas" w:hAnsi="Consolas"/>
@@ -1504,6 +3023,15 @@
                 <w:sz w:val="18"/>
                 <w:szCs w:val="18"/>
               </w:rPr>
+              <w:t xml:space="preserve"> </w:t>
+            </w:r>
+            <w:r>
+              <w:rPr>
+                <w:rFonts w:ascii="Consolas" w:hAnsi="Consolas"/>
+                <w:color w:val="00B050"/>
+                <w:sz w:val="18"/>
+                <w:szCs w:val="18"/>
+              </w:rPr>
               <w:t>GESUCHSTELLER</w:t>
             </w:r>
             <w:r>
@@ -1555,8 +3083,9 @@
                 <w:sz w:val="18"/>
                 <w:szCs w:val="18"/>
               </w:rPr>
-              <w:t xml:space="preserve"> elif </w:t>
-            </w:r>
+              <w:t xml:space="preserve"> </w:t>
+            </w:r>
+            <w:proofErr w:type="spellStart"/>
             <w:r>
               <w:rPr>
                 <w:rFonts w:ascii="Consolas" w:hAnsi="Consolas"/>
@@ -1564,6 +3093,25 @@
                 <w:sz w:val="18"/>
                 <w:szCs w:val="18"/>
               </w:rPr>
+              <w:t>elif</w:t>
+            </w:r>
+            <w:proofErr w:type="spellEnd"/>
+            <w:r>
+              <w:rPr>
+                <w:rFonts w:ascii="Consolas" w:hAnsi="Consolas"/>
+                <w:color w:val="00B050"/>
+                <w:sz w:val="18"/>
+                <w:szCs w:val="18"/>
+              </w:rPr>
+              <w:t xml:space="preserve"> </w:t>
+            </w:r>
+            <w:r>
+              <w:rPr>
+                <w:rFonts w:ascii="Consolas" w:hAnsi="Consolas"/>
+                <w:color w:val="00B050"/>
+                <w:sz w:val="18"/>
+                <w:szCs w:val="18"/>
+              </w:rPr>
               <w:t>GESUCHSTELLER</w:t>
             </w:r>
             <w:r>
@@ -1615,7 +3163,27 @@
                 <w:sz w:val="18"/>
                 <w:szCs w:val="18"/>
               </w:rPr>
-              <w:t xml:space="preserve"> else %}</w:t>
+              <w:t xml:space="preserve"> </w:t>
+            </w:r>
+            <w:proofErr w:type="spellStart"/>
+            <w:r>
+              <w:rPr>
+                <w:rFonts w:ascii="Consolas" w:hAnsi="Consolas"/>
+                <w:color w:val="00B050"/>
+                <w:sz w:val="18"/>
+                <w:szCs w:val="18"/>
+              </w:rPr>
+              <w:t>else</w:t>
+            </w:r>
+            <w:proofErr w:type="spellEnd"/>
+            <w:r>
+              <w:rPr>
+                <w:rFonts w:ascii="Consolas" w:hAnsi="Consolas"/>
+                <w:color w:val="00B050"/>
+                <w:sz w:val="18"/>
+                <w:szCs w:val="18"/>
+              </w:rPr>
+              <w:t xml:space="preserve"> %}</w:t>
             </w:r>
           </w:p>
           <w:p>
@@ -1631,7 +3199,27 @@
                 <w:sz w:val="18"/>
                 <w:szCs w:val="18"/>
               </w:rPr>
-              <w:t>{%p endif %}</w:t>
+              <w:t xml:space="preserve">{%p </w:t>
+            </w:r>
+            <w:proofErr w:type="spellStart"/>
+            <w:r>
+              <w:rPr>
+                <w:rFonts w:ascii="Consolas" w:hAnsi="Consolas" w:cs="Arial"/>
+                <w:color w:val="00B050"/>
+                <w:sz w:val="18"/>
+                <w:szCs w:val="18"/>
+              </w:rPr>
+              <w:t>endif</w:t>
+            </w:r>
+            <w:proofErr w:type="spellEnd"/>
+            <w:r>
+              <w:rPr>
+                <w:rFonts w:ascii="Consolas" w:hAnsi="Consolas" w:cs="Arial"/>
+                <w:color w:val="00B050"/>
+                <w:sz w:val="18"/>
+                <w:szCs w:val="18"/>
+              </w:rPr>
+              <w:t xml:space="preserve"> %}</w:t>
             </w:r>
           </w:p>
         </w:tc>
@@ -1641,9 +3229,11 @@
           <w:tcPr>
             <w:tcW w:w="3119" w:type="dxa"/>
             <w:tcBorders>
+              <w:top w:val="single" w:sz="4" w:space="0" w:color="D9D9D9" w:themeColor="background1" w:themeShade="D9"/>
               <w:bottom w:val="single" w:sz="4" w:space="0" w:color="D9D9D9" w:themeColor="background1" w:themeShade="D9"/>
+              <w:right w:val="single" w:sz="4" w:space="0" w:color="D9D9D9" w:themeColor="background1" w:themeShade="D9"/>
             </w:tcBorders>
-            <w:shd w:val="clear" w:color="auto" w:fill="D9D9D9" w:themeFill="background1" w:themeFillShade="D9"/>
+            <w:shd w:val="clear" w:color="auto" w:fill="auto"/>
           </w:tcPr>
           <w:p>
             <w:pPr>
@@ -1656,8 +3246,7 @@
               <w:rPr>
                 <w:rStyle w:val="Fett"/>
               </w:rPr>
-              <w:lastRenderedPageBreak/>
-              <w:t>Projektverfasser/in</w:t>
+              <w:t>Adresse</w:t>
             </w:r>
           </w:p>
         </w:tc>
@@ -1665,576 +3254,22 @@
           <w:tcPr>
             <w:tcW w:w="6226" w:type="dxa"/>
             <w:tcBorders>
+              <w:left w:val="single" w:sz="4" w:space="0" w:color="D9D9D9" w:themeColor="background1" w:themeShade="D9"/>
               <w:bottom w:val="single" w:sz="4" w:space="0" w:color="D9D9D9" w:themeColor="background1" w:themeShade="D9"/>
             </w:tcBorders>
-            <w:shd w:val="clear" w:color="auto" w:fill="D9D9D9" w:themeFill="background1" w:themeFillShade="D9"/>
+            <w:shd w:val="clear" w:color="auto" w:fill="auto"/>
           </w:tcPr>
           <w:p>
             <w:pPr>
-              <w:rPr>
-                <w:rFonts w:ascii="Consolas" w:hAnsi="Consolas" w:cs="Arial"/>
-                <w:color w:val="00B050"/>
-                <w:sz w:val="18"/>
-                <w:szCs w:val="18"/>
-              </w:rPr>
-            </w:pPr>
-            <w:r>
-              <w:rPr>
-                <w:rFonts w:ascii="Consolas" w:hAnsi="Consolas" w:cs="Arial"/>
-                <w:color w:val="00B050"/>
-                <w:sz w:val="18"/>
-                <w:szCs w:val="18"/>
-              </w:rPr>
-              <w:t xml:space="preserve">{%p if </w:t>
-            </w:r>
-            <w:r>
-              <w:rPr>
-                <w:rFonts w:ascii="Consolas" w:hAnsi="Consolas" w:cs="Arial"/>
-                <w:color w:val="00B050"/>
-                <w:sz w:val="18"/>
-                <w:szCs w:val="18"/>
-              </w:rPr>
-              <w:t>ALLE_</w:t>
-            </w:r>
-            <w:r>
-              <w:rPr>
-                <w:rFonts w:ascii="Consolas" w:hAnsi="Consolas" w:cs="Arial"/>
-                <w:color w:val="00B050"/>
-                <w:sz w:val="18"/>
-                <w:szCs w:val="18"/>
-              </w:rPr>
-              <w:t>PROJEKTVERFASSER</w:t>
-            </w:r>
-            <w:r>
-              <w:rPr>
-                <w:rFonts w:ascii="Consolas" w:hAnsi="Consolas" w:cs="Arial"/>
-                <w:color w:val="00B050"/>
-                <w:sz w:val="18"/>
-                <w:szCs w:val="18"/>
-              </w:rPr>
-              <w:t>_LISTE</w:t>
-            </w:r>
-            <w:r>
-              <w:rPr>
-                <w:rFonts w:ascii="Consolas" w:hAnsi="Consolas" w:cs="Arial"/>
-                <w:color w:val="00B050"/>
-                <w:sz w:val="18"/>
-                <w:szCs w:val="18"/>
-              </w:rPr>
-              <w:t xml:space="preserve"> %}</w:t>
-            </w:r>
-          </w:p>
-          <w:p>
-            <w:pPr>
-              <w:rPr>
-                <w:rFonts w:ascii="Consolas" w:hAnsi="Consolas" w:cs="Arial"/>
-                <w:color w:val="00B050"/>
-                <w:sz w:val="18"/>
-                <w:szCs w:val="18"/>
-              </w:rPr>
-            </w:pPr>
-            <w:r>
-              <w:rPr>
-                <w:rFonts w:ascii="Consolas" w:hAnsi="Consolas" w:cs="Arial"/>
-                <w:color w:val="00B050"/>
-                <w:sz w:val="18"/>
-                <w:szCs w:val="18"/>
-              </w:rPr>
-              <w:t>{%p for G in ALLE_</w:t>
-            </w:r>
-            <w:r>
-              <w:rPr>
-                <w:rFonts w:ascii="Consolas" w:hAnsi="Consolas" w:cs="Arial"/>
-                <w:color w:val="00B050"/>
-                <w:sz w:val="18"/>
-                <w:szCs w:val="18"/>
-              </w:rPr>
-              <w:t>PROJEKTVERFASSER</w:t>
-            </w:r>
-            <w:r>
-              <w:rPr>
-                <w:rFonts w:ascii="Consolas" w:hAnsi="Consolas" w:cs="Arial"/>
-                <w:color w:val="00B050"/>
-                <w:sz w:val="18"/>
-                <w:szCs w:val="18"/>
-              </w:rPr>
-              <w:t>_LISTE %}</w:t>
-            </w:r>
-          </w:p>
-          <w:p>
-            <w:pPr>
-              <w:ind w:left="357" w:hanging="357"/>
-              <w:rPr>
-                <w:rFonts w:ascii="Consolas" w:hAnsi="Consolas" w:cs="Arial"/>
-                <w:color w:val="00B050"/>
-                <w:sz w:val="18"/>
-                <w:szCs w:val="18"/>
-              </w:rPr>
-            </w:pPr>
-            <w:r>
-              <w:rPr>
-                <w:rFonts w:ascii="Consolas" w:hAnsi="Consolas" w:cs="Arial"/>
-                <w:color w:val="00B050"/>
-                <w:sz w:val="18"/>
-                <w:szCs w:val="18"/>
-              </w:rPr>
-              <w:t>{%</w:t>
-            </w:r>
-            <w:r>
-              <w:rPr>
-                <w:rFonts w:ascii="Consolas" w:hAnsi="Consolas" w:cs="Arial"/>
-                <w:color w:val="00B050"/>
-                <w:sz w:val="18"/>
-                <w:szCs w:val="18"/>
-              </w:rPr>
-              <w:t>p</w:t>
-            </w:r>
-            <w:r>
-              <w:rPr>
-                <w:rFonts w:ascii="Consolas" w:hAnsi="Consolas" w:cs="Arial"/>
-                <w:color w:val="00B050"/>
-                <w:sz w:val="18"/>
-                <w:szCs w:val="18"/>
-              </w:rPr>
-              <w:t xml:space="preserve"> if ALLE_</w:t>
-            </w:r>
-            <w:r>
-              <w:rPr>
-                <w:rFonts w:ascii="Consolas" w:hAnsi="Consolas" w:cs="Arial"/>
-                <w:color w:val="00B050"/>
-                <w:sz w:val="18"/>
-                <w:szCs w:val="18"/>
-              </w:rPr>
-              <w:t>PROJEKTVERFASSER</w:t>
-            </w:r>
-            <w:r>
-              <w:rPr>
-                <w:rFonts w:ascii="Consolas" w:hAnsi="Consolas" w:cs="Arial"/>
-                <w:color w:val="00B050"/>
-                <w:sz w:val="18"/>
-                <w:szCs w:val="18"/>
-              </w:rPr>
-              <w:t>_LISTE|length &gt; 1 %}</w:t>
-            </w:r>
-          </w:p>
-          <w:p>
-            <w:pPr>
-              <w:pStyle w:val="Listenabsatz"/>
-              <w:numPr>
-                <w:ilvl w:val="0"/>
-                <w:numId w:val="25"/>
-              </w:numPr>
-              <w:spacing w:before="0"/>
-              <w:ind w:left="357" w:hanging="357"/>
-              <w:rPr>
-                <w:rFonts w:cs="Arial"/>
-                <w:szCs w:val="22"/>
-              </w:rPr>
-            </w:pPr>
-            <w:r>
-              <w:rPr>
-                <w:rStyle w:val="PlatzhalterZchn"/>
-              </w:rPr>
-              <w:t>{{ G.NAME }}</w:t>
-            </w:r>
-            <w:r>
-              <w:t xml:space="preserve">, </w:t>
-            </w:r>
-            <w:r>
-              <w:rPr>
-                <w:rStyle w:val="PlatzhalterZchn"/>
-              </w:rPr>
-              <w:t>{{ G.ADRESSE }}</w:t>
-            </w:r>
-          </w:p>
-          <w:p>
-            <w:pPr>
-              <w:ind w:left="357"/>
-              <w:rPr>
-                <w:rFonts w:ascii="Consolas" w:hAnsi="Consolas" w:cs="Arial"/>
-                <w:color w:val="00B050"/>
-                <w:sz w:val="18"/>
-                <w:szCs w:val="18"/>
-              </w:rPr>
-            </w:pPr>
-            <w:r>
-              <w:rPr>
-                <w:rFonts w:ascii="Consolas" w:hAnsi="Consolas" w:cs="Arial"/>
-                <w:color w:val="00B050"/>
-                <w:sz w:val="18"/>
-                <w:szCs w:val="18"/>
-              </w:rPr>
-              <w:t>{%p if G.VERTRETER_NAME %}</w:t>
-            </w:r>
-          </w:p>
-          <w:p>
-            <w:pPr>
-              <w:ind w:left="357"/>
-            </w:pPr>
-            <w:r>
-              <w:t>vertreten durch</w:t>
-            </w:r>
-          </w:p>
-          <w:p>
-            <w:pPr>
-              <w:ind w:left="357"/>
-            </w:pPr>
-            <w:r>
-              <w:rPr>
-                <w:rStyle w:val="PlatzhalterZchn"/>
-              </w:rPr>
-              <w:t>{{ G.VERTRETER_NAME }}</w:t>
-            </w:r>
-            <w:r>
-              <w:t xml:space="preserve">, </w:t>
-            </w:r>
-            <w:r>
-              <w:rPr>
-                <w:rStyle w:val="PlatzhalterZchn"/>
-              </w:rPr>
-              <w:t>{{ G.VERTRETER_ADRESSE }}</w:t>
-            </w:r>
-          </w:p>
-          <w:p>
-            <w:pPr>
-              <w:ind w:left="357"/>
-              <w:rPr>
-                <w:rFonts w:ascii="Consolas" w:hAnsi="Consolas" w:cs="Arial"/>
-                <w:color w:val="00B050"/>
-                <w:sz w:val="18"/>
-                <w:szCs w:val="18"/>
-              </w:rPr>
-            </w:pPr>
-            <w:r>
-              <w:rPr>
-                <w:rFonts w:ascii="Consolas" w:hAnsi="Consolas" w:cs="Arial"/>
-                <w:color w:val="00B050"/>
-                <w:sz w:val="18"/>
-                <w:szCs w:val="18"/>
-              </w:rPr>
-              <w:t>{%p endif %}</w:t>
-            </w:r>
-          </w:p>
-          <w:p>
-            <w:pPr>
-              <w:rPr>
-                <w:rFonts w:ascii="Consolas" w:hAnsi="Consolas" w:cs="Arial"/>
-                <w:color w:val="00B050"/>
-                <w:sz w:val="18"/>
-                <w:szCs w:val="18"/>
-              </w:rPr>
-            </w:pPr>
-            <w:r>
-              <w:rPr>
-                <w:rFonts w:ascii="Consolas" w:hAnsi="Consolas" w:cs="Arial"/>
-                <w:color w:val="00B050"/>
-                <w:sz w:val="18"/>
-                <w:szCs w:val="18"/>
-              </w:rPr>
-              <w:t>{%</w:t>
-            </w:r>
-            <w:r>
-              <w:rPr>
-                <w:rFonts w:ascii="Consolas" w:hAnsi="Consolas" w:cs="Arial"/>
-                <w:color w:val="00B050"/>
-                <w:sz w:val="18"/>
-                <w:szCs w:val="18"/>
-              </w:rPr>
-              <w:t>p</w:t>
-            </w:r>
-            <w:r>
-              <w:rPr>
-                <w:rFonts w:ascii="Consolas" w:hAnsi="Consolas" w:cs="Arial"/>
-                <w:color w:val="00B050"/>
-                <w:sz w:val="18"/>
-                <w:szCs w:val="18"/>
-              </w:rPr>
-              <w:t xml:space="preserve"> else %}</w:t>
-            </w:r>
-          </w:p>
-          <w:p>
-            <w:r>
-              <w:rPr>
-                <w:rStyle w:val="PlatzhalterZchn"/>
-              </w:rPr>
-              <w:t>{{ G.NAME }}</w:t>
-            </w:r>
-            <w:r>
-              <w:t xml:space="preserve">, </w:t>
-            </w:r>
-            <w:r>
-              <w:rPr>
-                <w:rStyle w:val="PlatzhalterZchn"/>
-              </w:rPr>
-              <w:t>{{ G.ADRESSE }}</w:t>
-            </w:r>
-          </w:p>
-          <w:p>
-            <w:pPr>
-              <w:rPr>
-                <w:rFonts w:ascii="Consolas" w:hAnsi="Consolas" w:cs="Arial"/>
-                <w:color w:val="00B050"/>
-                <w:sz w:val="18"/>
-                <w:szCs w:val="18"/>
-              </w:rPr>
-            </w:pPr>
-            <w:r>
-              <w:rPr>
-                <w:rFonts w:ascii="Consolas" w:hAnsi="Consolas" w:cs="Arial"/>
-                <w:color w:val="00B050"/>
-                <w:sz w:val="18"/>
-                <w:szCs w:val="18"/>
-              </w:rPr>
-              <w:t>{%p if G.VERTRETER_NAME %}</w:t>
-            </w:r>
-          </w:p>
-          <w:p>
-            <w:pPr>
-              <w:ind w:left="37"/>
-            </w:pPr>
-            <w:r>
-              <w:t>vertreten durch</w:t>
-            </w:r>
-          </w:p>
-          <w:p>
-            <w:pPr>
-              <w:ind w:left="37"/>
-            </w:pPr>
-            <w:r>
-              <w:rPr>
-                <w:rStyle w:val="PlatzhalterZchn"/>
-              </w:rPr>
-              <w:t>{{ G.VERTRETER_NAME }}</w:t>
-            </w:r>
-            <w:r>
-              <w:t xml:space="preserve">, </w:t>
-            </w:r>
-            <w:r>
-              <w:rPr>
-                <w:rStyle w:val="PlatzhalterZchn"/>
-              </w:rPr>
-              <w:t>{{ G.VERTRETER_ADRESSE }}</w:t>
-            </w:r>
-          </w:p>
-          <w:p>
-            <w:pPr>
-              <w:rPr>
-                <w:rFonts w:ascii="Consolas" w:hAnsi="Consolas" w:cs="Arial"/>
-                <w:color w:val="00B050"/>
-                <w:sz w:val="18"/>
-                <w:szCs w:val="18"/>
-              </w:rPr>
-            </w:pPr>
-            <w:r>
-              <w:rPr>
-                <w:rFonts w:ascii="Consolas" w:hAnsi="Consolas" w:cs="Arial"/>
-                <w:color w:val="00B050"/>
-                <w:sz w:val="18"/>
-                <w:szCs w:val="18"/>
-              </w:rPr>
-              <w:t>{%p endif %}</w:t>
-            </w:r>
-          </w:p>
-          <w:p>
-            <w:pPr>
-              <w:rPr>
-                <w:rFonts w:ascii="Consolas" w:hAnsi="Consolas" w:cs="Arial"/>
-                <w:color w:val="00B050"/>
-                <w:sz w:val="18"/>
-                <w:szCs w:val="18"/>
-              </w:rPr>
-            </w:pPr>
-            <w:r>
-              <w:rPr>
-                <w:rFonts w:ascii="Consolas" w:hAnsi="Consolas" w:cs="Arial"/>
-                <w:color w:val="00B050"/>
-                <w:sz w:val="18"/>
-                <w:szCs w:val="18"/>
-              </w:rPr>
-              <w:t>{%p endif %}</w:t>
-            </w:r>
-          </w:p>
-          <w:p>
-            <w:pPr>
-              <w:rPr>
-                <w:rFonts w:ascii="Consolas" w:hAnsi="Consolas" w:cs="Arial"/>
-                <w:color w:val="00B050"/>
-                <w:sz w:val="18"/>
-                <w:szCs w:val="18"/>
-              </w:rPr>
-            </w:pPr>
-            <w:r>
-              <w:rPr>
-                <w:rFonts w:ascii="Consolas" w:hAnsi="Consolas" w:cs="Arial"/>
-                <w:color w:val="00B050"/>
-                <w:sz w:val="18"/>
-                <w:szCs w:val="18"/>
-              </w:rPr>
-              <w:t>{%p endfor %}</w:t>
-            </w:r>
-          </w:p>
-          <w:p>
-            <w:pPr>
-              <w:rPr>
-                <w:rFonts w:ascii="Consolas" w:hAnsi="Consolas"/>
-                <w:color w:val="00B050"/>
-                <w:sz w:val="18"/>
-                <w:szCs w:val="18"/>
-              </w:rPr>
-            </w:pPr>
-            <w:r>
-              <w:rPr>
-                <w:rFonts w:ascii="Consolas" w:hAnsi="Consolas" w:cs="Arial"/>
-                <w:color w:val="00B050"/>
-                <w:sz w:val="18"/>
-                <w:szCs w:val="18"/>
-              </w:rPr>
-              <w:t>{%p el</w:t>
-            </w:r>
-            <w:r>
-              <w:rPr>
-                <w:rFonts w:ascii="Consolas" w:hAnsi="Consolas"/>
-                <w:color w:val="00B050"/>
-                <w:sz w:val="18"/>
-                <w:szCs w:val="18"/>
-              </w:rPr>
-              <w:t xml:space="preserve">if </w:t>
-            </w:r>
-            <w:r>
-              <w:rPr>
-                <w:rFonts w:ascii="Consolas" w:hAnsi="Consolas"/>
-                <w:color w:val="00B050"/>
-                <w:sz w:val="18"/>
-                <w:szCs w:val="18"/>
-              </w:rPr>
-              <w:t>GESUCHSTELLER</w:t>
-            </w:r>
-            <w:r>
-              <w:rPr>
-                <w:rFonts w:ascii="Consolas" w:hAnsi="Consolas"/>
-                <w:color w:val="00B050"/>
-                <w:sz w:val="18"/>
-                <w:szCs w:val="18"/>
-              </w:rPr>
-              <w:t>_ANREDE == "Herr" %}</w:t>
-            </w:r>
-          </w:p>
-          <w:p>
-            <w:r>
-              <w:t>Gesuchsteller</w:t>
-            </w:r>
-          </w:p>
-          <w:p>
-            <w:pPr>
-              <w:rPr>
-                <w:rFonts w:ascii="Consolas" w:hAnsi="Consolas"/>
-                <w:color w:val="00B050"/>
-                <w:sz w:val="18"/>
-                <w:szCs w:val="18"/>
-              </w:rPr>
-            </w:pPr>
-            <w:r>
-              <w:rPr>
-                <w:rFonts w:ascii="Consolas" w:hAnsi="Consolas"/>
-                <w:color w:val="00B050"/>
-                <w:sz w:val="18"/>
-                <w:szCs w:val="18"/>
-              </w:rPr>
-              <w:t>{%</w:t>
-            </w:r>
-            <w:r>
-              <w:rPr>
-                <w:rFonts w:ascii="Consolas" w:hAnsi="Consolas"/>
-                <w:color w:val="00B050"/>
-                <w:sz w:val="18"/>
-                <w:szCs w:val="18"/>
-              </w:rPr>
-              <w:t>p</w:t>
-            </w:r>
-            <w:r>
-              <w:rPr>
-                <w:rFonts w:ascii="Consolas" w:hAnsi="Consolas"/>
-                <w:color w:val="00B050"/>
-                <w:sz w:val="18"/>
-                <w:szCs w:val="18"/>
-              </w:rPr>
-              <w:t xml:space="preserve"> elif </w:t>
-            </w:r>
-            <w:r>
-              <w:rPr>
-                <w:rFonts w:ascii="Consolas" w:hAnsi="Consolas"/>
-                <w:color w:val="00B050"/>
-                <w:sz w:val="18"/>
-                <w:szCs w:val="18"/>
-              </w:rPr>
-              <w:t>GESUCHSTELLER</w:t>
-            </w:r>
-            <w:r>
-              <w:rPr>
-                <w:rFonts w:ascii="Consolas" w:hAnsi="Consolas"/>
-                <w:color w:val="00B050"/>
-                <w:sz w:val="18"/>
-                <w:szCs w:val="18"/>
-              </w:rPr>
-              <w:t>_ANREDE == "Frau" %}</w:t>
-            </w:r>
-          </w:p>
-          <w:p>
-            <w:r>
-              <w:t>Gesuchstellerin</w:t>
-            </w:r>
-          </w:p>
-          <w:p>
-            <w:pPr>
-              <w:rPr>
-                <w:rFonts w:ascii="Consolas" w:hAnsi="Consolas"/>
-                <w:color w:val="00B050"/>
-                <w:sz w:val="18"/>
-                <w:szCs w:val="18"/>
-              </w:rPr>
-            </w:pPr>
-            <w:r>
-              <w:rPr>
-                <w:rFonts w:ascii="Consolas" w:hAnsi="Consolas"/>
-                <w:color w:val="00B050"/>
-                <w:sz w:val="18"/>
-                <w:szCs w:val="18"/>
-              </w:rPr>
-              <w:t>{%</w:t>
-            </w:r>
-            <w:r>
-              <w:rPr>
-                <w:rFonts w:ascii="Consolas" w:hAnsi="Consolas"/>
-                <w:color w:val="00B050"/>
-                <w:sz w:val="18"/>
-                <w:szCs w:val="18"/>
-              </w:rPr>
-              <w:t>p</w:t>
-            </w:r>
-            <w:r>
-              <w:rPr>
-                <w:rFonts w:ascii="Consolas" w:hAnsi="Consolas"/>
-                <w:color w:val="00B050"/>
-                <w:sz w:val="18"/>
-                <w:szCs w:val="18"/>
-              </w:rPr>
-              <w:t xml:space="preserve"> else %}</w:t>
-            </w:r>
-          </w:p>
-          <w:p>
-            <w:r>
-              <w:t>Gesuchsteller/in</w:t>
-            </w:r>
-          </w:p>
-          <w:p>
-            <w:r>
-              <w:rPr>
-                <w:rFonts w:ascii="Consolas" w:hAnsi="Consolas" w:cs="Arial"/>
-                <w:color w:val="00B050"/>
-                <w:sz w:val="18"/>
-                <w:szCs w:val="18"/>
-              </w:rPr>
-              <w:t>{%p endif %}</w:t>
+              <w:pStyle w:val="Platzhalter"/>
+            </w:pPr>
+            <w:proofErr w:type="gramStart"/>
+            <w:r>
+              <w:t>{{ ADRESSE</w:t>
+            </w:r>
+            <w:proofErr w:type="gramEnd"/>
+            <w:r>
+              <w:t xml:space="preserve"> }}</w:t>
             </w:r>
           </w:p>
         </w:tc>
@@ -2244,10 +3279,12 @@
           <w:tcPr>
             <w:tcW w:w="3119" w:type="dxa"/>
             <w:tcBorders>
+              <w:top w:val="single" w:sz="4" w:space="0" w:color="D9D9D9" w:themeColor="background1" w:themeShade="D9"/>
+              <w:left w:val="single" w:sz="4" w:space="0" w:color="D9D9D9" w:themeColor="background1" w:themeShade="D9"/>
               <w:bottom w:val="single" w:sz="4" w:space="0" w:color="D9D9D9" w:themeColor="background1" w:themeShade="D9"/>
               <w:right w:val="single" w:sz="4" w:space="0" w:color="FFFFFF" w:themeColor="background1"/>
             </w:tcBorders>
-            <w:shd w:val="clear" w:color="auto" w:fill="auto"/>
+            <w:shd w:val="clear" w:color="auto" w:fill="D9D9D9" w:themeFill="background1" w:themeFillShade="D9"/>
           </w:tcPr>
           <w:p>
             <w:pPr>
@@ -2260,7 +3297,7 @@
               <w:rPr>
                 <w:rStyle w:val="Fett"/>
               </w:rPr>
-              <w:t>Adresse</w:t>
+              <w:t>Grundstücksnummer</w:t>
             </w:r>
           </w:p>
         </w:tc>
@@ -2271,14 +3308,22 @@
               <w:left w:val="single" w:sz="4" w:space="0" w:color="FFFFFF" w:themeColor="background1"/>
               <w:bottom w:val="single" w:sz="4" w:space="0" w:color="D9D9D9" w:themeColor="background1" w:themeShade="D9"/>
             </w:tcBorders>
-            <w:shd w:val="clear" w:color="auto" w:fill="auto"/>
+            <w:shd w:val="clear" w:color="auto" w:fill="D9D9D9" w:themeFill="background1" w:themeFillShade="D9"/>
           </w:tcPr>
           <w:p>
             <w:pPr>
               <w:pStyle w:val="Platzhalter"/>
             </w:pPr>
-            <w:r>
-              <w:t>{{ ADRESSE }}</w:t>
+            <w:proofErr w:type="gramStart"/>
+            <w:r>
+              <w:t xml:space="preserve">{{ </w:t>
+            </w:r>
+            <w:r>
+              <w:t>GRUNDSTUECK</w:t>
+            </w:r>
+            <w:proofErr w:type="gramEnd"/>
+            <w:r>
+              <w:t xml:space="preserve"> }}</w:t>
             </w:r>
           </w:p>
         </w:tc>
@@ -2288,9 +3333,11 @@
           <w:tcPr>
             <w:tcW w:w="3119" w:type="dxa"/>
             <w:tcBorders>
+              <w:top w:val="single" w:sz="4" w:space="0" w:color="D9D9D9" w:themeColor="background1" w:themeShade="D9"/>
               <w:bottom w:val="single" w:sz="4" w:space="0" w:color="D9D9D9" w:themeColor="background1" w:themeShade="D9"/>
+              <w:right w:val="single" w:sz="4" w:space="0" w:color="D9D9D9" w:themeColor="background1" w:themeShade="D9"/>
             </w:tcBorders>
-            <w:shd w:val="clear" w:color="auto" w:fill="D9D9D9" w:themeFill="background1" w:themeFillShade="D9"/>
+            <w:shd w:val="clear" w:color="auto" w:fill="auto"/>
           </w:tcPr>
           <w:p>
             <w:pPr>
@@ -2303,7 +3350,7 @@
               <w:rPr>
                 <w:rStyle w:val="Fett"/>
               </w:rPr>
-              <w:t>Grundstücksnummer</w:t>
+              <w:t>Planauflage</w:t>
             </w:r>
           </w:p>
         </w:tc>
@@ -2311,22 +3358,25 @@
           <w:tcPr>
             <w:tcW w:w="6226" w:type="dxa"/>
             <w:tcBorders>
+              <w:left w:val="single" w:sz="4" w:space="0" w:color="D9D9D9" w:themeColor="background1" w:themeShade="D9"/>
               <w:bottom w:val="single" w:sz="4" w:space="0" w:color="D9D9D9" w:themeColor="background1" w:themeShade="D9"/>
             </w:tcBorders>
-            <w:shd w:val="clear" w:color="auto" w:fill="D9D9D9" w:themeFill="background1" w:themeFillShade="D9"/>
+            <w:shd w:val="clear" w:color="auto" w:fill="auto"/>
           </w:tcPr>
           <w:p>
             <w:pPr>
               <w:pStyle w:val="Platzhalter"/>
             </w:pPr>
             <w:r>
-              <w:t xml:space="preserve">{{ </w:t>
-            </w:r>
-            <w:r>
-              <w:t>GRUNDSTUECK</w:t>
-            </w:r>
-            <w:r>
-              <w:t xml:space="preserve"> }}</w:t>
+              <w:t xml:space="preserve">Die öffentliche Planauflage erfolgt digital über den kantonalen Onlineschalter «my.so.ch» über «Umwelt und Bauen» / «Bauvorhaben – öffentliche Planauflage». Für den Zugang wird eine </w:t>
+            </w:r>
+            <w:proofErr w:type="spellStart"/>
+            <w:r>
+              <w:t>SwissID</w:t>
+            </w:r>
+            <w:proofErr w:type="spellEnd"/>
+            <w:r>
+              <w:t xml:space="preserve"> mit der Stufe 0 (selbstdeklarierte Identität) benötigt. Alternativ können die Unterlagen während der Öffnungszeiten in der Gemeindeverwaltung digital eingesehen werden.</w:t>
             </w:r>
           </w:p>
         </w:tc>
@@ -2336,10 +3386,12 @@
           <w:tcPr>
             <w:tcW w:w="3119" w:type="dxa"/>
             <w:tcBorders>
+              <w:top w:val="single" w:sz="4" w:space="0" w:color="D9D9D9" w:themeColor="background1" w:themeShade="D9"/>
+              <w:left w:val="single" w:sz="4" w:space="0" w:color="D9D9D9" w:themeColor="background1" w:themeShade="D9"/>
               <w:bottom w:val="single" w:sz="4" w:space="0" w:color="D9D9D9" w:themeColor="background1" w:themeShade="D9"/>
               <w:right w:val="single" w:sz="4" w:space="0" w:color="FFFFFF" w:themeColor="background1"/>
             </w:tcBorders>
-            <w:shd w:val="clear" w:color="auto" w:fill="auto"/>
+            <w:shd w:val="clear" w:color="auto" w:fill="D9D9D9" w:themeFill="background1" w:themeFillShade="D9"/>
           </w:tcPr>
           <w:p>
             <w:pPr>
@@ -2352,7 +3404,14 @@
               <w:rPr>
                 <w:rStyle w:val="Fett"/>
               </w:rPr>
-              <w:t>Planauflage</w:t>
+              <w:lastRenderedPageBreak/>
+              <w:t>Einsprachefrist</w:t>
+            </w:r>
+            <w:r>
+              <w:rPr>
+                <w:rStyle w:val="Fett"/>
+              </w:rPr>
+              <w:t xml:space="preserve"> bis am</w:t>
             </w:r>
           </w:p>
         </w:tc>
@@ -2363,14 +3422,25 @@
               <w:left w:val="single" w:sz="4" w:space="0" w:color="FFFFFF" w:themeColor="background1"/>
               <w:bottom w:val="single" w:sz="4" w:space="0" w:color="D9D9D9" w:themeColor="background1" w:themeShade="D9"/>
             </w:tcBorders>
-            <w:shd w:val="clear" w:color="auto" w:fill="auto"/>
+            <w:shd w:val="clear" w:color="auto" w:fill="D9D9D9" w:themeFill="background1" w:themeFillShade="D9"/>
           </w:tcPr>
           <w:p>
             <w:pPr>
-              <w:pStyle w:val="Platzhalter"/>
-            </w:pPr>
-            <w:r>
-              <w:t>{{ PUBLIKATION_LINK }}</w:t>
+              <w:ind w:right="-3"/>
+            </w:pPr>
+            <w:proofErr w:type="gramStart"/>
+            <w:r>
+              <w:rPr>
+                <w:rStyle w:val="PlatzhalterZchn"/>
+              </w:rPr>
+              <w:t>{{ PUBLIKATION</w:t>
+            </w:r>
+            <w:proofErr w:type="gramEnd"/>
+            <w:r>
+              <w:rPr>
+                <w:rStyle w:val="PlatzhalterZchn"/>
+              </w:rPr>
+              <w:t>_ENDE }}</w:t>
             </w:r>
           </w:p>
         </w:tc>
@@ -2380,9 +3450,11 @@
           <w:tcPr>
             <w:tcW w:w="3119" w:type="dxa"/>
             <w:tcBorders>
+              <w:top w:val="single" w:sz="4" w:space="0" w:color="D9D9D9" w:themeColor="background1" w:themeShade="D9"/>
               <w:bottom w:val="single" w:sz="4" w:space="0" w:color="D9D9D9" w:themeColor="background1" w:themeShade="D9"/>
+              <w:right w:val="single" w:sz="4" w:space="0" w:color="D9D9D9" w:themeColor="background1" w:themeShade="D9"/>
             </w:tcBorders>
-            <w:shd w:val="clear" w:color="auto" w:fill="D9D9D9" w:themeFill="background1" w:themeFillShade="D9"/>
+            <w:shd w:val="clear" w:color="auto" w:fill="auto"/>
           </w:tcPr>
           <w:p>
             <w:pPr>
@@ -2395,7 +3467,7 @@
               <w:rPr>
                 <w:rStyle w:val="Fett"/>
               </w:rPr>
-              <w:t>Einsprachefrist</w:t>
+              <w:t>Kontaktstelle</w:t>
             </w:r>
           </w:p>
         </w:tc>
@@ -2403,28 +3475,22 @@
           <w:tcPr>
             <w:tcW w:w="6226" w:type="dxa"/>
             <w:tcBorders>
+              <w:left w:val="single" w:sz="4" w:space="0" w:color="D9D9D9" w:themeColor="background1" w:themeShade="D9"/>
               <w:bottom w:val="single" w:sz="4" w:space="0" w:color="D9D9D9" w:themeColor="background1" w:themeShade="D9"/>
             </w:tcBorders>
-            <w:shd w:val="clear" w:color="auto" w:fill="D9D9D9" w:themeFill="background1" w:themeFillShade="D9"/>
+            <w:shd w:val="clear" w:color="auto" w:fill="auto"/>
           </w:tcPr>
           <w:p>
             <w:pPr>
-              <w:ind w:right="-3"/>
-            </w:pPr>
-            <w:r>
-              <w:rPr>
-                <w:rStyle w:val="PlatzhalterZchn"/>
-              </w:rPr>
-              <w:t>{{ PUBLIKATION_START }}</w:t>
-            </w:r>
-            <w:r>
-              <w:t xml:space="preserve"> bis </w:t>
-            </w:r>
-            <w:r>
-              <w:rPr>
-                <w:rStyle w:val="PlatzhalterZchn"/>
-              </w:rPr>
-              <w:t>{{ PUBLIKATION_ENDE }}</w:t>
+              <w:pStyle w:val="Platzhalter"/>
+            </w:pPr>
+            <w:proofErr w:type="gramStart"/>
+            <w:r>
+              <w:t>{{ LEITBEHOERDE</w:t>
+            </w:r>
+            <w:proofErr w:type="gramEnd"/>
+            <w:r>
+              <w:t>_NAME_ADRESSE }}</w:t>
             </w:r>
           </w:p>
         </w:tc>
@@ -2434,10 +3500,12 @@
           <w:tcPr>
             <w:tcW w:w="3119" w:type="dxa"/>
             <w:tcBorders>
+              <w:top w:val="single" w:sz="4" w:space="0" w:color="D9D9D9" w:themeColor="background1" w:themeShade="D9"/>
+              <w:left w:val="single" w:sz="4" w:space="0" w:color="D9D9D9" w:themeColor="background1" w:themeShade="D9"/>
               <w:bottom w:val="single" w:sz="4" w:space="0" w:color="D9D9D9" w:themeColor="background1" w:themeShade="D9"/>
               <w:right w:val="single" w:sz="4" w:space="0" w:color="FFFFFF" w:themeColor="background1"/>
             </w:tcBorders>
-            <w:shd w:val="clear" w:color="auto" w:fill="auto"/>
+            <w:shd w:val="clear" w:color="auto" w:fill="D9D9D9" w:themeFill="background1" w:themeFillShade="D9"/>
           </w:tcPr>
           <w:p>
             <w:pPr>
@@ -2450,7 +3518,7 @@
               <w:rPr>
                 <w:rStyle w:val="Fett"/>
               </w:rPr>
-              <w:t>Kontaktstelle</w:t>
+              <w:t>Einsprachen</w:t>
             </w:r>
           </w:p>
         </w:tc>
@@ -2459,26 +3527,6 @@
             <w:tcW w:w="6226" w:type="dxa"/>
             <w:tcBorders>
               <w:left w:val="single" w:sz="4" w:space="0" w:color="FFFFFF" w:themeColor="background1"/>
-              <w:bottom w:val="single" w:sz="4" w:space="0" w:color="D9D9D9" w:themeColor="background1" w:themeShade="D9"/>
-            </w:tcBorders>
-            <w:shd w:val="clear" w:color="auto" w:fill="auto"/>
-          </w:tcPr>
-          <w:p>
-            <w:pPr>
-              <w:pStyle w:val="Platzhalter"/>
-            </w:pPr>
-            <w:r>
-              <w:t>{{ LEITBEHOERDE_NAME_ADRESSE }}</w:t>
-            </w:r>
-          </w:p>
-        </w:tc>
-      </w:tr>
-      <w:tr>
-        <w:tc>
-          <w:tcPr>
-            <w:tcW w:w="3119" w:type="dxa"/>
-            <w:tcBorders>
-              <w:right w:val="single" w:sz="4" w:space="0" w:color="D9D9D9" w:themeColor="background1" w:themeShade="D9"/>
             </w:tcBorders>
             <w:shd w:val="clear" w:color="auto" w:fill="D9D9D9" w:themeFill="background1" w:themeFillShade="D9"/>
           </w:tcPr>
@@ -2486,29 +3534,6 @@
             <w:pPr>
               <w:ind w:right="-3"/>
               <w:rPr>
-                <w:rStyle w:val="Fett"/>
-              </w:rPr>
-            </w:pPr>
-            <w:r>
-              <w:rPr>
-                <w:rStyle w:val="Fett"/>
-              </w:rPr>
-              <w:t>Einsprachen</w:t>
-            </w:r>
-          </w:p>
-        </w:tc>
-        <w:tc>
-          <w:tcPr>
-            <w:tcW w:w="6226" w:type="dxa"/>
-            <w:tcBorders>
-              <w:left w:val="single" w:sz="4" w:space="0" w:color="D9D9D9" w:themeColor="background1" w:themeShade="D9"/>
-            </w:tcBorders>
-            <w:shd w:val="clear" w:color="auto" w:fill="D9D9D9" w:themeFill="background1" w:themeFillShade="D9"/>
-          </w:tcPr>
-          <w:p>
-            <w:pPr>
-              <w:ind w:right="-3"/>
-              <w:rPr>
                 <w:rFonts w:cs="Arial"/>
                 <w:szCs w:val="22"/>
               </w:rPr>
@@ -2518,41 +3543,28 @@
                 <w:rFonts w:cs="Arial"/>
                 <w:szCs w:val="22"/>
               </w:rPr>
-              <w:t xml:space="preserve">Allfällige Einsprachen sind bis und mit </w:t>
-            </w:r>
+              <w:t xml:space="preserve">Einsprachen sind schriftlich und begründet im Doppel per Post an die </w:t>
+            </w:r>
+            <w:proofErr w:type="gramStart"/>
             <w:r>
               <w:rPr>
                 <w:rStyle w:val="PlatzhalterZchn"/>
               </w:rPr>
-              <w:t>{{ PUBLIKATION_ENDE }}</w:t>
+              <w:t>{{ LEITBEHOERDE</w:t>
+            </w:r>
+            <w:proofErr w:type="gramEnd"/>
+            <w:r>
+              <w:rPr>
+                <w:rStyle w:val="PlatzhalterZchn"/>
+              </w:rPr>
+              <w:t>_NAME_ADRESSE }}</w:t>
             </w:r>
             <w:r>
               <w:rPr>
                 <w:rFonts w:cs="Arial"/>
                 <w:szCs w:val="22"/>
               </w:rPr>
-              <w:t xml:space="preserve"> schriftlich im Doppel, mit Antrag und </w:t>
-            </w:r>
-            <w:r>
-              <w:rPr>
-                <w:rFonts w:cs="Arial"/>
-                <w:szCs w:val="22"/>
-              </w:rPr>
-              <w:lastRenderedPageBreak/>
-              <w:t xml:space="preserve">Begründung per Post an die </w:t>
-            </w:r>
-            <w:r>
-              <w:rPr>
-                <w:rStyle w:val="PlatzhalterZchn"/>
-              </w:rPr>
-              <w:t>{{ LEITBEHOERDE_NAME_ADRESSE }}</w:t>
-            </w:r>
-            <w:r>
-              <w:rPr>
-                <w:rFonts w:cs="Arial"/>
-                <w:szCs w:val="22"/>
-              </w:rPr>
-              <w:t xml:space="preserve"> einzureichen.</w:t>
+              <w:t>, einzureichen.</w:t>
             </w:r>
           </w:p>
         </w:tc>
@@ -2573,13 +3585,50 @@
           <w:sz w:val="18"/>
           <w:szCs w:val="18"/>
         </w:rPr>
-        <w:t>{% if ZUSTAENDIG_NAME %}</w:t>
+        <w:t xml:space="preserve">{% </w:t>
+      </w:r>
+      <w:proofErr w:type="spellStart"/>
+      <w:r>
+        <w:rPr>
+          <w:rFonts w:ascii="Consolas" w:hAnsi="Consolas"/>
+          <w:color w:val="00B050"/>
+          <w:sz w:val="18"/>
+          <w:szCs w:val="18"/>
+        </w:rPr>
+        <w:t>if</w:t>
+      </w:r>
+      <w:proofErr w:type="spellEnd"/>
+      <w:r>
+        <w:rPr>
+          <w:rFonts w:ascii="Consolas" w:hAnsi="Consolas"/>
+          <w:color w:val="00B050"/>
+          <w:sz w:val="18"/>
+          <w:szCs w:val="18"/>
+        </w:rPr>
+        <w:t xml:space="preserve"> ZUSTAENDIG_NAME </w:t>
+      </w:r>
+      <w:proofErr w:type="gramStart"/>
+      <w:r>
+        <w:rPr>
+          <w:rFonts w:ascii="Consolas" w:hAnsi="Consolas"/>
+          <w:color w:val="00B050"/>
+          <w:sz w:val="18"/>
+          <w:szCs w:val="18"/>
+        </w:rPr>
+        <w:t>%}</w:t>
       </w:r>
       <w:r>
         <w:rPr>
           <w:rStyle w:val="PlatzhalterZchn"/>
         </w:rPr>
-        <w:t>{{ ZUSTAENDIG_NAME }}</w:t>
+        <w:t>{</w:t>
+      </w:r>
+      <w:proofErr w:type="gramEnd"/>
+      <w:r>
+        <w:rPr>
+          <w:rStyle w:val="PlatzhalterZchn"/>
+        </w:rPr>
+        <w:t>{ ZUSTAENDIG_NAME }}</w:t>
       </w:r>
       <w:r>
         <w:rPr>
@@ -2588,7 +3637,27 @@
           <w:sz w:val="18"/>
           <w:szCs w:val="18"/>
         </w:rPr>
-        <w:t>{% endif %}</w:t>
+        <w:t xml:space="preserve">{% </w:t>
+      </w:r>
+      <w:proofErr w:type="spellStart"/>
+      <w:r>
+        <w:rPr>
+          <w:rFonts w:ascii="Consolas" w:hAnsi="Consolas"/>
+          <w:color w:val="00B050"/>
+          <w:sz w:val="18"/>
+          <w:szCs w:val="18"/>
+        </w:rPr>
+        <w:t>endif</w:t>
+      </w:r>
+      <w:proofErr w:type="spellEnd"/>
+      <w:r>
+        <w:rPr>
+          <w:rFonts w:ascii="Consolas" w:hAnsi="Consolas"/>
+          <w:color w:val="00B050"/>
+          <w:sz w:val="18"/>
+          <w:szCs w:val="18"/>
+        </w:rPr>
+        <w:t xml:space="preserve"> %}</w:t>
       </w:r>
     </w:p>
     <w:sectPr>
@@ -2607,7 +3676,7 @@
 </file>
 
 <file path=word/endnotes.xml><?xml version="1.0" encoding="utf-8"?>
-<w:endnotes xmlns:wpc="http://schemas.microsoft.com/office/word/2010/wordprocessingCanvas" xmlns:cx="http://schemas.microsoft.com/office/drawing/2014/chartex" xmlns:cx1="http://schemas.microsoft.com/office/drawing/2015/9/8/chartex" xmlns:cx2="http://schemas.microsoft.com/office/drawing/2015/10/21/chartex" xmlns:cx3="http://schemas.microsoft.com/office/drawing/2016/5/9/chartex" xmlns:cx4="http://schemas.microsoft.com/office/drawing/2016/5/10/chartex" xmlns:cx5="http://schemas.microsoft.com/office/drawing/2016/5/11/chartex" xmlns:cx6="http://schemas.microsoft.com/office/drawing/2016/5/12/chartex" xmlns:cx7="http://schemas.microsoft.com/office/drawing/2016/5/13/chartex" xmlns:cx8="http://schemas.microsoft.com/office/drawing/2016/5/14/chartex" xmlns:mc="http://schemas.openxmlformats.org/markup-compatibility/2006" xmlns:aink="http://schemas.microsoft.com/office/drawing/2016/ink" xmlns:am3d="http://schemas.microsoft.com/office/drawing/2017/model3d" xmlns:o="urn:schemas-microsoft-com:office:office" xmlns:oel="http://schemas.microsoft.com/office/2019/extlst" xmlns:r="http://schemas.openxmlformats.org/officeDocument/2006/relationships" xmlns:m="http://schemas.openxmlformats.org/officeDocument/2006/math" xmlns:v="urn:schemas-microsoft-com:vml" xmlns:wp14="http://schemas.microsoft.com/office/word/2010/wordprocessingDrawing" xmlns:wp="http://schemas.openxmlformats.org/drawingml/2006/wordprocessingDrawing" xmlns:w10="urn:schemas-microsoft-com:office:word" xmlns:w="http://schemas.openxmlformats.org/wordprocessingml/2006/main" xmlns:w14="http://schemas.microsoft.com/office/word/2010/wordml" xmlns:w15="http://schemas.microsoft.com/office/word/2012/wordml" xmlns:w16cex="http://schemas.microsoft.com/office/word/2018/wordml/cex" xmlns:w16cid="http://schemas.microsoft.com/office/word/2016/wordml/cid" xmlns:w16="http://schemas.microsoft.com/office/word/2018/wordml" xmlns:w16du="http://schemas.microsoft.com/office/word/2023/wordml/word16du" xmlns:w16sdtdh="http://schemas.microsoft.com/office/word/2020/wordml/sdtdatahash" xmlns:w16se="http://schemas.microsoft.com/office/word/2015/wordml/symex" xmlns:wpg="http://schemas.microsoft.com/office/word/2010/wordprocessingGroup" xmlns:wpi="http://schemas.microsoft.com/office/word/2010/wordprocessingInk" xmlns:wne="http://schemas.microsoft.com/office/word/2006/wordml" xmlns:wps="http://schemas.microsoft.com/office/word/2010/wordprocessingShape" mc:Ignorable="w14 w15 w16se w16cid w16 w16cex w16sdtdh w16du wp14">
+<w:endnotes xmlns:wpc="http://schemas.microsoft.com/office/word/2010/wordprocessingCanvas" xmlns:cx="http://schemas.microsoft.com/office/drawing/2014/chartex" xmlns:cx1="http://schemas.microsoft.com/office/drawing/2015/9/8/chartex" xmlns:cx2="http://schemas.microsoft.com/office/drawing/2015/10/21/chartex" xmlns:cx3="http://schemas.microsoft.com/office/drawing/2016/5/9/chartex" xmlns:cx4="http://schemas.microsoft.com/office/drawing/2016/5/10/chartex" xmlns:cx5="http://schemas.microsoft.com/office/drawing/2016/5/11/chartex" xmlns:cx6="http://schemas.microsoft.com/office/drawing/2016/5/12/chartex" xmlns:cx7="http://schemas.microsoft.com/office/drawing/2016/5/13/chartex" xmlns:cx8="http://schemas.microsoft.com/office/drawing/2016/5/14/chartex" xmlns:mc="http://schemas.openxmlformats.org/markup-compatibility/2006" xmlns:aink="http://schemas.microsoft.com/office/drawing/2016/ink" xmlns:am3d="http://schemas.microsoft.com/office/drawing/2017/model3d" xmlns:o="urn:schemas-microsoft-com:office:office" xmlns:oel="http://schemas.microsoft.com/office/2019/extlst" xmlns:r="http://schemas.openxmlformats.org/officeDocument/2006/relationships" xmlns:m="http://schemas.openxmlformats.org/officeDocument/2006/math" xmlns:v="urn:schemas-microsoft-com:vml" xmlns:wp14="http://schemas.microsoft.com/office/word/2010/wordprocessingDrawing" xmlns:wp="http://schemas.openxmlformats.org/drawingml/2006/wordprocessingDrawing" xmlns:w10="urn:schemas-microsoft-com:office:word" xmlns:w="http://schemas.openxmlformats.org/wordprocessingml/2006/main" xmlns:w14="http://schemas.microsoft.com/office/word/2010/wordml" xmlns:w15="http://schemas.microsoft.com/office/word/2012/wordml" xmlns:w16cex="http://schemas.microsoft.com/office/word/2018/wordml/cex" xmlns:w16cid="http://schemas.microsoft.com/office/word/2016/wordml/cid" xmlns:w16="http://schemas.microsoft.com/office/word/2018/wordml" xmlns:w16du="http://schemas.microsoft.com/office/word/2023/wordml/word16du" xmlns:w16sdtdh="http://schemas.microsoft.com/office/word/2020/wordml/sdtdatahash" xmlns:w16sdtfl="http://schemas.microsoft.com/office/word/2024/wordml/sdtformatlock" xmlns:w16se="http://schemas.microsoft.com/office/word/2015/wordml/symex" xmlns:wpg="http://schemas.microsoft.com/office/word/2010/wordprocessingGroup" xmlns:wpi="http://schemas.microsoft.com/office/word/2010/wordprocessingInk" xmlns:wne="http://schemas.microsoft.com/office/word/2006/wordml" xmlns:wps="http://schemas.microsoft.com/office/word/2010/wordprocessingShape" mc:Ignorable="w14 w15 w16se w16cid w16 w16cex w16sdtdh w16sdtfl w16du wp14">
   <w:endnote w:type="separator" w:id="-1">
     <w:p>
       <w:r>
@@ -2626,7 +3695,7 @@
 </file>
 
 <file path=word/footer1.xml><?xml version="1.0" encoding="utf-8"?>
-<w:ftr xmlns:wpc="http://schemas.microsoft.com/office/word/2010/wordprocessingCanvas" xmlns:cx="http://schemas.microsoft.com/office/drawing/2014/chartex" xmlns:cx1="http://schemas.microsoft.com/office/drawing/2015/9/8/chartex" xmlns:cx2="http://schemas.microsoft.com/office/drawing/2015/10/21/chartex" xmlns:cx3="http://schemas.microsoft.com/office/drawing/2016/5/9/chartex" xmlns:cx4="http://schemas.microsoft.com/office/drawing/2016/5/10/chartex" xmlns:cx5="http://schemas.microsoft.com/office/drawing/2016/5/11/chartex" xmlns:cx6="http://schemas.microsoft.com/office/drawing/2016/5/12/chartex" xmlns:cx7="http://schemas.microsoft.com/office/drawing/2016/5/13/chartex" xmlns:cx8="http://schemas.microsoft.com/office/drawing/2016/5/14/chartex" xmlns:mc="http://schemas.openxmlformats.org/markup-compatibility/2006" xmlns:aink="http://schemas.microsoft.com/office/drawing/2016/ink" xmlns:am3d="http://schemas.microsoft.com/office/drawing/2017/model3d" xmlns:o="urn:schemas-microsoft-com:office:office" xmlns:oel="http://schemas.microsoft.com/office/2019/extlst" xmlns:r="http://schemas.openxmlformats.org/officeDocument/2006/relationships" xmlns:m="http://schemas.openxmlformats.org/officeDocument/2006/math" xmlns:v="urn:schemas-microsoft-com:vml" xmlns:wp14="http://schemas.microsoft.com/office/word/2010/wordprocessingDrawing" xmlns:wp="http://schemas.openxmlformats.org/drawingml/2006/wordprocessingDrawing" xmlns:w10="urn:schemas-microsoft-com:office:word" xmlns:w="http://schemas.openxmlformats.org/wordprocessingml/2006/main" xmlns:w14="http://schemas.microsoft.com/office/word/2010/wordml" xmlns:w15="http://schemas.microsoft.com/office/word/2012/wordml" xmlns:w16cex="http://schemas.microsoft.com/office/word/2018/wordml/cex" xmlns:w16cid="http://schemas.microsoft.com/office/word/2016/wordml/cid" xmlns:w16="http://schemas.microsoft.com/office/word/2018/wordml" xmlns:w16du="http://schemas.microsoft.com/office/word/2023/wordml/word16du" xmlns:w16sdtdh="http://schemas.microsoft.com/office/word/2020/wordml/sdtdatahash" xmlns:w16se="http://schemas.microsoft.com/office/word/2015/wordml/symex" xmlns:wpg="http://schemas.microsoft.com/office/word/2010/wordprocessingGroup" xmlns:wpi="http://schemas.microsoft.com/office/word/2010/wordprocessingInk" xmlns:wne="http://schemas.microsoft.com/office/word/2006/wordml" xmlns:wps="http://schemas.microsoft.com/office/word/2010/wordprocessingShape" mc:Ignorable="w14 w15 w16se w16cid w16 w16cex w16sdtdh w16du wp14">
+<w:ftr xmlns:wpc="http://schemas.microsoft.com/office/word/2010/wordprocessingCanvas" xmlns:cx="http://schemas.microsoft.com/office/drawing/2014/chartex" xmlns:cx1="http://schemas.microsoft.com/office/drawing/2015/9/8/chartex" xmlns:cx2="http://schemas.microsoft.com/office/drawing/2015/10/21/chartex" xmlns:cx3="http://schemas.microsoft.com/office/drawing/2016/5/9/chartex" xmlns:cx4="http://schemas.microsoft.com/office/drawing/2016/5/10/chartex" xmlns:cx5="http://schemas.microsoft.com/office/drawing/2016/5/11/chartex" xmlns:cx6="http://schemas.microsoft.com/office/drawing/2016/5/12/chartex" xmlns:cx7="http://schemas.microsoft.com/office/drawing/2016/5/13/chartex" xmlns:cx8="http://schemas.microsoft.com/office/drawing/2016/5/14/chartex" xmlns:mc="http://schemas.openxmlformats.org/markup-compatibility/2006" xmlns:aink="http://schemas.microsoft.com/office/drawing/2016/ink" xmlns:am3d="http://schemas.microsoft.com/office/drawing/2017/model3d" xmlns:o="urn:schemas-microsoft-com:office:office" xmlns:oel="http://schemas.microsoft.com/office/2019/extlst" xmlns:r="http://schemas.openxmlformats.org/officeDocument/2006/relationships" xmlns:m="http://schemas.openxmlformats.org/officeDocument/2006/math" xmlns:v="urn:schemas-microsoft-com:vml" xmlns:wp14="http://schemas.microsoft.com/office/word/2010/wordprocessingDrawing" xmlns:wp="http://schemas.openxmlformats.org/drawingml/2006/wordprocessingDrawing" xmlns:w10="urn:schemas-microsoft-com:office:word" xmlns:w="http://schemas.openxmlformats.org/wordprocessingml/2006/main" xmlns:w14="http://schemas.microsoft.com/office/word/2010/wordml" xmlns:w15="http://schemas.microsoft.com/office/word/2012/wordml" xmlns:w16cex="http://schemas.microsoft.com/office/word/2018/wordml/cex" xmlns:w16cid="http://schemas.microsoft.com/office/word/2016/wordml/cid" xmlns:w16="http://schemas.microsoft.com/office/word/2018/wordml" xmlns:w16du="http://schemas.microsoft.com/office/word/2023/wordml/word16du" xmlns:w16sdtdh="http://schemas.microsoft.com/office/word/2020/wordml/sdtdatahash" xmlns:w16sdtfl="http://schemas.microsoft.com/office/word/2024/wordml/sdtformatlock" xmlns:w16se="http://schemas.microsoft.com/office/word/2015/wordml/symex" xmlns:wpg="http://schemas.microsoft.com/office/word/2010/wordprocessingGroup" xmlns:wpi="http://schemas.microsoft.com/office/word/2010/wordprocessingInk" xmlns:wne="http://schemas.microsoft.com/office/word/2006/wordml" xmlns:wps="http://schemas.microsoft.com/office/word/2010/wordprocessingShape" mc:Ignorable="w14 w15 w16se w16cid w16 w16cex w16sdtdh w16sdtfl w16du wp14">
   <w:p>
     <w:pPr>
       <w:tabs>
@@ -2639,13 +3708,23 @@
         <w:szCs w:val="16"/>
       </w:rPr>
     </w:pPr>
+    <w:proofErr w:type="gramStart"/>
     <w:r>
       <w:rPr>
         <w:rStyle w:val="PlatzhalterZchn"/>
         <w:sz w:val="16"/>
         <w:szCs w:val="16"/>
       </w:rPr>
-      <w:t>{{ LEITBEHOERDE_NAME }}</w:t>
+      <w:t>{{ LEITBEHOERDE</w:t>
+    </w:r>
+    <w:proofErr w:type="gramEnd"/>
+    <w:r>
+      <w:rPr>
+        <w:rStyle w:val="PlatzhalterZchn"/>
+        <w:sz w:val="16"/>
+        <w:szCs w:val="16"/>
+      </w:rPr>
+      <w:t>_NAME }}</w:t>
     </w:r>
     <w:r>
       <w:rPr>
@@ -2819,7 +3898,7 @@
 </file>
 
 <file path=word/footer2.xml><?xml version="1.0" encoding="utf-8"?>
-<w:ftr xmlns:wpc="http://schemas.microsoft.com/office/word/2010/wordprocessingCanvas" xmlns:cx="http://schemas.microsoft.com/office/drawing/2014/chartex" xmlns:cx1="http://schemas.microsoft.com/office/drawing/2015/9/8/chartex" xmlns:cx2="http://schemas.microsoft.com/office/drawing/2015/10/21/chartex" xmlns:cx3="http://schemas.microsoft.com/office/drawing/2016/5/9/chartex" xmlns:cx4="http://schemas.microsoft.com/office/drawing/2016/5/10/chartex" xmlns:cx5="http://schemas.microsoft.com/office/drawing/2016/5/11/chartex" xmlns:cx6="http://schemas.microsoft.com/office/drawing/2016/5/12/chartex" xmlns:cx7="http://schemas.microsoft.com/office/drawing/2016/5/13/chartex" xmlns:cx8="http://schemas.microsoft.com/office/drawing/2016/5/14/chartex" xmlns:mc="http://schemas.openxmlformats.org/markup-compatibility/2006" xmlns:aink="http://schemas.microsoft.com/office/drawing/2016/ink" xmlns:am3d="http://schemas.microsoft.com/office/drawing/2017/model3d" xmlns:o="urn:schemas-microsoft-com:office:office" xmlns:oel="http://schemas.microsoft.com/office/2019/extlst" xmlns:r="http://schemas.openxmlformats.org/officeDocument/2006/relationships" xmlns:m="http://schemas.openxmlformats.org/officeDocument/2006/math" xmlns:v="urn:schemas-microsoft-com:vml" xmlns:wp14="http://schemas.microsoft.com/office/word/2010/wordprocessingDrawing" xmlns:wp="http://schemas.openxmlformats.org/drawingml/2006/wordprocessingDrawing" xmlns:w10="urn:schemas-microsoft-com:office:word" xmlns:w="http://schemas.openxmlformats.org/wordprocessingml/2006/main" xmlns:w14="http://schemas.microsoft.com/office/word/2010/wordml" xmlns:w15="http://schemas.microsoft.com/office/word/2012/wordml" xmlns:w16cex="http://schemas.microsoft.com/office/word/2018/wordml/cex" xmlns:w16cid="http://schemas.microsoft.com/office/word/2016/wordml/cid" xmlns:w16="http://schemas.microsoft.com/office/word/2018/wordml" xmlns:w16du="http://schemas.microsoft.com/office/word/2023/wordml/word16du" xmlns:w16sdtdh="http://schemas.microsoft.com/office/word/2020/wordml/sdtdatahash" xmlns:w16se="http://schemas.microsoft.com/office/word/2015/wordml/symex" xmlns:wpg="http://schemas.microsoft.com/office/word/2010/wordprocessingGroup" xmlns:wpi="http://schemas.microsoft.com/office/word/2010/wordprocessingInk" xmlns:wne="http://schemas.microsoft.com/office/word/2006/wordml" xmlns:wps="http://schemas.microsoft.com/office/word/2010/wordprocessingShape" mc:Ignorable="w14 w15 w16se w16cid w16 w16cex w16sdtdh w16du wp14">
+<w:ftr xmlns:wpc="http://schemas.microsoft.com/office/word/2010/wordprocessingCanvas" xmlns:cx="http://schemas.microsoft.com/office/drawing/2014/chartex" xmlns:cx1="http://schemas.microsoft.com/office/drawing/2015/9/8/chartex" xmlns:cx2="http://schemas.microsoft.com/office/drawing/2015/10/21/chartex" xmlns:cx3="http://schemas.microsoft.com/office/drawing/2016/5/9/chartex" xmlns:cx4="http://schemas.microsoft.com/office/drawing/2016/5/10/chartex" xmlns:cx5="http://schemas.microsoft.com/office/drawing/2016/5/11/chartex" xmlns:cx6="http://schemas.microsoft.com/office/drawing/2016/5/12/chartex" xmlns:cx7="http://schemas.microsoft.com/office/drawing/2016/5/13/chartex" xmlns:cx8="http://schemas.microsoft.com/office/drawing/2016/5/14/chartex" xmlns:mc="http://schemas.openxmlformats.org/markup-compatibility/2006" xmlns:aink="http://schemas.microsoft.com/office/drawing/2016/ink" xmlns:am3d="http://schemas.microsoft.com/office/drawing/2017/model3d" xmlns:o="urn:schemas-microsoft-com:office:office" xmlns:oel="http://schemas.microsoft.com/office/2019/extlst" xmlns:r="http://schemas.openxmlformats.org/officeDocument/2006/relationships" xmlns:m="http://schemas.openxmlformats.org/officeDocument/2006/math" xmlns:v="urn:schemas-microsoft-com:vml" xmlns:wp14="http://schemas.microsoft.com/office/word/2010/wordprocessingDrawing" xmlns:wp="http://schemas.openxmlformats.org/drawingml/2006/wordprocessingDrawing" xmlns:w10="urn:schemas-microsoft-com:office:word" xmlns:w="http://schemas.openxmlformats.org/wordprocessingml/2006/main" xmlns:w14="http://schemas.microsoft.com/office/word/2010/wordml" xmlns:w15="http://schemas.microsoft.com/office/word/2012/wordml" xmlns:w16cex="http://schemas.microsoft.com/office/word/2018/wordml/cex" xmlns:w16cid="http://schemas.microsoft.com/office/word/2016/wordml/cid" xmlns:w16="http://schemas.microsoft.com/office/word/2018/wordml" xmlns:w16du="http://schemas.microsoft.com/office/word/2023/wordml/word16du" xmlns:w16sdtdh="http://schemas.microsoft.com/office/word/2020/wordml/sdtdatahash" xmlns:w16sdtfl="http://schemas.microsoft.com/office/word/2024/wordml/sdtformatlock" xmlns:w16se="http://schemas.microsoft.com/office/word/2015/wordml/symex" xmlns:wpg="http://schemas.microsoft.com/office/word/2010/wordprocessingGroup" xmlns:wpi="http://schemas.microsoft.com/office/word/2010/wordprocessingInk" xmlns:wne="http://schemas.microsoft.com/office/word/2006/wordml" xmlns:wps="http://schemas.microsoft.com/office/word/2010/wordprocessingShape" mc:Ignorable="w14 w15 w16se w16cid w16 w16cex w16sdtdh w16sdtfl w16du wp14">
   <w:p>
     <w:pPr>
       <w:tabs>
@@ -2831,13 +3910,23 @@
         <w:szCs w:val="16"/>
       </w:rPr>
     </w:pPr>
+    <w:proofErr w:type="gramStart"/>
     <w:r>
       <w:rPr>
         <w:rStyle w:val="PlatzhalterZchn"/>
         <w:sz w:val="16"/>
         <w:szCs w:val="16"/>
       </w:rPr>
-      <w:t>{{ LEITBEHOERDE_NAME }}</w:t>
+      <w:t>{{ LEITBEHOERDE</w:t>
+    </w:r>
+    <w:proofErr w:type="gramEnd"/>
+    <w:r>
+      <w:rPr>
+        <w:rStyle w:val="PlatzhalterZchn"/>
+        <w:sz w:val="16"/>
+        <w:szCs w:val="16"/>
+      </w:rPr>
+      <w:t>_NAME }}</w:t>
     </w:r>
     <w:r>
       <w:rPr>
@@ -3012,7 +4101,7 @@
 </file>
 
 <file path=word/footnotes.xml><?xml version="1.0" encoding="utf-8"?>
-<w:footnotes xmlns:wpc="http://schemas.microsoft.com/office/word/2010/wordprocessingCanvas" xmlns:cx="http://schemas.microsoft.com/office/drawing/2014/chartex" xmlns:cx1="http://schemas.microsoft.com/office/drawing/2015/9/8/chartex" xmlns:cx2="http://schemas.microsoft.com/office/drawing/2015/10/21/chartex" xmlns:cx3="http://schemas.microsoft.com/office/drawing/2016/5/9/chartex" xmlns:cx4="http://schemas.microsoft.com/office/drawing/2016/5/10/chartex" xmlns:cx5="http://schemas.microsoft.com/office/drawing/2016/5/11/chartex" xmlns:cx6="http://schemas.microsoft.com/office/drawing/2016/5/12/chartex" xmlns:cx7="http://schemas.microsoft.com/office/drawing/2016/5/13/chartex" xmlns:cx8="http://schemas.microsoft.com/office/drawing/2016/5/14/chartex" xmlns:mc="http://schemas.openxmlformats.org/markup-compatibility/2006" xmlns:aink="http://schemas.microsoft.com/office/drawing/2016/ink" xmlns:am3d="http://schemas.microsoft.com/office/drawing/2017/model3d" xmlns:o="urn:schemas-microsoft-com:office:office" xmlns:oel="http://schemas.microsoft.com/office/2019/extlst" xmlns:r="http://schemas.openxmlformats.org/officeDocument/2006/relationships" xmlns:m="http://schemas.openxmlformats.org/officeDocument/2006/math" xmlns:v="urn:schemas-microsoft-com:vml" xmlns:wp14="http://schemas.microsoft.com/office/word/2010/wordprocessingDrawing" xmlns:wp="http://schemas.openxmlformats.org/drawingml/2006/wordprocessingDrawing" xmlns:w10="urn:schemas-microsoft-com:office:word" xmlns:w="http://schemas.openxmlformats.org/wordprocessingml/2006/main" xmlns:w14="http://schemas.microsoft.com/office/word/2010/wordml" xmlns:w15="http://schemas.microsoft.com/office/word/2012/wordml" xmlns:w16cex="http://schemas.microsoft.com/office/word/2018/wordml/cex" xmlns:w16cid="http://schemas.microsoft.com/office/word/2016/wordml/cid" xmlns:w16="http://schemas.microsoft.com/office/word/2018/wordml" xmlns:w16du="http://schemas.microsoft.com/office/word/2023/wordml/word16du" xmlns:w16sdtdh="http://schemas.microsoft.com/office/word/2020/wordml/sdtdatahash" xmlns:w16se="http://schemas.microsoft.com/office/word/2015/wordml/symex" xmlns:wpg="http://schemas.microsoft.com/office/word/2010/wordprocessingGroup" xmlns:wpi="http://schemas.microsoft.com/office/word/2010/wordprocessingInk" xmlns:wne="http://schemas.microsoft.com/office/word/2006/wordml" xmlns:wps="http://schemas.microsoft.com/office/word/2010/wordprocessingShape" mc:Ignorable="w14 w15 w16se w16cid w16 w16cex w16sdtdh w16du wp14">
+<w:footnotes xmlns:wpc="http://schemas.microsoft.com/office/word/2010/wordprocessingCanvas" xmlns:cx="http://schemas.microsoft.com/office/drawing/2014/chartex" xmlns:cx1="http://schemas.microsoft.com/office/drawing/2015/9/8/chartex" xmlns:cx2="http://schemas.microsoft.com/office/drawing/2015/10/21/chartex" xmlns:cx3="http://schemas.microsoft.com/office/drawing/2016/5/9/chartex" xmlns:cx4="http://schemas.microsoft.com/office/drawing/2016/5/10/chartex" xmlns:cx5="http://schemas.microsoft.com/office/drawing/2016/5/11/chartex" xmlns:cx6="http://schemas.microsoft.com/office/drawing/2016/5/12/chartex" xmlns:cx7="http://schemas.microsoft.com/office/drawing/2016/5/13/chartex" xmlns:cx8="http://schemas.microsoft.com/office/drawing/2016/5/14/chartex" xmlns:mc="http://schemas.openxmlformats.org/markup-compatibility/2006" xmlns:aink="http://schemas.microsoft.com/office/drawing/2016/ink" xmlns:am3d="http://schemas.microsoft.com/office/drawing/2017/model3d" xmlns:o="urn:schemas-microsoft-com:office:office" xmlns:oel="http://schemas.microsoft.com/office/2019/extlst" xmlns:r="http://schemas.openxmlformats.org/officeDocument/2006/relationships" xmlns:m="http://schemas.openxmlformats.org/officeDocument/2006/math" xmlns:v="urn:schemas-microsoft-com:vml" xmlns:wp14="http://schemas.microsoft.com/office/word/2010/wordprocessingDrawing" xmlns:wp="http://schemas.openxmlformats.org/drawingml/2006/wordprocessingDrawing" xmlns:w10="urn:schemas-microsoft-com:office:word" xmlns:w="http://schemas.openxmlformats.org/wordprocessingml/2006/main" xmlns:w14="http://schemas.microsoft.com/office/word/2010/wordml" xmlns:w15="http://schemas.microsoft.com/office/word/2012/wordml" xmlns:w16cex="http://schemas.microsoft.com/office/word/2018/wordml/cex" xmlns:w16cid="http://schemas.microsoft.com/office/word/2016/wordml/cid" xmlns:w16="http://schemas.microsoft.com/office/word/2018/wordml" xmlns:w16du="http://schemas.microsoft.com/office/word/2023/wordml/word16du" xmlns:w16sdtdh="http://schemas.microsoft.com/office/word/2020/wordml/sdtdatahash" xmlns:w16sdtfl="http://schemas.microsoft.com/office/word/2024/wordml/sdtformatlock" xmlns:w16se="http://schemas.microsoft.com/office/word/2015/wordml/symex" xmlns:wpg="http://schemas.microsoft.com/office/word/2010/wordprocessingGroup" xmlns:wpi="http://schemas.microsoft.com/office/word/2010/wordprocessingInk" xmlns:wne="http://schemas.microsoft.com/office/word/2006/wordml" xmlns:wps="http://schemas.microsoft.com/office/word/2010/wordprocessingShape" mc:Ignorable="w14 w15 w16se w16cid w16 w16cex w16sdtdh w16sdtfl w16du wp14">
   <w:footnote w:type="separator" w:id="-1">
     <w:p>
       <w:r>
@@ -3031,15 +4120,28 @@
 </file>
 
 <file path=word/header1.xml><?xml version="1.0" encoding="utf-8"?>
-<w:hdr xmlns:wpc="http://schemas.microsoft.com/office/word/2010/wordprocessingCanvas" xmlns:cx="http://schemas.microsoft.com/office/drawing/2014/chartex" xmlns:cx1="http://schemas.microsoft.com/office/drawing/2015/9/8/chartex" xmlns:cx2="http://schemas.microsoft.com/office/drawing/2015/10/21/chartex" xmlns:cx3="http://schemas.microsoft.com/office/drawing/2016/5/9/chartex" xmlns:cx4="http://schemas.microsoft.com/office/drawing/2016/5/10/chartex" xmlns:cx5="http://schemas.microsoft.com/office/drawing/2016/5/11/chartex" xmlns:cx6="http://schemas.microsoft.com/office/drawing/2016/5/12/chartex" xmlns:cx7="http://schemas.microsoft.com/office/drawing/2016/5/13/chartex" xmlns:cx8="http://schemas.microsoft.com/office/drawing/2016/5/14/chartex" xmlns:mc="http://schemas.openxmlformats.org/markup-compatibility/2006" xmlns:aink="http://schemas.microsoft.com/office/drawing/2016/ink" xmlns:am3d="http://schemas.microsoft.com/office/drawing/2017/model3d" xmlns:o="urn:schemas-microsoft-com:office:office" xmlns:oel="http://schemas.microsoft.com/office/2019/extlst" xmlns:r="http://schemas.openxmlformats.org/officeDocument/2006/relationships" xmlns:m="http://schemas.openxmlformats.org/officeDocument/2006/math" xmlns:v="urn:schemas-microsoft-com:vml" xmlns:wp14="http://schemas.microsoft.com/office/word/2010/wordprocessingDrawing" xmlns:wp="http://schemas.openxmlformats.org/drawingml/2006/wordprocessingDrawing" xmlns:w10="urn:schemas-microsoft-com:office:word" xmlns:w="http://schemas.openxmlformats.org/wordprocessingml/2006/main" xmlns:w14="http://schemas.microsoft.com/office/word/2010/wordml" xmlns:w15="http://schemas.microsoft.com/office/word/2012/wordml" xmlns:w16cex="http://schemas.microsoft.com/office/word/2018/wordml/cex" xmlns:w16cid="http://schemas.microsoft.com/office/word/2016/wordml/cid" xmlns:w16="http://schemas.microsoft.com/office/word/2018/wordml" xmlns:w16du="http://schemas.microsoft.com/office/word/2023/wordml/word16du" xmlns:w16sdtdh="http://schemas.microsoft.com/office/word/2020/wordml/sdtdatahash" xmlns:w16se="http://schemas.microsoft.com/office/word/2015/wordml/symex" xmlns:wpg="http://schemas.microsoft.com/office/word/2010/wordprocessingGroup" xmlns:wpi="http://schemas.microsoft.com/office/word/2010/wordprocessingInk" xmlns:wne="http://schemas.microsoft.com/office/word/2006/wordml" xmlns:wps="http://schemas.microsoft.com/office/word/2010/wordprocessingShape" mc:Ignorable="w14 w15 w16se w16cid w16 w16cex w16sdtdh w16du wp14">
+<w:hdr xmlns:wpc="http://schemas.microsoft.com/office/word/2010/wordprocessingCanvas" xmlns:cx="http://schemas.microsoft.com/office/drawing/2014/chartex" xmlns:cx1="http://schemas.microsoft.com/office/drawing/2015/9/8/chartex" xmlns:cx2="http://schemas.microsoft.com/office/drawing/2015/10/21/chartex" xmlns:cx3="http://schemas.microsoft.com/office/drawing/2016/5/9/chartex" xmlns:cx4="http://schemas.microsoft.com/office/drawing/2016/5/10/chartex" xmlns:cx5="http://schemas.microsoft.com/office/drawing/2016/5/11/chartex" xmlns:cx6="http://schemas.microsoft.com/office/drawing/2016/5/12/chartex" xmlns:cx7="http://schemas.microsoft.com/office/drawing/2016/5/13/chartex" xmlns:cx8="http://schemas.microsoft.com/office/drawing/2016/5/14/chartex" xmlns:mc="http://schemas.openxmlformats.org/markup-compatibility/2006" xmlns:aink="http://schemas.microsoft.com/office/drawing/2016/ink" xmlns:am3d="http://schemas.microsoft.com/office/drawing/2017/model3d" xmlns:o="urn:schemas-microsoft-com:office:office" xmlns:oel="http://schemas.microsoft.com/office/2019/extlst" xmlns:r="http://schemas.openxmlformats.org/officeDocument/2006/relationships" xmlns:m="http://schemas.openxmlformats.org/officeDocument/2006/math" xmlns:v="urn:schemas-microsoft-com:vml" xmlns:wp14="http://schemas.microsoft.com/office/word/2010/wordprocessingDrawing" xmlns:wp="http://schemas.openxmlformats.org/drawingml/2006/wordprocessingDrawing" xmlns:w10="urn:schemas-microsoft-com:office:word" xmlns:w="http://schemas.openxmlformats.org/wordprocessingml/2006/main" xmlns:w14="http://schemas.microsoft.com/office/word/2010/wordml" xmlns:w15="http://schemas.microsoft.com/office/word/2012/wordml" xmlns:w16cex="http://schemas.microsoft.com/office/word/2018/wordml/cex" xmlns:w16cid="http://schemas.microsoft.com/office/word/2016/wordml/cid" xmlns:w16="http://schemas.microsoft.com/office/word/2018/wordml" xmlns:w16du="http://schemas.microsoft.com/office/word/2023/wordml/word16du" xmlns:w16sdtdh="http://schemas.microsoft.com/office/word/2020/wordml/sdtdatahash" xmlns:w16sdtfl="http://schemas.microsoft.com/office/word/2024/wordml/sdtformatlock" xmlns:w16se="http://schemas.microsoft.com/office/word/2015/wordml/symex" xmlns:wpg="http://schemas.microsoft.com/office/word/2010/wordprocessingGroup" xmlns:wpi="http://schemas.microsoft.com/office/word/2010/wordprocessingInk" xmlns:wne="http://schemas.microsoft.com/office/word/2006/wordml" xmlns:wps="http://schemas.microsoft.com/office/word/2010/wordprocessingShape" mc:Ignorable="w14 w15 w16se w16cid w16 w16cex w16sdtdh w16sdtfl w16du wp14">
   <w:p>
     <w:pPr>
       <w:pStyle w:val="Platzhalter"/>
       <w:spacing w:before="360" w:after="120"/>
       <w:jc w:val="right"/>
     </w:pPr>
+    <w:proofErr w:type="gramStart"/>
     <w:r>
-      <w:t xml:space="preserve">{{ "GEMEINDE_WAPPEN" |image(None, </w:t>
+      <w:t>{{ "</w:t>
+    </w:r>
+    <w:proofErr w:type="gramEnd"/>
+    <w:r>
+      <w:t>GEMEINDE_WAPPEN" |</w:t>
+    </w:r>
+    <w:proofErr w:type="spellStart"/>
+    <w:r>
+      <w:t>image</w:t>
+    </w:r>
+    <w:proofErr w:type="spellEnd"/>
+    <w:r>
+      <w:t xml:space="preserve">(None, </w:t>
     </w:r>
     <w:r>
       <w:t>None</w:t>
@@ -3052,15 +4154,28 @@
 </file>
 
 <file path=word/header2.xml><?xml version="1.0" encoding="utf-8"?>
-<w:hdr xmlns:wpc="http://schemas.microsoft.com/office/word/2010/wordprocessingCanvas" xmlns:cx="http://schemas.microsoft.com/office/drawing/2014/chartex" xmlns:cx1="http://schemas.microsoft.com/office/drawing/2015/9/8/chartex" xmlns:cx2="http://schemas.microsoft.com/office/drawing/2015/10/21/chartex" xmlns:cx3="http://schemas.microsoft.com/office/drawing/2016/5/9/chartex" xmlns:cx4="http://schemas.microsoft.com/office/drawing/2016/5/10/chartex" xmlns:cx5="http://schemas.microsoft.com/office/drawing/2016/5/11/chartex" xmlns:cx6="http://schemas.microsoft.com/office/drawing/2016/5/12/chartex" xmlns:cx7="http://schemas.microsoft.com/office/drawing/2016/5/13/chartex" xmlns:cx8="http://schemas.microsoft.com/office/drawing/2016/5/14/chartex" xmlns:mc="http://schemas.openxmlformats.org/markup-compatibility/2006" xmlns:aink="http://schemas.microsoft.com/office/drawing/2016/ink" xmlns:am3d="http://schemas.microsoft.com/office/drawing/2017/model3d" xmlns:o="urn:schemas-microsoft-com:office:office" xmlns:oel="http://schemas.microsoft.com/office/2019/extlst" xmlns:r="http://schemas.openxmlformats.org/officeDocument/2006/relationships" xmlns:m="http://schemas.openxmlformats.org/officeDocument/2006/math" xmlns:v="urn:schemas-microsoft-com:vml" xmlns:wp14="http://schemas.microsoft.com/office/word/2010/wordprocessingDrawing" xmlns:wp="http://schemas.openxmlformats.org/drawingml/2006/wordprocessingDrawing" xmlns:w10="urn:schemas-microsoft-com:office:word" xmlns:w="http://schemas.openxmlformats.org/wordprocessingml/2006/main" xmlns:w14="http://schemas.microsoft.com/office/word/2010/wordml" xmlns:w15="http://schemas.microsoft.com/office/word/2012/wordml" xmlns:w16cex="http://schemas.microsoft.com/office/word/2018/wordml/cex" xmlns:w16cid="http://schemas.microsoft.com/office/word/2016/wordml/cid" xmlns:w16="http://schemas.microsoft.com/office/word/2018/wordml" xmlns:w16du="http://schemas.microsoft.com/office/word/2023/wordml/word16du" xmlns:w16sdtdh="http://schemas.microsoft.com/office/word/2020/wordml/sdtdatahash" xmlns:w16se="http://schemas.microsoft.com/office/word/2015/wordml/symex" xmlns:wpg="http://schemas.microsoft.com/office/word/2010/wordprocessingGroup" xmlns:wpi="http://schemas.microsoft.com/office/word/2010/wordprocessingInk" xmlns:wne="http://schemas.microsoft.com/office/word/2006/wordml" xmlns:wps="http://schemas.microsoft.com/office/word/2010/wordprocessingShape" mc:Ignorable="w14 w15 w16se w16cid w16 w16cex w16sdtdh w16du wp14">
+<w:hdr xmlns:wpc="http://schemas.microsoft.com/office/word/2010/wordprocessingCanvas" xmlns:cx="http://schemas.microsoft.com/office/drawing/2014/chartex" xmlns:cx1="http://schemas.microsoft.com/office/drawing/2015/9/8/chartex" xmlns:cx2="http://schemas.microsoft.com/office/drawing/2015/10/21/chartex" xmlns:cx3="http://schemas.microsoft.com/office/drawing/2016/5/9/chartex" xmlns:cx4="http://schemas.microsoft.com/office/drawing/2016/5/10/chartex" xmlns:cx5="http://schemas.microsoft.com/office/drawing/2016/5/11/chartex" xmlns:cx6="http://schemas.microsoft.com/office/drawing/2016/5/12/chartex" xmlns:cx7="http://schemas.microsoft.com/office/drawing/2016/5/13/chartex" xmlns:cx8="http://schemas.microsoft.com/office/drawing/2016/5/14/chartex" xmlns:mc="http://schemas.openxmlformats.org/markup-compatibility/2006" xmlns:aink="http://schemas.microsoft.com/office/drawing/2016/ink" xmlns:am3d="http://schemas.microsoft.com/office/drawing/2017/model3d" xmlns:o="urn:schemas-microsoft-com:office:office" xmlns:oel="http://schemas.microsoft.com/office/2019/extlst" xmlns:r="http://schemas.openxmlformats.org/officeDocument/2006/relationships" xmlns:m="http://schemas.openxmlformats.org/officeDocument/2006/math" xmlns:v="urn:schemas-microsoft-com:vml" xmlns:wp14="http://schemas.microsoft.com/office/word/2010/wordprocessingDrawing" xmlns:wp="http://schemas.openxmlformats.org/drawingml/2006/wordprocessingDrawing" xmlns:w10="urn:schemas-microsoft-com:office:word" xmlns:w="http://schemas.openxmlformats.org/wordprocessingml/2006/main" xmlns:w14="http://schemas.microsoft.com/office/word/2010/wordml" xmlns:w15="http://schemas.microsoft.com/office/word/2012/wordml" xmlns:w16cex="http://schemas.microsoft.com/office/word/2018/wordml/cex" xmlns:w16cid="http://schemas.microsoft.com/office/word/2016/wordml/cid" xmlns:w16="http://schemas.microsoft.com/office/word/2018/wordml" xmlns:w16du="http://schemas.microsoft.com/office/word/2023/wordml/word16du" xmlns:w16sdtdh="http://schemas.microsoft.com/office/word/2020/wordml/sdtdatahash" xmlns:w16sdtfl="http://schemas.microsoft.com/office/word/2024/wordml/sdtformatlock" xmlns:w16se="http://schemas.microsoft.com/office/word/2015/wordml/symex" xmlns:wpg="http://schemas.microsoft.com/office/word/2010/wordprocessingGroup" xmlns:wpi="http://schemas.microsoft.com/office/word/2010/wordprocessingInk" xmlns:wne="http://schemas.microsoft.com/office/word/2006/wordml" xmlns:wps="http://schemas.microsoft.com/office/word/2010/wordprocessingShape" mc:Ignorable="w14 w15 w16se w16cid w16 w16cex w16sdtdh w16sdtfl w16du wp14">
   <w:p>
     <w:pPr>
       <w:pStyle w:val="Platzhalter"/>
       <w:spacing w:before="360" w:after="120"/>
       <w:jc w:val="right"/>
     </w:pPr>
+    <w:proofErr w:type="gramStart"/>
     <w:r>
-      <w:t xml:space="preserve">{{ "GEMEINDE_WAPPEN" |image(None, </w:t>
+      <w:t>{{ "</w:t>
+    </w:r>
+    <w:proofErr w:type="gramEnd"/>
+    <w:r>
+      <w:t>GEMEINDE_WAPPEN" |</w:t>
+    </w:r>
+    <w:proofErr w:type="spellStart"/>
+    <w:r>
+      <w:t>image</w:t>
+    </w:r>
+    <w:proofErr w:type="spellEnd"/>
+    <w:r>
+      <w:t xml:space="preserve">(None, </w:t>
     </w:r>
     <w:r>
       <w:t>7</w:t>
@@ -3073,7 +4188,7 @@
 </file>
 
 <file path=word/numbering.xml><?xml version="1.0" encoding="utf-8"?>
-<w:numbering xmlns:wpc="http://schemas.microsoft.com/office/word/2010/wordprocessingCanvas" xmlns:cx="http://schemas.microsoft.com/office/drawing/2014/chartex" xmlns:cx1="http://schemas.microsoft.com/office/drawing/2015/9/8/chartex" xmlns:cx2="http://schemas.microsoft.com/office/drawing/2015/10/21/chartex" xmlns:cx3="http://schemas.microsoft.com/office/drawing/2016/5/9/chartex" xmlns:cx4="http://schemas.microsoft.com/office/drawing/2016/5/10/chartex" xmlns:cx5="http://schemas.microsoft.com/office/drawing/2016/5/11/chartex" xmlns:cx6="http://schemas.microsoft.com/office/drawing/2016/5/12/chartex" xmlns:cx7="http://schemas.microsoft.com/office/drawing/2016/5/13/chartex" xmlns:cx8="http://schemas.microsoft.com/office/drawing/2016/5/14/chartex" xmlns:mc="http://schemas.openxmlformats.org/markup-compatibility/2006" xmlns:aink="http://schemas.microsoft.com/office/drawing/2016/ink" xmlns:am3d="http://schemas.microsoft.com/office/drawing/2017/model3d" xmlns:o="urn:schemas-microsoft-com:office:office" xmlns:oel="http://schemas.microsoft.com/office/2019/extlst" xmlns:r="http://schemas.openxmlformats.org/officeDocument/2006/relationships" xmlns:m="http://schemas.openxmlformats.org/officeDocument/2006/math" xmlns:v="urn:schemas-microsoft-com:vml" xmlns:wp14="http://schemas.microsoft.com/office/word/2010/wordprocessingDrawing" xmlns:wp="http://schemas.openxmlformats.org/drawingml/2006/wordprocessingDrawing" xmlns:w10="urn:schemas-microsoft-com:office:word" xmlns:w="http://schemas.openxmlformats.org/wordprocessingml/2006/main" xmlns:w14="http://schemas.microsoft.com/office/word/2010/wordml" xmlns:w15="http://schemas.microsoft.com/office/word/2012/wordml" xmlns:w16cex="http://schemas.microsoft.com/office/word/2018/wordml/cex" xmlns:w16cid="http://schemas.microsoft.com/office/word/2016/wordml/cid" xmlns:w16="http://schemas.microsoft.com/office/word/2018/wordml" xmlns:w16du="http://schemas.microsoft.com/office/word/2023/wordml/word16du" xmlns:w16sdtdh="http://schemas.microsoft.com/office/word/2020/wordml/sdtdatahash" xmlns:w16se="http://schemas.microsoft.com/office/word/2015/wordml/symex" xmlns:wpg="http://schemas.microsoft.com/office/word/2010/wordprocessingGroup" xmlns:wpi="http://schemas.microsoft.com/office/word/2010/wordprocessingInk" xmlns:wne="http://schemas.microsoft.com/office/word/2006/wordml" xmlns:wps="http://schemas.microsoft.com/office/word/2010/wordprocessingShape" mc:Ignorable="w14 w15 w16se w16cid w16 w16cex w16sdtdh w16du wp14">
+<w:numbering xmlns:wpc="http://schemas.microsoft.com/office/word/2010/wordprocessingCanvas" xmlns:cx="http://schemas.microsoft.com/office/drawing/2014/chartex" xmlns:cx1="http://schemas.microsoft.com/office/drawing/2015/9/8/chartex" xmlns:cx2="http://schemas.microsoft.com/office/drawing/2015/10/21/chartex" xmlns:cx3="http://schemas.microsoft.com/office/drawing/2016/5/9/chartex" xmlns:cx4="http://schemas.microsoft.com/office/drawing/2016/5/10/chartex" xmlns:cx5="http://schemas.microsoft.com/office/drawing/2016/5/11/chartex" xmlns:cx6="http://schemas.microsoft.com/office/drawing/2016/5/12/chartex" xmlns:cx7="http://schemas.microsoft.com/office/drawing/2016/5/13/chartex" xmlns:cx8="http://schemas.microsoft.com/office/drawing/2016/5/14/chartex" xmlns:mc="http://schemas.openxmlformats.org/markup-compatibility/2006" xmlns:aink="http://schemas.microsoft.com/office/drawing/2016/ink" xmlns:am3d="http://schemas.microsoft.com/office/drawing/2017/model3d" xmlns:o="urn:schemas-microsoft-com:office:office" xmlns:oel="http://schemas.microsoft.com/office/2019/extlst" xmlns:r="http://schemas.openxmlformats.org/officeDocument/2006/relationships" xmlns:m="http://schemas.openxmlformats.org/officeDocument/2006/math" xmlns:v="urn:schemas-microsoft-com:vml" xmlns:wp14="http://schemas.microsoft.com/office/word/2010/wordprocessingDrawing" xmlns:wp="http://schemas.openxmlformats.org/drawingml/2006/wordprocessingDrawing" xmlns:w10="urn:schemas-microsoft-com:office:word" xmlns:w="http://schemas.openxmlformats.org/wordprocessingml/2006/main" xmlns:w14="http://schemas.microsoft.com/office/word/2010/wordml" xmlns:w15="http://schemas.microsoft.com/office/word/2012/wordml" xmlns:w16cex="http://schemas.microsoft.com/office/word/2018/wordml/cex" xmlns:w16cid="http://schemas.microsoft.com/office/word/2016/wordml/cid" xmlns:w16="http://schemas.microsoft.com/office/word/2018/wordml" xmlns:w16du="http://schemas.microsoft.com/office/word/2023/wordml/word16du" xmlns:w16sdtdh="http://schemas.microsoft.com/office/word/2020/wordml/sdtdatahash" xmlns:w16sdtfl="http://schemas.microsoft.com/office/word/2024/wordml/sdtformatlock" xmlns:w16se="http://schemas.microsoft.com/office/word/2015/wordml/symex" xmlns:wpg="http://schemas.microsoft.com/office/word/2010/wordprocessingGroup" xmlns:wpi="http://schemas.microsoft.com/office/word/2010/wordprocessingInk" xmlns:wne="http://schemas.microsoft.com/office/word/2006/wordml" xmlns:wps="http://schemas.microsoft.com/office/word/2010/wordprocessingShape" mc:Ignorable="w14 w15 w16se w16cid w16 w16cex w16sdtdh w16sdtfl w16du wp14">
   <w:abstractNum w:abstractNumId="0" w15:restartNumberingAfterBreak="0">
     <w:nsid w:val="05455E45"/>
     <w:multiLevelType w:val="multilevel"/>
@@ -5420,7 +6535,7 @@
 </file>
 
 <file path=word/styles.xml><?xml version="1.0" encoding="utf-8"?>
-<w:styles xmlns:mc="http://schemas.openxmlformats.org/markup-compatibility/2006" xmlns:r="http://schemas.openxmlformats.org/officeDocument/2006/relationships" xmlns:w="http://schemas.openxmlformats.org/wordprocessingml/2006/main" xmlns:w14="http://schemas.microsoft.com/office/word/2010/wordml" xmlns:w15="http://schemas.microsoft.com/office/word/2012/wordml" xmlns:w16cex="http://schemas.microsoft.com/office/word/2018/wordml/cex" xmlns:w16cid="http://schemas.microsoft.com/office/word/2016/wordml/cid" xmlns:w16="http://schemas.microsoft.com/office/word/2018/wordml" xmlns:w16du="http://schemas.microsoft.com/office/word/2023/wordml/word16du" xmlns:w16sdtdh="http://schemas.microsoft.com/office/word/2020/wordml/sdtdatahash" xmlns:w16se="http://schemas.microsoft.com/office/word/2015/wordml/symex" mc:Ignorable="w14 w15 w16se w16cid w16 w16cex w16sdtdh w16du">
+<w:styles xmlns:mc="http://schemas.openxmlformats.org/markup-compatibility/2006" xmlns:r="http://schemas.openxmlformats.org/officeDocument/2006/relationships" xmlns:w="http://schemas.openxmlformats.org/wordprocessingml/2006/main" xmlns:w14="http://schemas.microsoft.com/office/word/2010/wordml" xmlns:w15="http://schemas.microsoft.com/office/word/2012/wordml" xmlns:w16cex="http://schemas.microsoft.com/office/word/2018/wordml/cex" xmlns:w16cid="http://schemas.microsoft.com/office/word/2016/wordml/cid" xmlns:w16="http://schemas.microsoft.com/office/word/2018/wordml" xmlns:w16du="http://schemas.microsoft.com/office/word/2023/wordml/word16du" xmlns:w16sdtdh="http://schemas.microsoft.com/office/word/2020/wordml/sdtdatahash" xmlns:w16sdtfl="http://schemas.microsoft.com/office/word/2024/wordml/sdtformatlock" xmlns:w16se="http://schemas.microsoft.com/office/word/2015/wordml/symex" mc:Ignorable="w14 w15 w16se w16cid w16 w16cex w16sdtdh w16sdtfl w16du">
   <w:docDefaults>
     <w:rPrDefault>
       <w:rPr>

</xml_diff>

<commit_message>
feat(templates): add update templates for SO
</commit_message>
<xml_diff>
--- a/document-merge-service/kt_so/templatefiles/inserat-amtsblatt.docx
+++ b/document-merge-service/kt_so/templatefiles/inserat-amtsblatt.docx
@@ -5,7 +5,7 @@
     <w:tbl>
       <w:tblPr>
         <w:tblStyle w:val="Tabellenraster"/>
-        <w:tblW w:w="0" w:type="auto"/>
+        <w:tblW w:w="9639" w:type="dxa"/>
         <w:tblBorders>
           <w:top w:val="none" w:sz="0" w:space="0" w:color="auto"/>
           <w:left w:val="none" w:sz="0" w:space="0" w:color="auto"/>
@@ -14,10 +14,15 @@
           <w:insideH w:val="none" w:sz="0" w:space="0" w:color="auto"/>
           <w:insideV w:val="none" w:sz="0" w:space="0" w:color="auto"/>
         </w:tblBorders>
+        <w:tblLayout w:type="fixed"/>
+        <w:tblCellMar>
+          <w:left w:w="0" w:type="dxa"/>
+          <w:right w:w="0" w:type="dxa"/>
+        </w:tblCellMar>
         <w:tblLook w:val="04A0" w:firstRow="1" w:lastRow="0" w:firstColumn="1" w:lastColumn="0" w:noHBand="0" w:noVBand="1"/>
       </w:tblPr>
       <w:tblGrid>
-        <w:gridCol w:w="5376"/>
+        <w:gridCol w:w="5670"/>
         <w:gridCol w:w="3969"/>
       </w:tblGrid>
       <w:tr>
@@ -26,7 +31,7 @@
         </w:trPr>
         <w:tc>
           <w:tcPr>
-            <w:tcW w:w="5376" w:type="dxa"/>
+            <w:tcW w:w="5670" w:type="dxa"/>
             <w:tcMar>
               <w:top w:w="57" w:type="dxa"/>
               <w:bottom w:w="57" w:type="dxa"/>
@@ -123,7 +128,7 @@
         </w:trPr>
         <w:tc>
           <w:tcPr>
-            <w:tcW w:w="5376" w:type="dxa"/>
+            <w:tcW w:w="5670" w:type="dxa"/>
             <w:tcMar>
               <w:top w:w="57" w:type="dxa"/>
               <w:bottom w:w="57" w:type="dxa"/>
@@ -385,7 +390,7 @@
         </w:trPr>
         <w:tc>
           <w:tcPr>
-            <w:tcW w:w="5376" w:type="dxa"/>
+            <w:tcW w:w="5670" w:type="dxa"/>
             <w:tcMar>
               <w:top w:w="57" w:type="dxa"/>
               <w:bottom w:w="57" w:type="dxa"/>
@@ -485,7 +490,7 @@
     <w:tbl>
       <w:tblPr>
         <w:tblStyle w:val="Tabellenraster"/>
-        <w:tblW w:w="0" w:type="auto"/>
+        <w:tblW w:w="9639" w:type="dxa"/>
         <w:tblBorders>
           <w:top w:val="single" w:sz="4" w:space="0" w:color="D9D9D9" w:themeColor="background1" w:themeShade="D9"/>
           <w:left w:val="single" w:sz="4" w:space="0" w:color="D9D9D9" w:themeColor="background1" w:themeShade="D9"/>
@@ -494,6 +499,7 @@
           <w:insideH w:val="single" w:sz="4" w:space="0" w:color="D9D9D9" w:themeColor="background1" w:themeShade="D9"/>
           <w:insideV w:val="single" w:sz="4" w:space="0" w:color="D9D9D9" w:themeColor="background1" w:themeShade="D9"/>
         </w:tblBorders>
+        <w:tblLayout w:type="fixed"/>
         <w:tblCellMar>
           <w:top w:w="57" w:type="dxa"/>
           <w:bottom w:w="57" w:type="dxa"/>
@@ -501,13 +507,13 @@
         <w:tblLook w:val="04A0" w:firstRow="1" w:lastRow="0" w:firstColumn="1" w:lastColumn="0" w:noHBand="0" w:noVBand="1"/>
       </w:tblPr>
       <w:tblGrid>
-        <w:gridCol w:w="3119"/>
-        <w:gridCol w:w="6226"/>
+        <w:gridCol w:w="2835"/>
+        <w:gridCol w:w="6804"/>
       </w:tblGrid>
       <w:tr>
         <w:tc>
           <w:tcPr>
-            <w:tcW w:w="3119" w:type="dxa"/>
+            <w:tcW w:w="2835" w:type="dxa"/>
             <w:tcBorders>
               <w:bottom w:val="single" w:sz="4" w:space="0" w:color="D9D9D9" w:themeColor="background1" w:themeShade="D9"/>
               <w:right w:val="single" w:sz="4" w:space="0" w:color="FFFFFF" w:themeColor="background1"/>
@@ -531,7 +537,7 @@
         </w:tc>
         <w:tc>
           <w:tcPr>
-            <w:tcW w:w="6226" w:type="dxa"/>
+            <w:tcW w:w="6804" w:type="dxa"/>
             <w:tcBorders>
               <w:left w:val="single" w:sz="4" w:space="0" w:color="FFFFFF" w:themeColor="background1"/>
             </w:tcBorders>
@@ -561,6 +567,64 @@
           <w:p>
             <w:pPr>
               <w:pStyle w:val="Platzhalter"/>
+              <w:rPr>
+                <w:rFonts w:ascii="Consolas" w:hAnsi="Consolas"/>
+                <w:color w:val="00B050"/>
+                <w:sz w:val="18"/>
+                <w:szCs w:val="18"/>
+              </w:rPr>
+            </w:pPr>
+            <w:r>
+              <w:rPr>
+                <w:rFonts w:ascii="Consolas" w:hAnsi="Consolas"/>
+                <w:color w:val="00B050"/>
+                <w:sz w:val="18"/>
+                <w:szCs w:val="18"/>
+              </w:rPr>
+              <w:t>{%</w:t>
+            </w:r>
+            <w:r>
+              <w:rPr>
+                <w:rFonts w:ascii="Consolas" w:hAnsi="Consolas"/>
+                <w:color w:val="00B050"/>
+                <w:sz w:val="18"/>
+                <w:szCs w:val="18"/>
+              </w:rPr>
+              <w:t>p</w:t>
+            </w:r>
+            <w:r>
+              <w:rPr>
+                <w:rFonts w:ascii="Consolas" w:hAnsi="Consolas"/>
+                <w:color w:val="00B050"/>
+                <w:sz w:val="18"/>
+                <w:szCs w:val="18"/>
+              </w:rPr>
+              <w:t xml:space="preserve"> </w:t>
+            </w:r>
+            <w:proofErr w:type="spellStart"/>
+            <w:r>
+              <w:rPr>
+                <w:rFonts w:ascii="Consolas" w:hAnsi="Consolas"/>
+                <w:color w:val="00B050"/>
+                <w:sz w:val="18"/>
+                <w:szCs w:val="18"/>
+              </w:rPr>
+              <w:t>if</w:t>
+            </w:r>
+            <w:proofErr w:type="spellEnd"/>
+            <w:r>
+              <w:rPr>
+                <w:rFonts w:ascii="Consolas" w:hAnsi="Consolas"/>
+                <w:color w:val="00B050"/>
+                <w:sz w:val="18"/>
+                <w:szCs w:val="18"/>
+              </w:rPr>
+              <w:t xml:space="preserve"> LEITBEHOERDE_TELEFON %}</w:t>
+            </w:r>
+          </w:p>
+          <w:p>
+            <w:pPr>
+              <w:pStyle w:val="Platzhalter"/>
             </w:pPr>
             <w:proofErr w:type="gramStart"/>
             <w:r>
@@ -568,7 +632,67 @@
             </w:r>
             <w:proofErr w:type="gramEnd"/>
             <w:r>
-              <w:t>_TELEFON }}</w:t>
+              <w:t>_</w:t>
+            </w:r>
+            <w:proofErr w:type="gramStart"/>
+            <w:r>
+              <w:t>TELEFON }</w:t>
+            </w:r>
+            <w:proofErr w:type="gramEnd"/>
+            <w:r>
+              <w:t>}</w:t>
+            </w:r>
+          </w:p>
+          <w:p>
+            <w:pPr>
+              <w:pStyle w:val="Platzhalter"/>
+            </w:pPr>
+            <w:r>
+              <w:rPr>
+                <w:rFonts w:ascii="Consolas" w:hAnsi="Consolas"/>
+                <w:color w:val="00B050"/>
+                <w:sz w:val="18"/>
+                <w:szCs w:val="18"/>
+              </w:rPr>
+              <w:t>{%</w:t>
+            </w:r>
+            <w:r>
+              <w:rPr>
+                <w:rFonts w:ascii="Consolas" w:hAnsi="Consolas"/>
+                <w:color w:val="00B050"/>
+                <w:sz w:val="18"/>
+                <w:szCs w:val="18"/>
+              </w:rPr>
+              <w:t>p</w:t>
+            </w:r>
+            <w:r>
+              <w:rPr>
+                <w:rFonts w:ascii="Consolas" w:hAnsi="Consolas"/>
+                <w:color w:val="00B050"/>
+                <w:sz w:val="18"/>
+                <w:szCs w:val="18"/>
+              </w:rPr>
+              <w:t xml:space="preserve"> </w:t>
+            </w:r>
+            <w:proofErr w:type="spellStart"/>
+            <w:r>
+              <w:rPr>
+                <w:rFonts w:ascii="Consolas" w:hAnsi="Consolas"/>
+                <w:color w:val="00B050"/>
+                <w:sz w:val="18"/>
+                <w:szCs w:val="18"/>
+              </w:rPr>
+              <w:t>endif</w:t>
+            </w:r>
+            <w:proofErr w:type="spellEnd"/>
+            <w:r>
+              <w:rPr>
+                <w:rFonts w:ascii="Consolas" w:hAnsi="Consolas"/>
+                <w:color w:val="00B050"/>
+                <w:sz w:val="18"/>
+                <w:szCs w:val="18"/>
+              </w:rPr>
+              <w:t xml:space="preserve"> %}</w:t>
             </w:r>
           </w:p>
         </w:tc>
@@ -576,7 +700,7 @@
       <w:tr>
         <w:tc>
           <w:tcPr>
-            <w:tcW w:w="3119" w:type="dxa"/>
+            <w:tcW w:w="2835" w:type="dxa"/>
             <w:tcBorders>
               <w:top w:val="single" w:sz="4" w:space="0" w:color="D9D9D9" w:themeColor="background1" w:themeShade="D9"/>
               <w:bottom w:val="single" w:sz="4" w:space="0" w:color="D9D9D9" w:themeColor="background1" w:themeShade="D9"/>
@@ -601,7 +725,7 @@
         </w:tc>
         <w:tc>
           <w:tcPr>
-            <w:tcW w:w="6226" w:type="dxa"/>
+            <w:tcW w:w="6804" w:type="dxa"/>
             <w:tcBorders>
               <w:left w:val="single" w:sz="4" w:space="0" w:color="D9D9D9" w:themeColor="background1" w:themeShade="D9"/>
               <w:bottom w:val="single" w:sz="4" w:space="0" w:color="D9D9D9" w:themeColor="background1" w:themeShade="D9"/>
@@ -626,7 +750,7 @@
       <w:tr>
         <w:tc>
           <w:tcPr>
-            <w:tcW w:w="3119" w:type="dxa"/>
+            <w:tcW w:w="2835" w:type="dxa"/>
             <w:tcBorders>
               <w:top w:val="single" w:sz="4" w:space="0" w:color="D9D9D9" w:themeColor="background1" w:themeShade="D9"/>
               <w:left w:val="single" w:sz="4" w:space="0" w:color="D9D9D9" w:themeColor="background1" w:themeShade="D9"/>
@@ -658,7 +782,7 @@
         </w:tc>
         <w:tc>
           <w:tcPr>
-            <w:tcW w:w="6226" w:type="dxa"/>
+            <w:tcW w:w="6804" w:type="dxa"/>
             <w:tcBorders>
               <w:left w:val="single" w:sz="4" w:space="0" w:color="FFFFFF" w:themeColor="background1"/>
               <w:bottom w:val="single" w:sz="4" w:space="0" w:color="D9D9D9" w:themeColor="background1" w:themeShade="D9"/>
@@ -686,7 +810,7 @@
       <w:tr>
         <w:tc>
           <w:tcPr>
-            <w:tcW w:w="3119" w:type="dxa"/>
+            <w:tcW w:w="2835" w:type="dxa"/>
             <w:tcBorders>
               <w:top w:val="single" w:sz="4" w:space="0" w:color="D9D9D9" w:themeColor="background1" w:themeShade="D9"/>
               <w:bottom w:val="single" w:sz="4" w:space="0" w:color="D9D9D9" w:themeColor="background1" w:themeShade="D9"/>
@@ -711,7 +835,7 @@
         </w:tc>
         <w:tc>
           <w:tcPr>
-            <w:tcW w:w="6226" w:type="dxa"/>
+            <w:tcW w:w="6804" w:type="dxa"/>
             <w:tcBorders>
               <w:left w:val="single" w:sz="4" w:space="0" w:color="D9D9D9" w:themeColor="background1" w:themeShade="D9"/>
               <w:bottom w:val="single" w:sz="4" w:space="0" w:color="D9D9D9" w:themeColor="background1" w:themeShade="D9"/>
@@ -724,7 +848,13 @@
             </w:pPr>
             <w:proofErr w:type="gramStart"/>
             <w:r>
-              <w:t>{{ BESCHREIBUNG</w:t>
+              <w:t xml:space="preserve">{{ </w:t>
+            </w:r>
+            <w:r>
+              <w:t>KURZ</w:t>
+            </w:r>
+            <w:r>
+              <w:t>BESCHREIBUNG</w:t>
             </w:r>
             <w:proofErr w:type="gramEnd"/>
             <w:r>
@@ -736,7 +866,7 @@
       <w:tr>
         <w:tc>
           <w:tcPr>
-            <w:tcW w:w="3119" w:type="dxa"/>
+            <w:tcW w:w="2835" w:type="dxa"/>
             <w:tcBorders>
               <w:top w:val="single" w:sz="4" w:space="0" w:color="D9D9D9" w:themeColor="background1" w:themeShade="D9"/>
               <w:left w:val="single" w:sz="4" w:space="0" w:color="D9D9D9" w:themeColor="background1" w:themeShade="D9"/>
@@ -762,7 +892,7 @@
         </w:tc>
         <w:tc>
           <w:tcPr>
-            <w:tcW w:w="6226" w:type="dxa"/>
+            <w:tcW w:w="6804" w:type="dxa"/>
             <w:tcBorders>
               <w:left w:val="single" w:sz="4" w:space="0" w:color="FFFFFF" w:themeColor="background1"/>
               <w:bottom w:val="single" w:sz="4" w:space="0" w:color="D9D9D9" w:themeColor="background1" w:themeShade="D9"/>
@@ -1417,7 +1547,7 @@
       <w:tr>
         <w:tc>
           <w:tcPr>
-            <w:tcW w:w="3119" w:type="dxa"/>
+            <w:tcW w:w="2835" w:type="dxa"/>
             <w:tcBorders>
               <w:top w:val="single" w:sz="4" w:space="0" w:color="D9D9D9" w:themeColor="background1" w:themeShade="D9"/>
               <w:bottom w:val="single" w:sz="4" w:space="0" w:color="D9D9D9" w:themeColor="background1" w:themeShade="D9"/>
@@ -1442,7 +1572,7 @@
         </w:tc>
         <w:tc>
           <w:tcPr>
-            <w:tcW w:w="6226" w:type="dxa"/>
+            <w:tcW w:w="6804" w:type="dxa"/>
             <w:tcBorders>
               <w:left w:val="single" w:sz="4" w:space="0" w:color="D9D9D9" w:themeColor="background1" w:themeShade="D9"/>
               <w:bottom w:val="single" w:sz="4" w:space="0" w:color="D9D9D9" w:themeColor="background1" w:themeShade="D9"/>
@@ -1765,7 +1895,6 @@
               <w:rPr>
                 <w:rStyle w:val="PlatzhalterZchn"/>
               </w:rPr>
-              <w:lastRenderedPageBreak/>
               <w:t>{{ G.VERTRETER</w:t>
             </w:r>
             <w:proofErr w:type="gramEnd"/>
@@ -1877,6 +2006,7 @@
                 <w:sz w:val="18"/>
                 <w:szCs w:val="18"/>
               </w:rPr>
+              <w:lastRenderedPageBreak/>
               <w:t>{%</w:t>
             </w:r>
             <w:r>
@@ -2428,7 +2558,7 @@
       <w:tr>
         <w:tc>
           <w:tcPr>
-            <w:tcW w:w="3119" w:type="dxa"/>
+            <w:tcW w:w="2835" w:type="dxa"/>
             <w:tcBorders>
               <w:top w:val="single" w:sz="4" w:space="0" w:color="D9D9D9" w:themeColor="background1" w:themeShade="D9"/>
               <w:left w:val="single" w:sz="4" w:space="0" w:color="D9D9D9" w:themeColor="background1" w:themeShade="D9"/>
@@ -2455,7 +2585,7 @@
         </w:tc>
         <w:tc>
           <w:tcPr>
-            <w:tcW w:w="6226" w:type="dxa"/>
+            <w:tcW w:w="6804" w:type="dxa"/>
             <w:tcBorders>
               <w:left w:val="single" w:sz="4" w:space="0" w:color="FFFFFF" w:themeColor="background1"/>
               <w:bottom w:val="single" w:sz="4" w:space="0" w:color="D9D9D9" w:themeColor="background1" w:themeShade="D9"/>
@@ -3455,7 +3585,7 @@
       <w:tr>
         <w:tc>
           <w:tcPr>
-            <w:tcW w:w="3119" w:type="dxa"/>
+            <w:tcW w:w="2835" w:type="dxa"/>
             <w:tcBorders>
               <w:top w:val="single" w:sz="4" w:space="0" w:color="D9D9D9" w:themeColor="background1" w:themeShade="D9"/>
               <w:bottom w:val="single" w:sz="4" w:space="0" w:color="D9D9D9" w:themeColor="background1" w:themeShade="D9"/>
@@ -3480,7 +3610,7 @@
         </w:tc>
         <w:tc>
           <w:tcPr>
-            <w:tcW w:w="6226" w:type="dxa"/>
+            <w:tcW w:w="6804" w:type="dxa"/>
             <w:tcBorders>
               <w:left w:val="single" w:sz="4" w:space="0" w:color="D9D9D9" w:themeColor="background1" w:themeShade="D9"/>
               <w:bottom w:val="single" w:sz="4" w:space="0" w:color="D9D9D9" w:themeColor="background1" w:themeShade="D9"/>
@@ -3505,7 +3635,7 @@
       <w:tr>
         <w:tc>
           <w:tcPr>
-            <w:tcW w:w="3119" w:type="dxa"/>
+            <w:tcW w:w="2835" w:type="dxa"/>
             <w:tcBorders>
               <w:top w:val="single" w:sz="4" w:space="0" w:color="D9D9D9" w:themeColor="background1" w:themeShade="D9"/>
               <w:left w:val="single" w:sz="4" w:space="0" w:color="D9D9D9" w:themeColor="background1" w:themeShade="D9"/>
@@ -3531,7 +3661,7 @@
         </w:tc>
         <w:tc>
           <w:tcPr>
-            <w:tcW w:w="6226" w:type="dxa"/>
+            <w:tcW w:w="6804" w:type="dxa"/>
             <w:tcBorders>
               <w:left w:val="single" w:sz="4" w:space="0" w:color="FFFFFF" w:themeColor="background1"/>
               <w:bottom w:val="single" w:sz="4" w:space="0" w:color="D9D9D9" w:themeColor="background1" w:themeShade="D9"/>
@@ -3559,7 +3689,7 @@
       <w:tr>
         <w:tc>
           <w:tcPr>
-            <w:tcW w:w="3119" w:type="dxa"/>
+            <w:tcW w:w="2835" w:type="dxa"/>
             <w:tcBorders>
               <w:top w:val="single" w:sz="4" w:space="0" w:color="D9D9D9" w:themeColor="background1" w:themeShade="D9"/>
               <w:bottom w:val="single" w:sz="4" w:space="0" w:color="D9D9D9" w:themeColor="background1" w:themeShade="D9"/>
@@ -3584,7 +3714,7 @@
         </w:tc>
         <w:tc>
           <w:tcPr>
-            <w:tcW w:w="6226" w:type="dxa"/>
+            <w:tcW w:w="6804" w:type="dxa"/>
             <w:tcBorders>
               <w:left w:val="single" w:sz="4" w:space="0" w:color="D9D9D9" w:themeColor="background1" w:themeShade="D9"/>
               <w:bottom w:val="single" w:sz="4" w:space="0" w:color="D9D9D9" w:themeColor="background1" w:themeShade="D9"/>
@@ -3612,7 +3742,7 @@
       <w:tr>
         <w:tc>
           <w:tcPr>
-            <w:tcW w:w="3119" w:type="dxa"/>
+            <w:tcW w:w="2835" w:type="dxa"/>
             <w:tcBorders>
               <w:top w:val="single" w:sz="4" w:space="0" w:color="D9D9D9" w:themeColor="background1" w:themeShade="D9"/>
               <w:left w:val="single" w:sz="4" w:space="0" w:color="D9D9D9" w:themeColor="background1" w:themeShade="D9"/>
@@ -3632,7 +3762,6 @@
               <w:rPr>
                 <w:rStyle w:val="Fett"/>
               </w:rPr>
-              <w:lastRenderedPageBreak/>
               <w:t>Einsprachefrist</w:t>
             </w:r>
             <w:r>
@@ -3645,7 +3774,7 @@
         </w:tc>
         <w:tc>
           <w:tcPr>
-            <w:tcW w:w="6226" w:type="dxa"/>
+            <w:tcW w:w="6804" w:type="dxa"/>
             <w:tcBorders>
               <w:left w:val="single" w:sz="4" w:space="0" w:color="FFFFFF" w:themeColor="background1"/>
               <w:bottom w:val="single" w:sz="4" w:space="0" w:color="D9D9D9" w:themeColor="background1" w:themeShade="D9"/>
@@ -3676,7 +3805,7 @@
       <w:tr>
         <w:tc>
           <w:tcPr>
-            <w:tcW w:w="3119" w:type="dxa"/>
+            <w:tcW w:w="2835" w:type="dxa"/>
             <w:tcBorders>
               <w:top w:val="single" w:sz="4" w:space="0" w:color="D9D9D9" w:themeColor="background1" w:themeShade="D9"/>
               <w:bottom w:val="single" w:sz="4" w:space="0" w:color="D9D9D9" w:themeColor="background1" w:themeShade="D9"/>
@@ -3701,7 +3830,7 @@
         </w:tc>
         <w:tc>
           <w:tcPr>
-            <w:tcW w:w="6226" w:type="dxa"/>
+            <w:tcW w:w="6804" w:type="dxa"/>
             <w:tcBorders>
               <w:left w:val="single" w:sz="4" w:space="0" w:color="D9D9D9" w:themeColor="background1" w:themeShade="D9"/>
               <w:bottom w:val="single" w:sz="4" w:space="0" w:color="D9D9D9" w:themeColor="background1" w:themeShade="D9"/>
@@ -3726,7 +3855,7 @@
       <w:tr>
         <w:tc>
           <w:tcPr>
-            <w:tcW w:w="3119" w:type="dxa"/>
+            <w:tcW w:w="2835" w:type="dxa"/>
             <w:tcBorders>
               <w:top w:val="single" w:sz="4" w:space="0" w:color="D9D9D9" w:themeColor="background1" w:themeShade="D9"/>
               <w:left w:val="single" w:sz="4" w:space="0" w:color="D9D9D9" w:themeColor="background1" w:themeShade="D9"/>
@@ -3752,7 +3881,7 @@
         </w:tc>
         <w:tc>
           <w:tcPr>
-            <w:tcW w:w="6226" w:type="dxa"/>
+            <w:tcW w:w="6804" w:type="dxa"/>
             <w:tcBorders>
               <w:left w:val="single" w:sz="4" w:space="0" w:color="FFFFFF" w:themeColor="background1"/>
             </w:tcBorders>
@@ -3827,6 +3956,7 @@
           <w:sz w:val="18"/>
           <w:szCs w:val="18"/>
         </w:rPr>
+        <w:lastRenderedPageBreak/>
         <w:t xml:space="preserve">{% </w:t>
       </w:r>
       <w:proofErr w:type="spellStart"/>
@@ -3847,7 +3977,25 @@
           <w:sz w:val="18"/>
           <w:szCs w:val="18"/>
         </w:rPr>
-        <w:t xml:space="preserve"> ZUSTAENDIG_NAME </w:t>
+        <w:t xml:space="preserve"> </w:t>
+      </w:r>
+      <w:r>
+        <w:rPr>
+          <w:rFonts w:ascii="Consolas" w:hAnsi="Consolas"/>
+          <w:color w:val="00B050"/>
+          <w:sz w:val="18"/>
+          <w:szCs w:val="18"/>
+        </w:rPr>
+        <w:t>ZUSTAENDIG_NAME</w:t>
+      </w:r>
+      <w:r>
+        <w:rPr>
+          <w:rFonts w:ascii="Consolas" w:hAnsi="Consolas"/>
+          <w:color w:val="00B050"/>
+          <w:sz w:val="18"/>
+          <w:szCs w:val="18"/>
+        </w:rPr>
+        <w:t xml:space="preserve"> </w:t>
       </w:r>
       <w:proofErr w:type="gramStart"/>
       <w:r>
@@ -3896,7 +4044,72 @@
           <w:sz w:val="18"/>
           <w:szCs w:val="18"/>
         </w:rPr>
-        <w:t xml:space="preserve">% </w:t>
+        <w:t>%</w:t>
+      </w:r>
+      <w:r>
+        <w:rPr>
+          <w:rFonts w:ascii="Consolas" w:hAnsi="Consolas"/>
+          <w:color w:val="00B050"/>
+          <w:sz w:val="18"/>
+          <w:szCs w:val="18"/>
+        </w:rPr>
+        <w:t xml:space="preserve"> </w:t>
+      </w:r>
+      <w:proofErr w:type="spellStart"/>
+      <w:r>
+        <w:rPr>
+          <w:rFonts w:ascii="Consolas" w:hAnsi="Consolas"/>
+          <w:color w:val="00B050"/>
+          <w:sz w:val="18"/>
+          <w:szCs w:val="18"/>
+        </w:rPr>
+        <w:t>else</w:t>
+      </w:r>
+      <w:proofErr w:type="spellEnd"/>
+      <w:r>
+        <w:rPr>
+          <w:rFonts w:ascii="Consolas" w:hAnsi="Consolas"/>
+          <w:color w:val="00B050"/>
+          <w:sz w:val="18"/>
+          <w:szCs w:val="18"/>
+        </w:rPr>
+        <w:t xml:space="preserve"> %}</w:t>
+      </w:r>
+      <w:sdt>
+        <w:sdtPr>
+          <w:id w:val="929853864"/>
+          <w:placeholder>
+            <w:docPart w:val="7A13591692024F8BBFC1EF63C39918CF"/>
+          </w:placeholder>
+          <w:showingPlcHdr/>
+        </w:sdtPr>
+        <w:sdtEndPr/>
+        <w:sdtContent>
+          <w:r>
+            <w:rPr>
+              <w:shd w:val="clear" w:color="auto" w:fill="FBE4D5" w:themeFill="accent2" w:themeFillTint="33"/>
+            </w:rPr>
+            <w:t>Name der zuständigen Person eingeben</w:t>
+          </w:r>
+        </w:sdtContent>
+      </w:sdt>
+      <w:r>
+        <w:rPr>
+          <w:rFonts w:ascii="Consolas" w:hAnsi="Consolas"/>
+          <w:color w:val="00B050"/>
+          <w:sz w:val="18"/>
+          <w:szCs w:val="18"/>
+        </w:rPr>
+        <w:t>{%</w:t>
+      </w:r>
+      <w:r>
+        <w:rPr>
+          <w:rFonts w:ascii="Consolas" w:hAnsi="Consolas"/>
+          <w:color w:val="00B050"/>
+          <w:sz w:val="18"/>
+          <w:szCs w:val="18"/>
+        </w:rPr>
+        <w:t xml:space="preserve"> </w:t>
       </w:r>
       <w:proofErr w:type="spellStart"/>
       <w:r>
@@ -3925,7 +4138,7 @@
       <w:headerReference w:type="first" r:id="rId10"/>
       <w:footerReference w:type="first" r:id="rId11"/>
       <w:pgSz w:w="11907" w:h="16840"/>
-      <w:pgMar w:top="851" w:right="1134" w:bottom="1021" w:left="1418" w:header="284" w:footer="567" w:gutter="0"/>
+      <w:pgMar w:top="1134" w:right="1134" w:bottom="1134" w:left="1134" w:header="284" w:footer="567" w:gutter="0"/>
       <w:pgNumType w:start="1"/>
       <w:cols w:space="720"/>
       <w:docGrid w:linePitch="299"/>
@@ -3955,333 +4168,395 @@
 
 <file path=word/footer1.xml><?xml version="1.0" encoding="utf-8"?>
 <w:ftr xmlns:wpc="http://schemas.microsoft.com/office/word/2010/wordprocessingCanvas" xmlns:cx="http://schemas.microsoft.com/office/drawing/2014/chartex" xmlns:cx1="http://schemas.microsoft.com/office/drawing/2015/9/8/chartex" xmlns:cx2="http://schemas.microsoft.com/office/drawing/2015/10/21/chartex" xmlns:cx3="http://schemas.microsoft.com/office/drawing/2016/5/9/chartex" xmlns:cx4="http://schemas.microsoft.com/office/drawing/2016/5/10/chartex" xmlns:cx5="http://schemas.microsoft.com/office/drawing/2016/5/11/chartex" xmlns:cx6="http://schemas.microsoft.com/office/drawing/2016/5/12/chartex" xmlns:cx7="http://schemas.microsoft.com/office/drawing/2016/5/13/chartex" xmlns:cx8="http://schemas.microsoft.com/office/drawing/2016/5/14/chartex" xmlns:mc="http://schemas.openxmlformats.org/markup-compatibility/2006" xmlns:aink="http://schemas.microsoft.com/office/drawing/2016/ink" xmlns:am3d="http://schemas.microsoft.com/office/drawing/2017/model3d" xmlns:o="urn:schemas-microsoft-com:office:office" xmlns:oel="http://schemas.microsoft.com/office/2019/extlst" xmlns:r="http://schemas.openxmlformats.org/officeDocument/2006/relationships" xmlns:m="http://schemas.openxmlformats.org/officeDocument/2006/math" xmlns:v="urn:schemas-microsoft-com:vml" xmlns:wp14="http://schemas.microsoft.com/office/word/2010/wordprocessingDrawing" xmlns:wp="http://schemas.openxmlformats.org/drawingml/2006/wordprocessingDrawing" xmlns:w10="urn:schemas-microsoft-com:office:word" xmlns:w="http://schemas.openxmlformats.org/wordprocessingml/2006/main" xmlns:w14="http://schemas.microsoft.com/office/word/2010/wordml" xmlns:w15="http://schemas.microsoft.com/office/word/2012/wordml" xmlns:w16cex="http://schemas.microsoft.com/office/word/2018/wordml/cex" xmlns:w16cid="http://schemas.microsoft.com/office/word/2016/wordml/cid" xmlns:w16="http://schemas.microsoft.com/office/word/2018/wordml" xmlns:w16du="http://schemas.microsoft.com/office/word/2023/wordml/word16du" xmlns:w16sdtdh="http://schemas.microsoft.com/office/word/2020/wordml/sdtdatahash" xmlns:w16sdtfl="http://schemas.microsoft.com/office/word/2024/wordml/sdtformatlock" xmlns:w16se="http://schemas.microsoft.com/office/word/2015/wordml/symex" xmlns:wpg="http://schemas.microsoft.com/office/word/2010/wordprocessingGroup" xmlns:wpi="http://schemas.microsoft.com/office/word/2010/wordprocessingInk" xmlns:wne="http://schemas.microsoft.com/office/word/2006/wordml" xmlns:wps="http://schemas.microsoft.com/office/word/2010/wordprocessingShape" mc:Ignorable="w14 w15 w16se w16cid w16 w16cex w16sdtdh w16sdtfl w16du wp14">
+  <w:tbl>
+    <w:tblPr>
+      <w:tblStyle w:val="Tabellenraster"/>
+      <w:tblpPr w:leftFromText="142" w:rightFromText="142" w:vertAnchor="text" w:tblpY="1"/>
+      <w:tblOverlap w:val="never"/>
+      <w:tblW w:w="9639" w:type="dxa"/>
+      <w:tblBorders>
+        <w:top w:val="none" w:sz="0" w:space="0" w:color="auto"/>
+        <w:left w:val="none" w:sz="0" w:space="0" w:color="auto"/>
+        <w:bottom w:val="none" w:sz="0" w:space="0" w:color="auto"/>
+        <w:right w:val="none" w:sz="0" w:space="0" w:color="auto"/>
+        <w:insideH w:val="none" w:sz="0" w:space="0" w:color="auto"/>
+        <w:insideV w:val="none" w:sz="0" w:space="0" w:color="auto"/>
+      </w:tblBorders>
+      <w:tblLayout w:type="fixed"/>
+      <w:tblCellMar>
+        <w:left w:w="0" w:type="dxa"/>
+        <w:right w:w="0" w:type="dxa"/>
+      </w:tblCellMar>
+      <w:tblLook w:val="04A0" w:firstRow="1" w:lastRow="0" w:firstColumn="1" w:lastColumn="0" w:noHBand="0" w:noVBand="1"/>
+    </w:tblPr>
+    <w:tblGrid>
+      <w:gridCol w:w="9078"/>
+      <w:gridCol w:w="561"/>
+    </w:tblGrid>
+    <w:tr>
+      <w:tc>
+        <w:tcPr>
+          <w:tcW w:w="9072" w:type="dxa"/>
+        </w:tcPr>
+        <w:p>
+          <w:pPr>
+            <w:pStyle w:val="Kopfzeile"/>
+            <w:tabs>
+              <w:tab w:val="clear" w:pos="4536"/>
+              <w:tab w:val="clear" w:pos="9072"/>
+            </w:tabs>
+            <w:rPr>
+              <w:rStyle w:val="PlatzhalterZchn"/>
+              <w:sz w:val="18"/>
+              <w:szCs w:val="18"/>
+            </w:rPr>
+          </w:pPr>
+          <w:proofErr w:type="gramStart"/>
+          <w:r>
+            <w:rPr>
+              <w:rStyle w:val="PlatzhalterZchn"/>
+              <w:sz w:val="16"/>
+              <w:szCs w:val="16"/>
+            </w:rPr>
+            <w:t>{{ LEITBEHOERDE</w:t>
+          </w:r>
+          <w:proofErr w:type="gramEnd"/>
+          <w:r>
+            <w:rPr>
+              <w:rStyle w:val="PlatzhalterZchn"/>
+              <w:sz w:val="16"/>
+              <w:szCs w:val="16"/>
+            </w:rPr>
+            <w:t>_</w:t>
+          </w:r>
+          <w:proofErr w:type="gramStart"/>
+          <w:r>
+            <w:rPr>
+              <w:rStyle w:val="PlatzhalterZchn"/>
+              <w:sz w:val="16"/>
+              <w:szCs w:val="16"/>
+            </w:rPr>
+            <w:t>NAME }</w:t>
+          </w:r>
+          <w:proofErr w:type="gramEnd"/>
+          <w:r>
+            <w:rPr>
+              <w:rStyle w:val="PlatzhalterZchn"/>
+              <w:sz w:val="16"/>
+              <w:szCs w:val="16"/>
+            </w:rPr>
+            <w:t>}</w:t>
+          </w:r>
+          <w:r>
+            <w:rPr>
+              <w:sz w:val="16"/>
+              <w:szCs w:val="16"/>
+            </w:rPr>
+            <w:t xml:space="preserve"> | </w:t>
+          </w:r>
+          <w:sdt>
+            <w:sdtPr>
+              <w:rPr>
+                <w:sz w:val="16"/>
+                <w:szCs w:val="16"/>
+              </w:rPr>
+              <w:id w:val="-1209956759"/>
+              <w:placeholder>
+                <w:docPart w:val="914A369FB98343CFB82158E75CC806ED"/>
+              </w:placeholder>
+              <w:showingPlcHdr/>
+            </w:sdtPr>
+            <w:sdtEndPr/>
+            <w:sdtContent>
+              <w:r>
+                <w:rPr>
+                  <w:rFonts w:eastAsiaTheme="minorHAnsi"/>
+                  <w:sz w:val="16"/>
+                  <w:szCs w:val="16"/>
+                  <w:shd w:val="clear" w:color="auto" w:fill="FBE4D5" w:themeFill="accent2" w:themeFillTint="33"/>
+                </w:rPr>
+                <w:t>Baubehörde eingeben</w:t>
+              </w:r>
+            </w:sdtContent>
+          </w:sdt>
+          <w:r>
+            <w:rPr>
+              <w:sz w:val="16"/>
+              <w:szCs w:val="16"/>
+            </w:rPr>
+            <w:t xml:space="preserve"> | </w:t>
+          </w:r>
+          <w:proofErr w:type="gramStart"/>
+          <w:r>
+            <w:rPr>
+              <w:rStyle w:val="PlatzhalterZchn"/>
+              <w:sz w:val="16"/>
+              <w:szCs w:val="16"/>
+            </w:rPr>
+            <w:t>{{ LEITBEHOERDE</w:t>
+          </w:r>
+          <w:proofErr w:type="gramEnd"/>
+          <w:r>
+            <w:rPr>
+              <w:rStyle w:val="PlatzhalterZchn"/>
+              <w:sz w:val="16"/>
+              <w:szCs w:val="16"/>
+            </w:rPr>
+            <w:t>_ADRESSE_</w:t>
+          </w:r>
+          <w:proofErr w:type="gramStart"/>
+          <w:r>
+            <w:rPr>
+              <w:rStyle w:val="PlatzhalterZchn"/>
+              <w:sz w:val="16"/>
+              <w:szCs w:val="16"/>
+            </w:rPr>
+            <w:t>1 }</w:t>
+          </w:r>
+          <w:proofErr w:type="gramEnd"/>
+          <w:r>
+            <w:rPr>
+              <w:rStyle w:val="PlatzhalterZchn"/>
+              <w:sz w:val="16"/>
+              <w:szCs w:val="16"/>
+            </w:rPr>
+            <w:t>}</w:t>
+          </w:r>
+          <w:r>
+            <w:rPr>
+              <w:sz w:val="16"/>
+              <w:szCs w:val="16"/>
+            </w:rPr>
+            <w:t xml:space="preserve"> | </w:t>
+          </w:r>
+          <w:proofErr w:type="gramStart"/>
+          <w:r>
+            <w:rPr>
+              <w:rStyle w:val="PlatzhalterZchn"/>
+              <w:sz w:val="16"/>
+              <w:szCs w:val="16"/>
+            </w:rPr>
+            <w:t>{{ LEITBEHOERDE</w:t>
+          </w:r>
+          <w:proofErr w:type="gramEnd"/>
+          <w:r>
+            <w:rPr>
+              <w:rStyle w:val="PlatzhalterZchn"/>
+              <w:sz w:val="16"/>
+              <w:szCs w:val="16"/>
+            </w:rPr>
+            <w:t>_ADRESSE_</w:t>
+          </w:r>
+          <w:proofErr w:type="gramStart"/>
+          <w:r>
+            <w:rPr>
+              <w:rStyle w:val="PlatzhalterZchn"/>
+              <w:sz w:val="16"/>
+              <w:szCs w:val="16"/>
+            </w:rPr>
+            <w:t>2 }</w:t>
+          </w:r>
+          <w:proofErr w:type="gramEnd"/>
+          <w:r>
+            <w:rPr>
+              <w:rStyle w:val="PlatzhalterZchn"/>
+              <w:sz w:val="16"/>
+              <w:szCs w:val="16"/>
+            </w:rPr>
+            <w:t>}</w:t>
+          </w:r>
+          <w:r>
+            <w:rPr>
+              <w:sz w:val="16"/>
+              <w:szCs w:val="16"/>
+            </w:rPr>
+            <w:t xml:space="preserve"> | </w:t>
+          </w:r>
+          <w:proofErr w:type="gramStart"/>
+          <w:r>
+            <w:rPr>
+              <w:rStyle w:val="PlatzhalterZchn"/>
+              <w:sz w:val="16"/>
+              <w:szCs w:val="16"/>
+            </w:rPr>
+            <w:t>{{ LEITBEHOERDE</w:t>
+          </w:r>
+          <w:proofErr w:type="gramEnd"/>
+          <w:r>
+            <w:rPr>
+              <w:rStyle w:val="PlatzhalterZchn"/>
+              <w:sz w:val="16"/>
+              <w:szCs w:val="16"/>
+            </w:rPr>
+            <w:t>_</w:t>
+          </w:r>
+          <w:proofErr w:type="gramStart"/>
+          <w:r>
+            <w:rPr>
+              <w:rStyle w:val="PlatzhalterZchn"/>
+              <w:sz w:val="16"/>
+              <w:szCs w:val="16"/>
+            </w:rPr>
+            <w:t>TELEFON }</w:t>
+          </w:r>
+          <w:proofErr w:type="gramEnd"/>
+          <w:r>
+            <w:rPr>
+              <w:rStyle w:val="PlatzhalterZchn"/>
+              <w:sz w:val="16"/>
+              <w:szCs w:val="16"/>
+            </w:rPr>
+            <w:t>}</w:t>
+          </w:r>
+          <w:r>
+            <w:rPr>
+              <w:sz w:val="16"/>
+              <w:szCs w:val="16"/>
+            </w:rPr>
+            <w:t xml:space="preserve"> | </w:t>
+          </w:r>
+          <w:proofErr w:type="gramStart"/>
+          <w:r>
+            <w:rPr>
+              <w:rStyle w:val="PlatzhalterZchn"/>
+              <w:sz w:val="16"/>
+              <w:szCs w:val="16"/>
+            </w:rPr>
+            <w:t>{{ LEITBEHOERDE</w:t>
+          </w:r>
+          <w:proofErr w:type="gramEnd"/>
+          <w:r>
+            <w:rPr>
+              <w:rStyle w:val="PlatzhalterZchn"/>
+              <w:sz w:val="16"/>
+              <w:szCs w:val="16"/>
+            </w:rPr>
+            <w:t>_</w:t>
+          </w:r>
+          <w:proofErr w:type="gramStart"/>
+          <w:r>
+            <w:rPr>
+              <w:rStyle w:val="PlatzhalterZchn"/>
+              <w:sz w:val="16"/>
+              <w:szCs w:val="16"/>
+            </w:rPr>
+            <w:t>EMAIL</w:t>
+          </w:r>
+          <w:proofErr w:type="gramEnd"/>
+          <w:r>
+            <w:rPr>
+              <w:rStyle w:val="PlatzhalterZchn"/>
+              <w:sz w:val="16"/>
+              <w:szCs w:val="16"/>
+            </w:rPr>
+            <w:t xml:space="preserve"> }}</w:t>
+          </w:r>
+        </w:p>
+      </w:tc>
+      <w:tc>
+        <w:tcPr>
+          <w:tcW w:w="561" w:type="dxa"/>
+          <w:vAlign w:val="bottom"/>
+        </w:tcPr>
+        <w:p>
+          <w:pPr>
+            <w:jc w:val="right"/>
+            <w:rPr>
+              <w:rStyle w:val="PlatzhalterZchn"/>
+              <w:sz w:val="16"/>
+              <w:szCs w:val="16"/>
+            </w:rPr>
+          </w:pPr>
+          <w:r>
+            <w:rPr>
+              <w:sz w:val="16"/>
+              <w:szCs w:val="16"/>
+            </w:rPr>
+            <w:fldChar w:fldCharType="begin"/>
+          </w:r>
+          <w:r>
+            <w:rPr>
+              <w:sz w:val="16"/>
+              <w:szCs w:val="16"/>
+            </w:rPr>
+            <w:instrText xml:space="preserve"> PAGE  \* Arabic  \* MERGEFORMAT </w:instrText>
+          </w:r>
+          <w:r>
+            <w:rPr>
+              <w:sz w:val="16"/>
+              <w:szCs w:val="16"/>
+            </w:rPr>
+            <w:fldChar w:fldCharType="separate"/>
+          </w:r>
+          <w:r>
+            <w:rPr>
+              <w:sz w:val="16"/>
+              <w:szCs w:val="16"/>
+            </w:rPr>
+            <w:t>1</w:t>
+          </w:r>
+          <w:r>
+            <w:rPr>
+              <w:sz w:val="16"/>
+              <w:szCs w:val="16"/>
+            </w:rPr>
+            <w:fldChar w:fldCharType="end"/>
+          </w:r>
+          <w:r>
+            <w:rPr>
+              <w:sz w:val="16"/>
+              <w:szCs w:val="16"/>
+            </w:rPr>
+            <w:t>/</w:t>
+          </w:r>
+          <w:r>
+            <w:rPr>
+              <w:sz w:val="16"/>
+              <w:szCs w:val="16"/>
+            </w:rPr>
+            <w:fldChar w:fldCharType="begin"/>
+          </w:r>
+          <w:r>
+            <w:rPr>
+              <w:sz w:val="16"/>
+              <w:szCs w:val="16"/>
+            </w:rPr>
+            <w:instrText xml:space="preserve"> NUMPAGES  \* Arabic  \* MERGEFORMAT </w:instrText>
+          </w:r>
+          <w:r>
+            <w:rPr>
+              <w:sz w:val="16"/>
+              <w:szCs w:val="16"/>
+            </w:rPr>
+            <w:fldChar w:fldCharType="separate"/>
+          </w:r>
+          <w:r>
+            <w:rPr>
+              <w:sz w:val="16"/>
+              <w:szCs w:val="16"/>
+            </w:rPr>
+            <w:t>3</w:t>
+          </w:r>
+          <w:r>
+            <w:rPr>
+              <w:sz w:val="16"/>
+              <w:szCs w:val="16"/>
+            </w:rPr>
+            <w:fldChar w:fldCharType="end"/>
+          </w:r>
+        </w:p>
+      </w:tc>
+    </w:tr>
+  </w:tbl>
   <w:p>
     <w:pPr>
-      <w:tabs>
-        <w:tab w:val="right" w:pos="9355"/>
-      </w:tabs>
-      <w:spacing w:before="240"/>
+      <w:pStyle w:val="Fuzeile"/>
+      <w:spacing w:line="240" w:lineRule="auto"/>
       <w:rPr>
-        <w:rStyle w:val="PlatzhalterZchn"/>
-        <w:sz w:val="16"/>
-        <w:szCs w:val="16"/>
+        <w:sz w:val="2"/>
+        <w:szCs w:val="2"/>
       </w:rPr>
     </w:pPr>
-    <w:proofErr w:type="gramStart"/>
-    <w:r>
-      <w:rPr>
-        <w:rStyle w:val="PlatzhalterZchn"/>
-        <w:sz w:val="16"/>
-        <w:szCs w:val="16"/>
-      </w:rPr>
-      <w:t>{{ LEITBEHOERDE</w:t>
-    </w:r>
-    <w:proofErr w:type="gramEnd"/>
-    <w:r>
-      <w:rPr>
-        <w:rStyle w:val="PlatzhalterZchn"/>
-        <w:sz w:val="16"/>
-        <w:szCs w:val="16"/>
-      </w:rPr>
-      <w:t>_</w:t>
-    </w:r>
-    <w:proofErr w:type="gramStart"/>
-    <w:r>
-      <w:rPr>
-        <w:rStyle w:val="PlatzhalterZchn"/>
-        <w:sz w:val="16"/>
-        <w:szCs w:val="16"/>
-      </w:rPr>
-      <w:t>NAME }</w:t>
-    </w:r>
-    <w:proofErr w:type="gramEnd"/>
-    <w:r>
-      <w:rPr>
-        <w:rStyle w:val="PlatzhalterZchn"/>
-        <w:sz w:val="16"/>
-        <w:szCs w:val="16"/>
-      </w:rPr>
-      <w:t>}</w:t>
-    </w:r>
-    <w:r>
-      <w:rPr>
-        <w:sz w:val="16"/>
-        <w:szCs w:val="16"/>
-      </w:rPr>
-      <w:t xml:space="preserve"> | </w:t>
-    </w:r>
-    <w:proofErr w:type="gramStart"/>
-    <w:r>
-      <w:rPr>
-        <w:rStyle w:val="PlatzhalterZchn"/>
-        <w:sz w:val="16"/>
-        <w:szCs w:val="16"/>
-      </w:rPr>
-      <w:t>{{ LEITBEHOERDE</w:t>
-    </w:r>
-    <w:proofErr w:type="gramEnd"/>
-    <w:r>
-      <w:rPr>
-        <w:rStyle w:val="PlatzhalterZchn"/>
-        <w:sz w:val="16"/>
-        <w:szCs w:val="16"/>
-      </w:rPr>
-      <w:t>_ADRESSE_</w:t>
-    </w:r>
-    <w:proofErr w:type="gramStart"/>
-    <w:r>
-      <w:rPr>
-        <w:rStyle w:val="PlatzhalterZchn"/>
-        <w:sz w:val="16"/>
-        <w:szCs w:val="16"/>
-      </w:rPr>
-      <w:t>1 }</w:t>
-    </w:r>
-    <w:proofErr w:type="gramEnd"/>
-    <w:r>
-      <w:rPr>
-        <w:rStyle w:val="PlatzhalterZchn"/>
-        <w:sz w:val="16"/>
-        <w:szCs w:val="16"/>
-      </w:rPr>
-      <w:t>}</w:t>
-    </w:r>
-    <w:r>
-      <w:rPr>
-        <w:sz w:val="16"/>
-        <w:szCs w:val="16"/>
-      </w:rPr>
-      <w:t xml:space="preserve"> | </w:t>
-    </w:r>
-    <w:proofErr w:type="gramStart"/>
-    <w:r>
-      <w:rPr>
-        <w:rStyle w:val="PlatzhalterZchn"/>
-        <w:sz w:val="16"/>
-        <w:szCs w:val="16"/>
-      </w:rPr>
-      <w:t>{{ LEITBEHOERDE</w:t>
-    </w:r>
-    <w:proofErr w:type="gramEnd"/>
-    <w:r>
-      <w:rPr>
-        <w:rStyle w:val="PlatzhalterZchn"/>
-        <w:sz w:val="16"/>
-        <w:szCs w:val="16"/>
-      </w:rPr>
-      <w:t>_ADRESSE_</w:t>
-    </w:r>
-    <w:proofErr w:type="gramStart"/>
-    <w:r>
-      <w:rPr>
-        <w:rStyle w:val="PlatzhalterZchn"/>
-        <w:sz w:val="16"/>
-        <w:szCs w:val="16"/>
-      </w:rPr>
-      <w:t>2 }</w:t>
-    </w:r>
-    <w:proofErr w:type="gramEnd"/>
-    <w:r>
-      <w:rPr>
-        <w:rStyle w:val="PlatzhalterZchn"/>
-        <w:sz w:val="16"/>
-        <w:szCs w:val="16"/>
-      </w:rPr>
-      <w:t>}</w:t>
-    </w:r>
-    <w:r>
-      <w:rPr>
-        <w:sz w:val="16"/>
-        <w:szCs w:val="16"/>
-      </w:rPr>
-      <w:t xml:space="preserve"> | </w:t>
-    </w:r>
-    <w:proofErr w:type="gramStart"/>
-    <w:r>
-      <w:rPr>
-        <w:rStyle w:val="PlatzhalterZchn"/>
-        <w:sz w:val="16"/>
-        <w:szCs w:val="16"/>
-      </w:rPr>
-      <w:t>{{ LEITBEHOERDE</w:t>
-    </w:r>
-    <w:proofErr w:type="gramEnd"/>
-    <w:r>
-      <w:rPr>
-        <w:rStyle w:val="PlatzhalterZchn"/>
-        <w:sz w:val="16"/>
-        <w:szCs w:val="16"/>
-      </w:rPr>
-      <w:t>_</w:t>
-    </w:r>
-    <w:proofErr w:type="gramStart"/>
-    <w:r>
-      <w:rPr>
-        <w:rStyle w:val="PlatzhalterZchn"/>
-        <w:sz w:val="16"/>
-        <w:szCs w:val="16"/>
-      </w:rPr>
-      <w:t>TELEFON }</w:t>
-    </w:r>
-    <w:proofErr w:type="gramEnd"/>
-    <w:r>
-      <w:rPr>
-        <w:rStyle w:val="PlatzhalterZchn"/>
-        <w:sz w:val="16"/>
-        <w:szCs w:val="16"/>
-      </w:rPr>
-      <w:t>}</w:t>
-    </w:r>
-    <w:r>
-      <w:rPr>
-        <w:sz w:val="16"/>
-        <w:szCs w:val="16"/>
-      </w:rPr>
-      <w:t xml:space="preserve"> | </w:t>
-    </w:r>
-    <w:proofErr w:type="gramStart"/>
-    <w:r>
-      <w:rPr>
-        <w:rStyle w:val="PlatzhalterZchn"/>
-        <w:sz w:val="16"/>
-        <w:szCs w:val="16"/>
-      </w:rPr>
-      <w:t>{{ LEITBEHOERDE</w:t>
-    </w:r>
-    <w:proofErr w:type="gramEnd"/>
-    <w:r>
-      <w:rPr>
-        <w:rStyle w:val="PlatzhalterZchn"/>
-        <w:sz w:val="16"/>
-        <w:szCs w:val="16"/>
-      </w:rPr>
-      <w:t>_</w:t>
-    </w:r>
-    <w:proofErr w:type="gramStart"/>
-    <w:r>
-      <w:rPr>
-        <w:rStyle w:val="PlatzhalterZchn"/>
-        <w:sz w:val="16"/>
-        <w:szCs w:val="16"/>
-      </w:rPr>
-      <w:t>EMAIL }</w:t>
-    </w:r>
-    <w:proofErr w:type="gramEnd"/>
-    <w:r>
-      <w:rPr>
-        <w:rStyle w:val="PlatzhalterZchn"/>
-        <w:sz w:val="16"/>
-        <w:szCs w:val="16"/>
-      </w:rPr>
-      <w:t>}</w:t>
-    </w:r>
-  </w:p>
-  <w:p>
-    <w:pPr>
-      <w:tabs>
-        <w:tab w:val="right" w:pos="9355"/>
-      </w:tabs>
-      <w:spacing w:before="120"/>
-      <w:rPr>
-        <w:sz w:val="16"/>
-      </w:rPr>
-    </w:pPr>
-    <w:r>
-      <w:rPr>
-        <w:sz w:val="16"/>
-      </w:rPr>
-      <w:tab/>
-    </w:r>
-    <w:r>
-      <w:rPr>
-        <w:sz w:val="16"/>
-      </w:rPr>
-      <w:fldChar w:fldCharType="begin"/>
-    </w:r>
-    <w:r>
-      <w:rPr>
-        <w:sz w:val="16"/>
-      </w:rPr>
-      <w:instrText xml:space="preserve"> </w:instrText>
-    </w:r>
-    <w:r>
-      <w:rPr>
-        <w:sz w:val="16"/>
-      </w:rPr>
-      <w:instrText>PAGE</w:instrText>
-    </w:r>
-    <w:r>
-      <w:rPr>
-        <w:sz w:val="16"/>
-      </w:rPr>
-      <w:instrText xml:space="preserve">  \* Arabic  \* MERGEFORMAT </w:instrText>
-    </w:r>
-    <w:r>
-      <w:rPr>
-        <w:sz w:val="16"/>
-      </w:rPr>
-      <w:fldChar w:fldCharType="separate"/>
-    </w:r>
-    <w:r>
-      <w:rPr>
-        <w:sz w:val="16"/>
-      </w:rPr>
-      <w:t>2</w:t>
-    </w:r>
-    <w:r>
-      <w:rPr>
-        <w:sz w:val="16"/>
-      </w:rPr>
-      <w:fldChar w:fldCharType="end"/>
-    </w:r>
-    <w:r>
-      <w:rPr>
-        <w:sz w:val="16"/>
-      </w:rPr>
-      <w:t>/</w:t>
-    </w:r>
-    <w:r>
-      <w:rPr>
-        <w:sz w:val="16"/>
-      </w:rPr>
-      <w:fldChar w:fldCharType="begin"/>
-    </w:r>
-    <w:r>
-      <w:rPr>
-        <w:sz w:val="16"/>
-      </w:rPr>
-      <w:instrText xml:space="preserve"> </w:instrText>
-    </w:r>
-    <w:r>
-      <w:rPr>
-        <w:sz w:val="16"/>
-      </w:rPr>
-      <w:instrText>NUMPAGES</w:instrText>
-    </w:r>
-    <w:r>
-      <w:rPr>
-        <w:sz w:val="16"/>
-      </w:rPr>
-      <w:instrText xml:space="preserve">  \* Arabic  \* MERGEFORMAT </w:instrText>
-    </w:r>
-    <w:r>
-      <w:rPr>
-        <w:sz w:val="16"/>
-      </w:rPr>
-      <w:fldChar w:fldCharType="separate"/>
-    </w:r>
-    <w:r>
-      <w:rPr>
-        <w:sz w:val="16"/>
-      </w:rPr>
-      <w:t>3</w:t>
-    </w:r>
-    <w:r>
-      <w:rPr>
-        <w:sz w:val="16"/>
-      </w:rPr>
-      <w:fldChar w:fldCharType="end"/>
-    </w:r>
   </w:p>
 </w:ftr>
 </file>
@@ -8185,6 +8460,639 @@
 </w:styles>
 </file>
 
+<file path=word/glossary/document.xml><?xml version="1.0" encoding="utf-8"?>
+<w:glossaryDocument xmlns:wpc="http://schemas.microsoft.com/office/word/2010/wordprocessingCanvas" xmlns:cx="http://schemas.microsoft.com/office/drawing/2014/chartex" xmlns:cx1="http://schemas.microsoft.com/office/drawing/2015/9/8/chartex" xmlns:cx2="http://schemas.microsoft.com/office/drawing/2015/10/21/chartex" xmlns:cx3="http://schemas.microsoft.com/office/drawing/2016/5/9/chartex" xmlns:cx4="http://schemas.microsoft.com/office/drawing/2016/5/10/chartex" xmlns:cx5="http://schemas.microsoft.com/office/drawing/2016/5/11/chartex" xmlns:cx6="http://schemas.microsoft.com/office/drawing/2016/5/12/chartex" xmlns:cx7="http://schemas.microsoft.com/office/drawing/2016/5/13/chartex" xmlns:cx8="http://schemas.microsoft.com/office/drawing/2016/5/14/chartex" xmlns:mc="http://schemas.openxmlformats.org/markup-compatibility/2006" xmlns:aink="http://schemas.microsoft.com/office/drawing/2016/ink" xmlns:am3d="http://schemas.microsoft.com/office/drawing/2017/model3d" xmlns:o="urn:schemas-microsoft-com:office:office" xmlns:oel="http://schemas.microsoft.com/office/2019/extlst" xmlns:r="http://schemas.openxmlformats.org/officeDocument/2006/relationships" xmlns:m="http://schemas.openxmlformats.org/officeDocument/2006/math" xmlns:v="urn:schemas-microsoft-com:vml" xmlns:wp14="http://schemas.microsoft.com/office/word/2010/wordprocessingDrawing" xmlns:wp="http://schemas.openxmlformats.org/drawingml/2006/wordprocessingDrawing" xmlns:w10="urn:schemas-microsoft-com:office:word" xmlns:w="http://schemas.openxmlformats.org/wordprocessingml/2006/main" xmlns:w14="http://schemas.microsoft.com/office/word/2010/wordml" xmlns:w15="http://schemas.microsoft.com/office/word/2012/wordml" xmlns:w16cex="http://schemas.microsoft.com/office/word/2018/wordml/cex" xmlns:w16cid="http://schemas.microsoft.com/office/word/2016/wordml/cid" xmlns:w16="http://schemas.microsoft.com/office/word/2018/wordml" xmlns:w16du="http://schemas.microsoft.com/office/word/2023/wordml/word16du" xmlns:w16sdtdh="http://schemas.microsoft.com/office/word/2020/wordml/sdtdatahash" xmlns:w16sdtfl="http://schemas.microsoft.com/office/word/2024/wordml/sdtformatlock" xmlns:w16se="http://schemas.microsoft.com/office/word/2015/wordml/symex" xmlns:wpg="http://schemas.microsoft.com/office/word/2010/wordprocessingGroup" xmlns:wpi="http://schemas.microsoft.com/office/word/2010/wordprocessingInk" xmlns:wne="http://schemas.microsoft.com/office/word/2006/wordml" xmlns:wps="http://schemas.microsoft.com/office/word/2010/wordprocessingShape" mc:Ignorable="w14 w15 w16se w16cid w16 w16cex w16sdtdh w16sdtfl w16du wp14">
+  <w:docParts>
+    <w:docPart>
+      <w:docPartPr>
+        <w:name w:val="7A13591692024F8BBFC1EF63C39918CF"/>
+        <w:category>
+          <w:name w:val="Allgemein"/>
+          <w:gallery w:val="placeholder"/>
+        </w:category>
+        <w:types>
+          <w:type w:val="bbPlcHdr"/>
+        </w:types>
+        <w:behaviors>
+          <w:behavior w:val="content"/>
+        </w:behaviors>
+        <w:guid w:val="{8C4CC46E-01EB-4533-A03E-2AA0FB959E7F}"/>
+      </w:docPartPr>
+      <w:docPartBody>
+        <w:p>
+          <w:pPr>
+            <w:pStyle w:val="7A13591692024F8BBFC1EF63C39918CF"/>
+          </w:pPr>
+          <w:r>
+            <w:rPr>
+              <w:shd w:val="clear" w:color="auto" w:fill="FAE2D5" w:themeFill="accent2" w:themeFillTint="33"/>
+            </w:rPr>
+            <w:t>Name der zuständigen Person eingeben</w:t>
+          </w:r>
+        </w:p>
+      </w:docPartBody>
+    </w:docPart>
+    <w:docPart>
+      <w:docPartPr>
+        <w:name w:val="914A369FB98343CFB82158E75CC806ED"/>
+        <w:category>
+          <w:name w:val="Allgemein"/>
+          <w:gallery w:val="placeholder"/>
+        </w:category>
+        <w:types>
+          <w:type w:val="bbPlcHdr"/>
+        </w:types>
+        <w:behaviors>
+          <w:behavior w:val="content"/>
+        </w:behaviors>
+        <w:guid w:val="{9464C57D-1705-4BDA-8C18-959E2A4436F5}"/>
+      </w:docPartPr>
+      <w:docPartBody>
+        <w:p>
+          <w:pPr>
+            <w:pStyle w:val="914A369FB98343CFB82158E75CC806ED"/>
+          </w:pPr>
+          <w:r>
+            <w:rPr>
+              <w:rFonts w:eastAsiaTheme="minorHAnsi"/>
+              <w:sz w:val="16"/>
+              <w:szCs w:val="16"/>
+              <w:shd w:val="clear" w:color="auto" w:fill="FAE2D5" w:themeFill="accent2" w:themeFillTint="33"/>
+            </w:rPr>
+            <w:t>Baubehörde eingeben</w:t>
+          </w:r>
+        </w:p>
+      </w:docPartBody>
+    </w:docPart>
+  </w:docParts>
+</w:glossaryDocument>
+</file>
+
+<file path=word/glossary/fontTable.xml><?xml version="1.0" encoding="utf-8"?>
+<w:fonts xmlns:mc="http://schemas.openxmlformats.org/markup-compatibility/2006" xmlns:r="http://schemas.openxmlformats.org/officeDocument/2006/relationships" xmlns:w="http://schemas.openxmlformats.org/wordprocessingml/2006/main" xmlns:w14="http://schemas.microsoft.com/office/word/2010/wordml" xmlns:w15="http://schemas.microsoft.com/office/word/2012/wordml" xmlns:w16cex="http://schemas.microsoft.com/office/word/2018/wordml/cex" xmlns:w16cid="http://schemas.microsoft.com/office/word/2016/wordml/cid" xmlns:w16="http://schemas.microsoft.com/office/word/2018/wordml" xmlns:w16du="http://schemas.microsoft.com/office/word/2023/wordml/word16du" xmlns:w16sdtdh="http://schemas.microsoft.com/office/word/2020/wordml/sdtdatahash" xmlns:w16sdtfl="http://schemas.microsoft.com/office/word/2024/wordml/sdtformatlock" xmlns:w16se="http://schemas.microsoft.com/office/word/2015/wordml/symex" mc:Ignorable="w14 w15 w16se w16cid w16 w16cex w16sdtdh w16sdtfl w16du">
+  <w:font w:name="Arial">
+    <w:panose1 w:val="020B0604020202020204"/>
+    <w:charset w:val="00"/>
+    <w:family w:val="swiss"/>
+    <w:pitch w:val="variable"/>
+    <w:sig w:usb0="E0002EFF" w:usb1="C000785B" w:usb2="00000009" w:usb3="00000000" w:csb0="000001FF" w:csb1="00000000"/>
+  </w:font>
+  <w:font w:name="Times New Roman">
+    <w:panose1 w:val="02020603050405020304"/>
+    <w:charset w:val="00"/>
+    <w:family w:val="roman"/>
+    <w:pitch w:val="variable"/>
+    <w:sig w:usb0="E0002EFF" w:usb1="C000785B" w:usb2="00000009" w:usb3="00000000" w:csb0="000001FF" w:csb1="00000000"/>
+  </w:font>
+  <w:font w:name="Symbol">
+    <w:panose1 w:val="05050102010706020507"/>
+    <w:charset w:val="02"/>
+    <w:family w:val="roman"/>
+    <w:pitch w:val="variable"/>
+    <w:sig w:usb0="00000000" w:usb1="10000000" w:usb2="00000000" w:usb3="00000000" w:csb0="80000000" w:csb1="00000000"/>
+  </w:font>
+  <w:font w:name="Wingdings">
+    <w:panose1 w:val="05000000000000000000"/>
+    <w:charset w:val="02"/>
+    <w:family w:val="auto"/>
+    <w:pitch w:val="variable"/>
+    <w:sig w:usb0="00000000" w:usb1="10000000" w:usb2="00000000" w:usb3="00000000" w:csb0="80000000" w:csb1="00000000"/>
+  </w:font>
+  <w:font w:name="Courier New">
+    <w:panose1 w:val="02070309020205020404"/>
+    <w:charset w:val="00"/>
+    <w:family w:val="modern"/>
+    <w:pitch w:val="fixed"/>
+    <w:sig w:usb0="E0002EFF" w:usb1="C0007843" w:usb2="00000009" w:usb3="00000000" w:csb0="000001FF" w:csb1="00000000"/>
+  </w:font>
+  <w:font w:name="Calibri">
+    <w:panose1 w:val="020F0502020204030204"/>
+    <w:charset w:val="00"/>
+    <w:family w:val="swiss"/>
+    <w:pitch w:val="variable"/>
+    <w:sig w:usb0="E4002EFF" w:usb1="C200247B" w:usb2="00000009" w:usb3="00000000" w:csb0="000001FF" w:csb1="00000000"/>
+  </w:font>
+  <w:font w:name="Calibri Light">
+    <w:panose1 w:val="020F0302020204030204"/>
+    <w:charset w:val="00"/>
+    <w:family w:val="swiss"/>
+    <w:pitch w:val="variable"/>
+    <w:sig w:usb0="E4002EFF" w:usb1="C200247B" w:usb2="00000009" w:usb3="00000000" w:csb0="000001FF" w:csb1="00000000"/>
+  </w:font>
+  <w:font w:name="Consolas">
+    <w:panose1 w:val="020B0609020204030204"/>
+    <w:charset w:val="00"/>
+    <w:family w:val="modern"/>
+    <w:pitch w:val="fixed"/>
+    <w:sig w:usb0="E00006FF" w:usb1="0000FCFF" w:usb2="00000001" w:usb3="00000000" w:csb0="0000019F" w:csb1="00000000"/>
+  </w:font>
+  <w:font w:name="Aptos">
+    <w:charset w:val="00"/>
+    <w:family w:val="swiss"/>
+    <w:pitch w:val="variable"/>
+    <w:sig w:usb0="20000287" w:usb1="00000003" w:usb2="00000000" w:usb3="00000000" w:csb0="0000019F" w:csb1="00000000"/>
+  </w:font>
+  <w:font w:name="Aptos Display">
+    <w:charset w:val="00"/>
+    <w:family w:val="swiss"/>
+    <w:pitch w:val="variable"/>
+    <w:sig w:usb0="20000287" w:usb1="00000003" w:usb2="00000000" w:usb3="00000000" w:csb0="0000019F" w:csb1="00000000"/>
+  </w:font>
+</w:fonts>
+</file>
+
+<file path=word/glossary/settings.xml><?xml version="1.0" encoding="utf-8"?>
+<w:settings xmlns:mc="http://schemas.openxmlformats.org/markup-compatibility/2006" xmlns:o="urn:schemas-microsoft-com:office:office" xmlns:r="http://schemas.openxmlformats.org/officeDocument/2006/relationships" xmlns:m="http://schemas.openxmlformats.org/officeDocument/2006/math" xmlns:v="urn:schemas-microsoft-com:vml" xmlns:w10="urn:schemas-microsoft-com:office:word" xmlns:w="http://schemas.openxmlformats.org/wordprocessingml/2006/main" xmlns:w14="http://schemas.microsoft.com/office/word/2010/wordml" xmlns:w15="http://schemas.microsoft.com/office/word/2012/wordml" xmlns:w16cex="http://schemas.microsoft.com/office/word/2018/wordml/cex" xmlns:w16cid="http://schemas.microsoft.com/office/word/2016/wordml/cid" xmlns:w16="http://schemas.microsoft.com/office/word/2018/wordml" xmlns:w16du="http://schemas.microsoft.com/office/word/2023/wordml/word16du" xmlns:w16sdtdh="http://schemas.microsoft.com/office/word/2020/wordml/sdtdatahash" xmlns:w16sdtfl="http://schemas.microsoft.com/office/word/2024/wordml/sdtformatlock" xmlns:w16se="http://schemas.microsoft.com/office/word/2015/wordml/symex" xmlns:sl="http://schemas.openxmlformats.org/schemaLibrary/2006/main" mc:Ignorable="w14 w15 w16se w16cid w16 w16cex w16sdtdh w16sdtfl w16du">
+  <w:view w:val="normal"/>
+  <w:defaultTabStop w:val="708"/>
+  <w:hyphenationZone w:val="425"/>
+  <w:characterSpacingControl w:val="doNotCompress"/>
+  <w:compat>
+    <w:useFELayout/>
+    <w:compatSetting w:name="compatibilityMode" w:uri="http://schemas.microsoft.com/office/word" w:val="15"/>
+    <w:compatSetting w:name="overrideTableStyleFontSizeAndJustification" w:uri="http://schemas.microsoft.com/office/word" w:val="1"/>
+    <w:compatSetting w:name="enableOpenTypeFeatures" w:uri="http://schemas.microsoft.com/office/word" w:val="1"/>
+    <w:compatSetting w:name="doNotFlipMirrorIndents" w:uri="http://schemas.microsoft.com/office/word" w:val="1"/>
+    <w:compatSetting w:name="differentiateMultirowTableHeaders" w:uri="http://schemas.microsoft.com/office/word" w:val="1"/>
+    <w:compatSetting w:name="useWord2013TrackBottomHyphenation" w:uri="http://schemas.microsoft.com/office/word" w:val="0"/>
+  </w:compat>
+  <w:rsids>
+    <w:rsidRoot w:val="00250B31"/>
+    <w:rsid w:val="0012764B"/>
+    <w:rsid w:val="00250B31"/>
+    <w:rsid w:val="00286394"/>
+    <w:rsid w:val="002F6492"/>
+    <w:rsid w:val="00327995"/>
+    <w:rsid w:val="00BD789A"/>
+    <w:rsid w:val="00C11D51"/>
+    <w:rsid w:val="00D64479"/>
+  </w:rsids>
+  <m:mathPr>
+    <m:mathFont m:val="Cambria Math"/>
+    <m:brkBin m:val="before"/>
+    <m:brkBinSub m:val="--"/>
+    <m:smallFrac m:val="0"/>
+    <m:dispDef/>
+    <m:lMargin m:val="0"/>
+    <m:rMargin m:val="0"/>
+    <m:defJc m:val="centerGroup"/>
+    <m:wrapIndent m:val="1440"/>
+    <m:intLim m:val="subSup"/>
+    <m:naryLim m:val="undOvr"/>
+  </m:mathPr>
+  <w:themeFontLang w:val="de-CH"/>
+  <w:clrSchemeMapping w:bg1="light1" w:t1="dark1" w:bg2="light2" w:t2="dark2" w:accent1="accent1" w:accent2="accent2" w:accent3="accent3" w:accent4="accent4" w:accent5="accent5" w:accent6="accent6" w:hyperlink="hyperlink" w:followedHyperlink="followedHyperlink"/>
+  <w:decimalSymbol w:val="."/>
+  <w:listSeparator w:val=";"/>
+  <w15:chartTrackingRefBased/>
+</w:settings>
+</file>
+
+<file path=word/glossary/styles.xml><?xml version="1.0" encoding="utf-8"?>
+<w:styles xmlns:mc="http://schemas.openxmlformats.org/markup-compatibility/2006" xmlns:r="http://schemas.openxmlformats.org/officeDocument/2006/relationships" xmlns:w="http://schemas.openxmlformats.org/wordprocessingml/2006/main" xmlns:w14="http://schemas.microsoft.com/office/word/2010/wordml" xmlns:w15="http://schemas.microsoft.com/office/word/2012/wordml" xmlns:w16cex="http://schemas.microsoft.com/office/word/2018/wordml/cex" xmlns:w16cid="http://schemas.microsoft.com/office/word/2016/wordml/cid" xmlns:w16="http://schemas.microsoft.com/office/word/2018/wordml" xmlns:w16du="http://schemas.microsoft.com/office/word/2023/wordml/word16du" xmlns:w16sdtdh="http://schemas.microsoft.com/office/word/2020/wordml/sdtdatahash" xmlns:w16sdtfl="http://schemas.microsoft.com/office/word/2024/wordml/sdtformatlock" xmlns:w16se="http://schemas.microsoft.com/office/word/2015/wordml/symex" mc:Ignorable="w14 w15 w16se w16cid w16 w16cex w16sdtdh w16sdtfl w16du">
+  <w:docDefaults>
+    <w:rPrDefault>
+      <w:rPr>
+        <w:rFonts w:asciiTheme="minorHAnsi" w:eastAsiaTheme="minorEastAsia" w:hAnsiTheme="minorHAnsi" w:cstheme="minorBidi"/>
+        <w:kern w:val="2"/>
+        <w:sz w:val="24"/>
+        <w:szCs w:val="24"/>
+        <w:lang w:val="de-CH" w:eastAsia="de-CH" w:bidi="ar-SA"/>
+        <w14:ligatures w14:val="standardContextual"/>
+      </w:rPr>
+    </w:rPrDefault>
+    <w:pPrDefault>
+      <w:pPr>
+        <w:spacing w:after="160" w:line="278" w:lineRule="auto"/>
+      </w:pPr>
+    </w:pPrDefault>
+  </w:docDefaults>
+  <w:latentStyles w:defLockedState="0" w:defUIPriority="99" w:defSemiHidden="0" w:defUnhideWhenUsed="0" w:defQFormat="0" w:count="376">
+    <w:lsdException w:name="Normal" w:uiPriority="0" w:qFormat="1"/>
+    <w:lsdException w:name="heading 1" w:uiPriority="9" w:qFormat="1"/>
+    <w:lsdException w:name="heading 2" w:semiHidden="1" w:uiPriority="9" w:unhideWhenUsed="1" w:qFormat="1"/>
+    <w:lsdException w:name="heading 3" w:semiHidden="1" w:uiPriority="9" w:unhideWhenUsed="1" w:qFormat="1"/>
+    <w:lsdException w:name="heading 4" w:semiHidden="1" w:uiPriority="9" w:unhideWhenUsed="1" w:qFormat="1"/>
+    <w:lsdException w:name="heading 5" w:semiHidden="1" w:uiPriority="9" w:unhideWhenUsed="1" w:qFormat="1"/>
+    <w:lsdException w:name="heading 6" w:semiHidden="1" w:uiPriority="9" w:unhideWhenUsed="1" w:qFormat="1"/>
+    <w:lsdException w:name="heading 7" w:semiHidden="1" w:uiPriority="9" w:unhideWhenUsed="1" w:qFormat="1"/>
+    <w:lsdException w:name="heading 8" w:semiHidden="1" w:uiPriority="9" w:unhideWhenUsed="1" w:qFormat="1"/>
+    <w:lsdException w:name="heading 9" w:semiHidden="1" w:uiPriority="9" w:unhideWhenUsed="1" w:qFormat="1"/>
+    <w:lsdException w:name="index 1" w:semiHidden="1" w:unhideWhenUsed="1"/>
+    <w:lsdException w:name="index 2" w:semiHidden="1" w:unhideWhenUsed="1"/>
+    <w:lsdException w:name="index 3" w:semiHidden="1" w:unhideWhenUsed="1"/>
+    <w:lsdException w:name="index 4" w:semiHidden="1" w:unhideWhenUsed="1"/>
+    <w:lsdException w:name="index 5" w:semiHidden="1" w:unhideWhenUsed="1"/>
+    <w:lsdException w:name="index 6" w:semiHidden="1" w:unhideWhenUsed="1"/>
+    <w:lsdException w:name="index 7" w:semiHidden="1" w:unhideWhenUsed="1"/>
+    <w:lsdException w:name="index 8" w:semiHidden="1" w:unhideWhenUsed="1"/>
+    <w:lsdException w:name="index 9" w:semiHidden="1" w:unhideWhenUsed="1"/>
+    <w:lsdException w:name="toc 1" w:semiHidden="1" w:uiPriority="39" w:unhideWhenUsed="1"/>
+    <w:lsdException w:name="toc 2" w:semiHidden="1" w:uiPriority="39" w:unhideWhenUsed="1"/>
+    <w:lsdException w:name="toc 3" w:semiHidden="1" w:uiPriority="39" w:unhideWhenUsed="1"/>
+    <w:lsdException w:name="toc 4" w:semiHidden="1" w:uiPriority="39" w:unhideWhenUsed="1"/>
+    <w:lsdException w:name="toc 5" w:semiHidden="1" w:uiPriority="39" w:unhideWhenUsed="1"/>
+    <w:lsdException w:name="toc 6" w:semiHidden="1" w:uiPriority="39" w:unhideWhenUsed="1"/>
+    <w:lsdException w:name="toc 7" w:semiHidden="1" w:uiPriority="39" w:unhideWhenUsed="1"/>
+    <w:lsdException w:name="toc 8" w:semiHidden="1" w:uiPriority="39" w:unhideWhenUsed="1"/>
+    <w:lsdException w:name="toc 9" w:semiHidden="1" w:uiPriority="39" w:unhideWhenUsed="1"/>
+    <w:lsdException w:name="Normal Indent" w:semiHidden="1" w:unhideWhenUsed="1"/>
+    <w:lsdException w:name="footnote text" w:semiHidden="1" w:unhideWhenUsed="1"/>
+    <w:lsdException w:name="annotation text" w:semiHidden="1" w:unhideWhenUsed="1"/>
+    <w:lsdException w:name="header" w:semiHidden="1" w:unhideWhenUsed="1"/>
+    <w:lsdException w:name="footer" w:semiHidden="1" w:unhideWhenUsed="1"/>
+    <w:lsdException w:name="index heading" w:semiHidden="1" w:unhideWhenUsed="1"/>
+    <w:lsdException w:name="caption" w:semiHidden="1" w:uiPriority="35" w:unhideWhenUsed="1" w:qFormat="1"/>
+    <w:lsdException w:name="table of figures" w:semiHidden="1" w:unhideWhenUsed="1"/>
+    <w:lsdException w:name="envelope address" w:semiHidden="1" w:unhideWhenUsed="1"/>
+    <w:lsdException w:name="envelope return" w:semiHidden="1" w:unhideWhenUsed="1"/>
+    <w:lsdException w:name="footnote reference" w:semiHidden="1" w:unhideWhenUsed="1"/>
+    <w:lsdException w:name="annotation reference" w:semiHidden="1" w:unhideWhenUsed="1"/>
+    <w:lsdException w:name="line number" w:semiHidden="1" w:unhideWhenUsed="1"/>
+    <w:lsdException w:name="page number" w:semiHidden="1" w:unhideWhenUsed="1"/>
+    <w:lsdException w:name="endnote reference" w:semiHidden="1" w:unhideWhenUsed="1"/>
+    <w:lsdException w:name="endnote text" w:semiHidden="1" w:unhideWhenUsed="1"/>
+    <w:lsdException w:name="table of authorities" w:semiHidden="1" w:unhideWhenUsed="1"/>
+    <w:lsdException w:name="macro" w:semiHidden="1" w:unhideWhenUsed="1"/>
+    <w:lsdException w:name="toa heading" w:semiHidden="1" w:unhideWhenUsed="1"/>
+    <w:lsdException w:name="List" w:semiHidden="1" w:unhideWhenUsed="1"/>
+    <w:lsdException w:name="List Bullet" w:semiHidden="1" w:unhideWhenUsed="1"/>
+    <w:lsdException w:name="List Number" w:semiHidden="1" w:unhideWhenUsed="1"/>
+    <w:lsdException w:name="List 2" w:semiHidden="1" w:unhideWhenUsed="1"/>
+    <w:lsdException w:name="List 3" w:semiHidden="1" w:unhideWhenUsed="1"/>
+    <w:lsdException w:name="List 4" w:semiHidden="1" w:unhideWhenUsed="1"/>
+    <w:lsdException w:name="List 5" w:semiHidden="1" w:unhideWhenUsed="1"/>
+    <w:lsdException w:name="List Bullet 2" w:semiHidden="1" w:unhideWhenUsed="1"/>
+    <w:lsdException w:name="List Bullet 3" w:semiHidden="1" w:unhideWhenUsed="1"/>
+    <w:lsdException w:name="List Bullet 4" w:semiHidden="1" w:unhideWhenUsed="1"/>
+    <w:lsdException w:name="List Bullet 5" w:semiHidden="1" w:unhideWhenUsed="1"/>
+    <w:lsdException w:name="List Number 2" w:semiHidden="1" w:unhideWhenUsed="1"/>
+    <w:lsdException w:name="List Number 3" w:semiHidden="1" w:unhideWhenUsed="1"/>
+    <w:lsdException w:name="List Number 4" w:semiHidden="1" w:unhideWhenUsed="1"/>
+    <w:lsdException w:name="List Number 5" w:semiHidden="1" w:unhideWhenUsed="1"/>
+    <w:lsdException w:name="Title" w:uiPriority="10" w:qFormat="1"/>
+    <w:lsdException w:name="Closing" w:semiHidden="1" w:unhideWhenUsed="1"/>
+    <w:lsdException w:name="Signature" w:semiHidden="1" w:unhideWhenUsed="1"/>
+    <w:lsdException w:name="Default Paragraph Font" w:semiHidden="1" w:uiPriority="1" w:unhideWhenUsed="1"/>
+    <w:lsdException w:name="Body Text" w:semiHidden="1" w:unhideWhenUsed="1"/>
+    <w:lsdException w:name="Body Text Indent" w:semiHidden="1" w:unhideWhenUsed="1"/>
+    <w:lsdException w:name="List Continue" w:semiHidden="1" w:unhideWhenUsed="1"/>
+    <w:lsdException w:name="List Continue 2" w:semiHidden="1" w:unhideWhenUsed="1"/>
+    <w:lsdException w:name="List Continue 3" w:semiHidden="1" w:unhideWhenUsed="1"/>
+    <w:lsdException w:name="List Continue 4" w:semiHidden="1" w:unhideWhenUsed="1"/>
+    <w:lsdException w:name="List Continue 5" w:semiHidden="1" w:unhideWhenUsed="1"/>
+    <w:lsdException w:name="Message Header" w:semiHidden="1" w:unhideWhenUsed="1"/>
+    <w:lsdException w:name="Subtitle" w:uiPriority="11" w:qFormat="1"/>
+    <w:lsdException w:name="Salutation" w:semiHidden="1" w:unhideWhenUsed="1"/>
+    <w:lsdException w:name="Date" w:semiHidden="1" w:unhideWhenUsed="1"/>
+    <w:lsdException w:name="Body Text First Indent" w:semiHidden="1" w:unhideWhenUsed="1"/>
+    <w:lsdException w:name="Body Text First Indent 2" w:semiHidden="1" w:unhideWhenUsed="1"/>
+    <w:lsdException w:name="Note Heading" w:semiHidden="1" w:unhideWhenUsed="1"/>
+    <w:lsdException w:name="Body Text 2" w:semiHidden="1" w:unhideWhenUsed="1"/>
+    <w:lsdException w:name="Body Text 3" w:semiHidden="1" w:unhideWhenUsed="1"/>
+    <w:lsdException w:name="Body Text Indent 2" w:semiHidden="1" w:unhideWhenUsed="1"/>
+    <w:lsdException w:name="Body Text Indent 3" w:semiHidden="1" w:unhideWhenUsed="1"/>
+    <w:lsdException w:name="Block Text" w:semiHidden="1" w:unhideWhenUsed="1"/>
+    <w:lsdException w:name="Hyperlink" w:semiHidden="1" w:unhideWhenUsed="1"/>
+    <w:lsdException w:name="FollowedHyperlink" w:semiHidden="1" w:unhideWhenUsed="1"/>
+    <w:lsdException w:name="Strong" w:uiPriority="22" w:qFormat="1"/>
+    <w:lsdException w:name="Emphasis" w:uiPriority="20" w:qFormat="1"/>
+    <w:lsdException w:name="Document Map" w:semiHidden="1" w:unhideWhenUsed="1"/>
+    <w:lsdException w:name="Plain Text" w:semiHidden="1" w:unhideWhenUsed="1"/>
+    <w:lsdException w:name="E-mail Signature" w:semiHidden="1" w:unhideWhenUsed="1"/>
+    <w:lsdException w:name="HTML Top of Form" w:semiHidden="1" w:unhideWhenUsed="1"/>
+    <w:lsdException w:name="HTML Bottom of Form" w:semiHidden="1" w:unhideWhenUsed="1"/>
+    <w:lsdException w:name="Normal (Web)" w:semiHidden="1" w:unhideWhenUsed="1"/>
+    <w:lsdException w:name="HTML Acronym" w:semiHidden="1" w:unhideWhenUsed="1"/>
+    <w:lsdException w:name="HTML Address" w:semiHidden="1" w:unhideWhenUsed="1"/>
+    <w:lsdException w:name="HTML Cite" w:semiHidden="1" w:unhideWhenUsed="1"/>
+    <w:lsdException w:name="HTML Code" w:semiHidden="1" w:unhideWhenUsed="1"/>
+    <w:lsdException w:name="HTML Definition" w:semiHidden="1" w:unhideWhenUsed="1"/>
+    <w:lsdException w:name="HTML Keyboard" w:semiHidden="1" w:unhideWhenUsed="1"/>
+    <w:lsdException w:name="HTML Preformatted" w:semiHidden="1" w:unhideWhenUsed="1"/>
+    <w:lsdException w:name="HTML Sample" w:semiHidden="1" w:unhideWhenUsed="1"/>
+    <w:lsdException w:name="HTML Typewriter" w:semiHidden="1" w:unhideWhenUsed="1"/>
+    <w:lsdException w:name="HTML Variable" w:semiHidden="1" w:unhideWhenUsed="1"/>
+    <w:lsdException w:name="Normal Table" w:semiHidden="1" w:unhideWhenUsed="1"/>
+    <w:lsdException w:name="annotation subject" w:semiHidden="1" w:unhideWhenUsed="1"/>
+    <w:lsdException w:name="No List" w:semiHidden="1" w:unhideWhenUsed="1"/>
+    <w:lsdException w:name="Outline List 1" w:semiHidden="1" w:unhideWhenUsed="1"/>
+    <w:lsdException w:name="Outline List 2" w:semiHidden="1" w:unhideWhenUsed="1"/>
+    <w:lsdException w:name="Outline List 3" w:semiHidden="1" w:unhideWhenUsed="1"/>
+    <w:lsdException w:name="Table Simple 1" w:semiHidden="1" w:unhideWhenUsed="1"/>
+    <w:lsdException w:name="Table Simple 2" w:semiHidden="1" w:unhideWhenUsed="1"/>
+    <w:lsdException w:name="Table Simple 3" w:semiHidden="1" w:unhideWhenUsed="1"/>
+    <w:lsdException w:name="Table Classic 1" w:semiHidden="1" w:unhideWhenUsed="1"/>
+    <w:lsdException w:name="Table Classic 2" w:semiHidden="1" w:unhideWhenUsed="1"/>
+    <w:lsdException w:name="Table Classic 3" w:semiHidden="1" w:unhideWhenUsed="1"/>
+    <w:lsdException w:name="Table Classic 4" w:semiHidden="1" w:unhideWhenUsed="1"/>
+    <w:lsdException w:name="Table Colorful 1" w:semiHidden="1" w:unhideWhenUsed="1"/>
+    <w:lsdException w:name="Table Colorful 2" w:semiHidden="1" w:unhideWhenUsed="1"/>
+    <w:lsdException w:name="Table Colorful 3" w:semiHidden="1" w:unhideWhenUsed="1"/>
+    <w:lsdException w:name="Table Columns 1" w:semiHidden="1" w:unhideWhenUsed="1"/>
+    <w:lsdException w:name="Table Columns 2" w:semiHidden="1" w:unhideWhenUsed="1"/>
+    <w:lsdException w:name="Table Columns 3" w:semiHidden="1" w:unhideWhenUsed="1"/>
+    <w:lsdException w:name="Table Columns 4" w:semiHidden="1" w:unhideWhenUsed="1"/>
+    <w:lsdException w:name="Table Columns 5" w:semiHidden="1" w:unhideWhenUsed="1"/>
+    <w:lsdException w:name="Table Grid 1" w:semiHidden="1" w:unhideWhenUsed="1"/>
+    <w:lsdException w:name="Table Grid 2" w:semiHidden="1" w:unhideWhenUsed="1"/>
+    <w:lsdException w:name="Table Grid 3" w:semiHidden="1" w:unhideWhenUsed="1"/>
+    <w:lsdException w:name="Table Grid 4" w:semiHidden="1" w:unhideWhenUsed="1"/>
+    <w:lsdException w:name="Table Grid 5" w:semiHidden="1" w:unhideWhenUsed="1"/>
+    <w:lsdException w:name="Table Grid 6" w:semiHidden="1" w:unhideWhenUsed="1"/>
+    <w:lsdException w:name="Table Grid 7" w:semiHidden="1" w:unhideWhenUsed="1"/>
+    <w:lsdException w:name="Table Grid 8" w:semiHidden="1" w:unhideWhenUsed="1"/>
+    <w:lsdException w:name="Table List 1" w:semiHidden="1" w:unhideWhenUsed="1"/>
+    <w:lsdException w:name="Table List 2" w:semiHidden="1" w:unhideWhenUsed="1"/>
+    <w:lsdException w:name="Table List 3" w:semiHidden="1" w:unhideWhenUsed="1"/>
+    <w:lsdException w:name="Table List 4" w:semiHidden="1" w:unhideWhenUsed="1"/>
+    <w:lsdException w:name="Table List 5" w:semiHidden="1" w:unhideWhenUsed="1"/>
+    <w:lsdException w:name="Table List 6" w:semiHidden="1" w:unhideWhenUsed="1"/>
+    <w:lsdException w:name="Table List 7" w:semiHidden="1" w:unhideWhenUsed="1"/>
+    <w:lsdException w:name="Table List 8" w:semiHidden="1" w:unhideWhenUsed="1"/>
+    <w:lsdException w:name="Table 3D effects 1" w:semiHidden="1" w:unhideWhenUsed="1"/>
+    <w:lsdException w:name="Table 3D effects 2" w:semiHidden="1" w:unhideWhenUsed="1"/>
+    <w:lsdException w:name="Table 3D effects 3" w:semiHidden="1" w:unhideWhenUsed="1"/>
+    <w:lsdException w:name="Table Contemporary" w:semiHidden="1" w:unhideWhenUsed="1"/>
+    <w:lsdException w:name="Table Elegant" w:semiHidden="1" w:unhideWhenUsed="1"/>
+    <w:lsdException w:name="Table Professional" w:semiHidden="1" w:unhideWhenUsed="1"/>
+    <w:lsdException w:name="Table Subtle 1" w:semiHidden="1" w:unhideWhenUsed="1"/>
+    <w:lsdException w:name="Table Subtle 2" w:semiHidden="1" w:unhideWhenUsed="1"/>
+    <w:lsdException w:name="Table Web 1" w:semiHidden="1" w:unhideWhenUsed="1"/>
+    <w:lsdException w:name="Table Web 2" w:semiHidden="1" w:unhideWhenUsed="1"/>
+    <w:lsdException w:name="Table Web 3" w:semiHidden="1" w:unhideWhenUsed="1"/>
+    <w:lsdException w:name="Balloon Text" w:semiHidden="1" w:unhideWhenUsed="1"/>
+    <w:lsdException w:name="Table Grid" w:uiPriority="39"/>
+    <w:lsdException w:name="Table Theme" w:semiHidden="1" w:unhideWhenUsed="1"/>
+    <w:lsdException w:name="Placeholder Text" w:semiHidden="1"/>
+    <w:lsdException w:name="No Spacing" w:uiPriority="1" w:qFormat="1"/>
+    <w:lsdException w:name="Light Shading" w:uiPriority="60"/>
+    <w:lsdException w:name="Light List" w:uiPriority="61"/>
+    <w:lsdException w:name="Light Grid" w:uiPriority="62"/>
+    <w:lsdException w:name="Medium Shading 1" w:uiPriority="63"/>
+    <w:lsdException w:name="Medium Shading 2" w:uiPriority="64"/>
+    <w:lsdException w:name="Medium List 1" w:uiPriority="65"/>
+    <w:lsdException w:name="Medium List 2" w:uiPriority="66"/>
+    <w:lsdException w:name="Medium Grid 1" w:uiPriority="67"/>
+    <w:lsdException w:name="Medium Grid 2" w:uiPriority="68"/>
+    <w:lsdException w:name="Medium Grid 3" w:uiPriority="69"/>
+    <w:lsdException w:name="Dark List" w:uiPriority="70"/>
+    <w:lsdException w:name="Colorful Shading" w:uiPriority="71"/>
+    <w:lsdException w:name="Colorful List" w:uiPriority="72"/>
+    <w:lsdException w:name="Colorful Grid" w:uiPriority="73"/>
+    <w:lsdException w:name="Light Shading Accent 1" w:uiPriority="60"/>
+    <w:lsdException w:name="Light List Accent 1" w:uiPriority="61"/>
+    <w:lsdException w:name="Light Grid Accent 1" w:uiPriority="62"/>
+    <w:lsdException w:name="Medium Shading 1 Accent 1" w:uiPriority="63"/>
+    <w:lsdException w:name="Medium Shading 2 Accent 1" w:uiPriority="64"/>
+    <w:lsdException w:name="Medium List 1 Accent 1" w:uiPriority="65"/>
+    <w:lsdException w:name="Revision" w:semiHidden="1"/>
+    <w:lsdException w:name="List Paragraph" w:uiPriority="34" w:qFormat="1"/>
+    <w:lsdException w:name="Quote" w:uiPriority="29" w:qFormat="1"/>
+    <w:lsdException w:name="Intense Quote" w:uiPriority="30" w:qFormat="1"/>
+    <w:lsdException w:name="Medium List 2 Accent 1" w:uiPriority="66"/>
+    <w:lsdException w:name="Medium Grid 1 Accent 1" w:uiPriority="67"/>
+    <w:lsdException w:name="Medium Grid 2 Accent 1" w:uiPriority="68"/>
+    <w:lsdException w:name="Medium Grid 3 Accent 1" w:uiPriority="69"/>
+    <w:lsdException w:name="Dark List Accent 1" w:uiPriority="70"/>
+    <w:lsdException w:name="Colorful Shading Accent 1" w:uiPriority="71"/>
+    <w:lsdException w:name="Colorful List Accent 1" w:uiPriority="72"/>
+    <w:lsdException w:name="Colorful Grid Accent 1" w:uiPriority="73"/>
+    <w:lsdException w:name="Light Shading Accent 2" w:uiPriority="60"/>
+    <w:lsdException w:name="Light List Accent 2" w:uiPriority="61"/>
+    <w:lsdException w:name="Light Grid Accent 2" w:uiPriority="62"/>
+    <w:lsdException w:name="Medium Shading 1 Accent 2" w:uiPriority="63"/>
+    <w:lsdException w:name="Medium Shading 2 Accent 2" w:uiPriority="64"/>
+    <w:lsdException w:name="Medium List 1 Accent 2" w:uiPriority="65"/>
+    <w:lsdException w:name="Medium List 2 Accent 2" w:uiPriority="66"/>
+    <w:lsdException w:name="Medium Grid 1 Accent 2" w:uiPriority="67"/>
+    <w:lsdException w:name="Medium Grid 2 Accent 2" w:uiPriority="68"/>
+    <w:lsdException w:name="Medium Grid 3 Accent 2" w:uiPriority="69"/>
+    <w:lsdException w:name="Dark List Accent 2" w:uiPriority="70"/>
+    <w:lsdException w:name="Colorful Shading Accent 2" w:uiPriority="71"/>
+    <w:lsdException w:name="Colorful List Accent 2" w:uiPriority="72"/>
+    <w:lsdException w:name="Colorful Grid Accent 2" w:uiPriority="73"/>
+    <w:lsdException w:name="Light Shading Accent 3" w:uiPriority="60"/>
+    <w:lsdException w:name="Light List Accent 3" w:uiPriority="61"/>
+    <w:lsdException w:name="Light Grid Accent 3" w:uiPriority="62"/>
+    <w:lsdException w:name="Medium Shading 1 Accent 3" w:uiPriority="63"/>
+    <w:lsdException w:name="Medium Shading 2 Accent 3" w:uiPriority="64"/>
+    <w:lsdException w:name="Medium List 1 Accent 3" w:uiPriority="65"/>
+    <w:lsdException w:name="Medium List 2 Accent 3" w:uiPriority="66"/>
+    <w:lsdException w:name="Medium Grid 1 Accent 3" w:uiPriority="67"/>
+    <w:lsdException w:name="Medium Grid 2 Accent 3" w:uiPriority="68"/>
+    <w:lsdException w:name="Medium Grid 3 Accent 3" w:uiPriority="69"/>
+    <w:lsdException w:name="Dark List Accent 3" w:uiPriority="70"/>
+    <w:lsdException w:name="Colorful Shading Accent 3" w:uiPriority="71"/>
+    <w:lsdException w:name="Colorful List Accent 3" w:uiPriority="72"/>
+    <w:lsdException w:name="Colorful Grid Accent 3" w:uiPriority="73"/>
+    <w:lsdException w:name="Light Shading Accent 4" w:uiPriority="60"/>
+    <w:lsdException w:name="Light List Accent 4" w:uiPriority="61"/>
+    <w:lsdException w:name="Light Grid Accent 4" w:uiPriority="62"/>
+    <w:lsdException w:name="Medium Shading 1 Accent 4" w:uiPriority="63"/>
+    <w:lsdException w:name="Medium Shading 2 Accent 4" w:uiPriority="64"/>
+    <w:lsdException w:name="Medium List 1 Accent 4" w:uiPriority="65"/>
+    <w:lsdException w:name="Medium List 2 Accent 4" w:uiPriority="66"/>
+    <w:lsdException w:name="Medium Grid 1 Accent 4" w:uiPriority="67"/>
+    <w:lsdException w:name="Medium Grid 2 Accent 4" w:uiPriority="68"/>
+    <w:lsdException w:name="Medium Grid 3 Accent 4" w:uiPriority="69"/>
+    <w:lsdException w:name="Dark List Accent 4" w:uiPriority="70"/>
+    <w:lsdException w:name="Colorful Shading Accent 4" w:uiPriority="71"/>
+    <w:lsdException w:name="Colorful List Accent 4" w:uiPriority="72"/>
+    <w:lsdException w:name="Colorful Grid Accent 4" w:uiPriority="73"/>
+    <w:lsdException w:name="Light Shading Accent 5" w:uiPriority="60"/>
+    <w:lsdException w:name="Light List Accent 5" w:uiPriority="61"/>
+    <w:lsdException w:name="Light Grid Accent 5" w:uiPriority="62"/>
+    <w:lsdException w:name="Medium Shading 1 Accent 5" w:uiPriority="63"/>
+    <w:lsdException w:name="Medium Shading 2 Accent 5" w:uiPriority="64"/>
+    <w:lsdException w:name="Medium List 1 Accent 5" w:uiPriority="65"/>
+    <w:lsdException w:name="Medium List 2 Accent 5" w:uiPriority="66"/>
+    <w:lsdException w:name="Medium Grid 1 Accent 5" w:uiPriority="67"/>
+    <w:lsdException w:name="Medium Grid 2 Accent 5" w:uiPriority="68"/>
+    <w:lsdException w:name="Medium Grid 3 Accent 5" w:uiPriority="69"/>
+    <w:lsdException w:name="Dark List Accent 5" w:uiPriority="70"/>
+    <w:lsdException w:name="Colorful Shading Accent 5" w:uiPriority="71"/>
+    <w:lsdException w:name="Colorful List Accent 5" w:uiPriority="72"/>
+    <w:lsdException w:name="Colorful Grid Accent 5" w:uiPriority="73"/>
+    <w:lsdException w:name="Light Shading Accent 6" w:uiPriority="60"/>
+    <w:lsdException w:name="Light List Accent 6" w:uiPriority="61"/>
+    <w:lsdException w:name="Light Grid Accent 6" w:uiPriority="62"/>
+    <w:lsdException w:name="Medium Shading 1 Accent 6" w:uiPriority="63"/>
+    <w:lsdException w:name="Medium Shading 2 Accent 6" w:uiPriority="64"/>
+    <w:lsdException w:name="Medium List 1 Accent 6" w:uiPriority="65"/>
+    <w:lsdException w:name="Medium List 2 Accent 6" w:uiPriority="66"/>
+    <w:lsdException w:name="Medium Grid 1 Accent 6" w:uiPriority="67"/>
+    <w:lsdException w:name="Medium Grid 2 Accent 6" w:uiPriority="68"/>
+    <w:lsdException w:name="Medium Grid 3 Accent 6" w:uiPriority="69"/>
+    <w:lsdException w:name="Dark List Accent 6" w:uiPriority="70"/>
+    <w:lsdException w:name="Colorful Shading Accent 6" w:uiPriority="71"/>
+    <w:lsdException w:name="Colorful List Accent 6" w:uiPriority="72"/>
+    <w:lsdException w:name="Colorful Grid Accent 6" w:uiPriority="73"/>
+    <w:lsdException w:name="Subtle Emphasis" w:uiPriority="19" w:qFormat="1"/>
+    <w:lsdException w:name="Intense Emphasis" w:uiPriority="21" w:qFormat="1"/>
+    <w:lsdException w:name="Subtle Reference" w:uiPriority="31" w:qFormat="1"/>
+    <w:lsdException w:name="Intense Reference" w:uiPriority="32" w:qFormat="1"/>
+    <w:lsdException w:name="Book Title" w:uiPriority="33" w:qFormat="1"/>
+    <w:lsdException w:name="Bibliography" w:semiHidden="1" w:uiPriority="37" w:unhideWhenUsed="1"/>
+    <w:lsdException w:name="TOC Heading" w:semiHidden="1" w:uiPriority="39" w:unhideWhenUsed="1" w:qFormat="1"/>
+    <w:lsdException w:name="Plain Table 1" w:uiPriority="41"/>
+    <w:lsdException w:name="Plain Table 2" w:uiPriority="42"/>
+    <w:lsdException w:name="Plain Table 3" w:uiPriority="43"/>
+    <w:lsdException w:name="Plain Table 4" w:uiPriority="44"/>
+    <w:lsdException w:name="Plain Table 5" w:uiPriority="45"/>
+    <w:lsdException w:name="Grid Table Light" w:uiPriority="40"/>
+    <w:lsdException w:name="Grid Table 1 Light" w:uiPriority="46"/>
+    <w:lsdException w:name="Grid Table 2" w:uiPriority="47"/>
+    <w:lsdException w:name="Grid Table 3" w:uiPriority="48"/>
+    <w:lsdException w:name="Grid Table 4" w:uiPriority="49"/>
+    <w:lsdException w:name="Grid Table 5 Dark" w:uiPriority="50"/>
+    <w:lsdException w:name="Grid Table 6 Colorful" w:uiPriority="51"/>
+    <w:lsdException w:name="Grid Table 7 Colorful" w:uiPriority="52"/>
+    <w:lsdException w:name="Grid Table 1 Light Accent 1" w:uiPriority="46"/>
+    <w:lsdException w:name="Grid Table 2 Accent 1" w:uiPriority="47"/>
+    <w:lsdException w:name="Grid Table 3 Accent 1" w:uiPriority="48"/>
+    <w:lsdException w:name="Grid Table 4 Accent 1" w:uiPriority="49"/>
+    <w:lsdException w:name="Grid Table 5 Dark Accent 1" w:uiPriority="50"/>
+    <w:lsdException w:name="Grid Table 6 Colorful Accent 1" w:uiPriority="51"/>
+    <w:lsdException w:name="Grid Table 7 Colorful Accent 1" w:uiPriority="52"/>
+    <w:lsdException w:name="Grid Table 1 Light Accent 2" w:uiPriority="46"/>
+    <w:lsdException w:name="Grid Table 2 Accent 2" w:uiPriority="47"/>
+    <w:lsdException w:name="Grid Table 3 Accent 2" w:uiPriority="48"/>
+    <w:lsdException w:name="Grid Table 4 Accent 2" w:uiPriority="49"/>
+    <w:lsdException w:name="Grid Table 5 Dark Accent 2" w:uiPriority="50"/>
+    <w:lsdException w:name="Grid Table 6 Colorful Accent 2" w:uiPriority="51"/>
+    <w:lsdException w:name="Grid Table 7 Colorful Accent 2" w:uiPriority="52"/>
+    <w:lsdException w:name="Grid Table 1 Light Accent 3" w:uiPriority="46"/>
+    <w:lsdException w:name="Grid Table 2 Accent 3" w:uiPriority="47"/>
+    <w:lsdException w:name="Grid Table 3 Accent 3" w:uiPriority="48"/>
+    <w:lsdException w:name="Grid Table 4 Accent 3" w:uiPriority="49"/>
+    <w:lsdException w:name="Grid Table 5 Dark Accent 3" w:uiPriority="50"/>
+    <w:lsdException w:name="Grid Table 6 Colorful Accent 3" w:uiPriority="51"/>
+    <w:lsdException w:name="Grid Table 7 Colorful Accent 3" w:uiPriority="52"/>
+    <w:lsdException w:name="Grid Table 1 Light Accent 4" w:uiPriority="46"/>
+    <w:lsdException w:name="Grid Table 2 Accent 4" w:uiPriority="47"/>
+    <w:lsdException w:name="Grid Table 3 Accent 4" w:uiPriority="48"/>
+    <w:lsdException w:name="Grid Table 4 Accent 4" w:uiPriority="49"/>
+    <w:lsdException w:name="Grid Table 5 Dark Accent 4" w:uiPriority="50"/>
+    <w:lsdException w:name="Grid Table 6 Colorful Accent 4" w:uiPriority="51"/>
+    <w:lsdException w:name="Grid Table 7 Colorful Accent 4" w:uiPriority="52"/>
+    <w:lsdException w:name="Grid Table 1 Light Accent 5" w:uiPriority="46"/>
+    <w:lsdException w:name="Grid Table 2 Accent 5" w:uiPriority="47"/>
+    <w:lsdException w:name="Grid Table 3 Accent 5" w:uiPriority="48"/>
+    <w:lsdException w:name="Grid Table 4 Accent 5" w:uiPriority="49"/>
+    <w:lsdException w:name="Grid Table 5 Dark Accent 5" w:uiPriority="50"/>
+    <w:lsdException w:name="Grid Table 6 Colorful Accent 5" w:uiPriority="51"/>
+    <w:lsdException w:name="Grid Table 7 Colorful Accent 5" w:uiPriority="52"/>
+    <w:lsdException w:name="Grid Table 1 Light Accent 6" w:uiPriority="46"/>
+    <w:lsdException w:name="Grid Table 2 Accent 6" w:uiPriority="47"/>
+    <w:lsdException w:name="Grid Table 3 Accent 6" w:uiPriority="48"/>
+    <w:lsdException w:name="Grid Table 4 Accent 6" w:uiPriority="49"/>
+    <w:lsdException w:name="Grid Table 5 Dark Accent 6" w:uiPriority="50"/>
+    <w:lsdException w:name="Grid Table 6 Colorful Accent 6" w:uiPriority="51"/>
+    <w:lsdException w:name="Grid Table 7 Colorful Accent 6" w:uiPriority="52"/>
+    <w:lsdException w:name="List Table 1 Light" w:uiPriority="46"/>
+    <w:lsdException w:name="List Table 2" w:uiPriority="47"/>
+    <w:lsdException w:name="List Table 3" w:uiPriority="48"/>
+    <w:lsdException w:name="List Table 4" w:uiPriority="49"/>
+    <w:lsdException w:name="List Table 5 Dark" w:uiPriority="50"/>
+    <w:lsdException w:name="List Table 6 Colorful" w:uiPriority="51"/>
+    <w:lsdException w:name="List Table 7 Colorful" w:uiPriority="52"/>
+    <w:lsdException w:name="List Table 1 Light Accent 1" w:uiPriority="46"/>
+    <w:lsdException w:name="List Table 2 Accent 1" w:uiPriority="47"/>
+    <w:lsdException w:name="List Table 3 Accent 1" w:uiPriority="48"/>
+    <w:lsdException w:name="List Table 4 Accent 1" w:uiPriority="49"/>
+    <w:lsdException w:name="List Table 5 Dark Accent 1" w:uiPriority="50"/>
+    <w:lsdException w:name="List Table 6 Colorful Accent 1" w:uiPriority="51"/>
+    <w:lsdException w:name="List Table 7 Colorful Accent 1" w:uiPriority="52"/>
+    <w:lsdException w:name="List Table 1 Light Accent 2" w:uiPriority="46"/>
+    <w:lsdException w:name="List Table 2 Accent 2" w:uiPriority="47"/>
+    <w:lsdException w:name="List Table 3 Accent 2" w:uiPriority="48"/>
+    <w:lsdException w:name="List Table 4 Accent 2" w:uiPriority="49"/>
+    <w:lsdException w:name="List Table 5 Dark Accent 2" w:uiPriority="50"/>
+    <w:lsdException w:name="List Table 6 Colorful Accent 2" w:uiPriority="51"/>
+    <w:lsdException w:name="List Table 7 Colorful Accent 2" w:uiPriority="52"/>
+    <w:lsdException w:name="List Table 1 Light Accent 3" w:uiPriority="46"/>
+    <w:lsdException w:name="List Table 2 Accent 3" w:uiPriority="47"/>
+    <w:lsdException w:name="List Table 3 Accent 3" w:uiPriority="48"/>
+    <w:lsdException w:name="List Table 4 Accent 3" w:uiPriority="49"/>
+    <w:lsdException w:name="List Table 5 Dark Accent 3" w:uiPriority="50"/>
+    <w:lsdException w:name="List Table 6 Colorful Accent 3" w:uiPriority="51"/>
+    <w:lsdException w:name="List Table 7 Colorful Accent 3" w:uiPriority="52"/>
+    <w:lsdException w:name="List Table 1 Light Accent 4" w:uiPriority="46"/>
+    <w:lsdException w:name="List Table 2 Accent 4" w:uiPriority="47"/>
+    <w:lsdException w:name="List Table 3 Accent 4" w:uiPriority="48"/>
+    <w:lsdException w:name="List Table 4 Accent 4" w:uiPriority="49"/>
+    <w:lsdException w:name="List Table 5 Dark Accent 4" w:uiPriority="50"/>
+    <w:lsdException w:name="List Table 6 Colorful Accent 4" w:uiPriority="51"/>
+    <w:lsdException w:name="List Table 7 Colorful Accent 4" w:uiPriority="52"/>
+    <w:lsdException w:name="List Table 1 Light Accent 5" w:uiPriority="46"/>
+    <w:lsdException w:name="List Table 2 Accent 5" w:uiPriority="47"/>
+    <w:lsdException w:name="List Table 3 Accent 5" w:uiPriority="48"/>
+    <w:lsdException w:name="List Table 4 Accent 5" w:uiPriority="49"/>
+    <w:lsdException w:name="List Table 5 Dark Accent 5" w:uiPriority="50"/>
+    <w:lsdException w:name="List Table 6 Colorful Accent 5" w:uiPriority="51"/>
+    <w:lsdException w:name="List Table 7 Colorful Accent 5" w:uiPriority="52"/>
+    <w:lsdException w:name="List Table 1 Light Accent 6" w:uiPriority="46"/>
+    <w:lsdException w:name="List Table 2 Accent 6" w:uiPriority="47"/>
+    <w:lsdException w:name="List Table 3 Accent 6" w:uiPriority="48"/>
+    <w:lsdException w:name="List Table 4 Accent 6" w:uiPriority="49"/>
+    <w:lsdException w:name="List Table 5 Dark Accent 6" w:uiPriority="50"/>
+    <w:lsdException w:name="List Table 6 Colorful Accent 6" w:uiPriority="51"/>
+    <w:lsdException w:name="List Table 7 Colorful Accent 6" w:uiPriority="52"/>
+    <w:lsdException w:name="Mention" w:semiHidden="1" w:unhideWhenUsed="1"/>
+    <w:lsdException w:name="Smart Hyperlink" w:semiHidden="1" w:unhideWhenUsed="1"/>
+    <w:lsdException w:name="Hashtag" w:semiHidden="1" w:unhideWhenUsed="1"/>
+    <w:lsdException w:name="Unresolved Mention" w:semiHidden="1" w:unhideWhenUsed="1"/>
+    <w:lsdException w:name="Smart Link" w:semiHidden="1" w:unhideWhenUsed="1"/>
+  </w:latentStyles>
+  <w:style w:type="paragraph" w:default="1" w:styleId="Standard">
+    <w:name w:val="Normal"/>
+    <w:qFormat/>
+  </w:style>
+  <w:style w:type="character" w:default="1" w:styleId="Absatz-Standardschriftart">
+    <w:name w:val="Default Paragraph Font"/>
+    <w:uiPriority w:val="1"/>
+    <w:semiHidden/>
+    <w:unhideWhenUsed/>
+  </w:style>
+  <w:style w:type="table" w:default="1" w:styleId="NormaleTabelle">
+    <w:name w:val="Normal Table"/>
+    <w:uiPriority w:val="99"/>
+    <w:semiHidden/>
+    <w:unhideWhenUsed/>
+    <w:tblPr>
+      <w:tblInd w:w="0" w:type="dxa"/>
+      <w:tblCellMar>
+        <w:top w:w="0" w:type="dxa"/>
+        <w:left w:w="108" w:type="dxa"/>
+        <w:bottom w:w="0" w:type="dxa"/>
+        <w:right w:w="108" w:type="dxa"/>
+      </w:tblCellMar>
+    </w:tblPr>
+  </w:style>
+  <w:style w:type="numbering" w:default="1" w:styleId="KeineListe">
+    <w:name w:val="No List"/>
+    <w:uiPriority w:val="99"/>
+    <w:semiHidden/>
+    <w:unhideWhenUsed/>
+  </w:style>
+  <w:style w:type="paragraph" w:customStyle="1" w:styleId="7A13591692024F8BBFC1EF63C39918CF">
+    <w:name w:val="7A13591692024F8BBFC1EF63C39918CF"/>
+    <w:rsid w:val="00250B31"/>
+  </w:style>
+  <w:style w:type="paragraph" w:customStyle="1" w:styleId="914A369FB98343CFB82158E75CC806ED">
+    <w:name w:val="914A369FB98343CFB82158E75CC806ED"/>
+    <w:rsid w:val="00C11D51"/>
+  </w:style>
+</w:styles>
+</file>
+
+<file path=word/glossary/webSettings.xml><?xml version="1.0" encoding="utf-8"?>
+<w:webSettings xmlns:mc="http://schemas.openxmlformats.org/markup-compatibility/2006" xmlns:r="http://schemas.openxmlformats.org/officeDocument/2006/relationships" xmlns:w="http://schemas.openxmlformats.org/wordprocessingml/2006/main" xmlns:w14="http://schemas.microsoft.com/office/word/2010/wordml" xmlns:w15="http://schemas.microsoft.com/office/word/2012/wordml" xmlns:w16cex="http://schemas.microsoft.com/office/word/2018/wordml/cex" xmlns:w16cid="http://schemas.microsoft.com/office/word/2016/wordml/cid" xmlns:w16="http://schemas.microsoft.com/office/word/2018/wordml" xmlns:w16du="http://schemas.microsoft.com/office/word/2023/wordml/word16du" xmlns:w16sdtdh="http://schemas.microsoft.com/office/word/2020/wordml/sdtdatahash" xmlns:w16sdtfl="http://schemas.microsoft.com/office/word/2024/wordml/sdtformatlock" xmlns:w16se="http://schemas.microsoft.com/office/word/2015/wordml/symex" mc:Ignorable="w14 w15 w16se w16cid w16 w16cex w16sdtdh w16sdtfl w16du">
+  <w:optimizeForBrowser/>
+</w:webSettings>
+</file>
+
 <file path=word/theme/theme1.xml><?xml version="1.0" encoding="utf-8"?>
 <a:theme xmlns:a="http://schemas.openxmlformats.org/drawingml/2006/main" name="Office-Design">
   <a:themeElements>

</xml_diff>